<commit_message>
Update qualitative process analysis
</commit_message>
<xml_diff>
--- a/01.WORKING_SPACE/3.DangVanHau-25410203/quytrinhquanlitrahang.docx
+++ b/01.WORKING_SPACE/3.DangVanHau-25410203/quytrinhquanlitrahang.docx
@@ -1036,188 +1036,421 @@
     </w:p>
     <w:p>
       <w:pPr>
-        <w:rPr>
-          <w:rFonts w:ascii="Times New Roman" w:hAnsi="Times New Roman" w:cs="Times New Roman"/>
+        <w:spacing w:before="280" w:after="160"/>
+        <w:jc w:val="left"/>
+      </w:pPr>
+      <w:r>
+        <w:rPr>
+          <w:rFonts w:ascii="Calibri" w:hAnsi="Calibri"/>
           <w:b/>
-          <w:bCs/>
-          <w:sz w:val="26"/>
-          <w:szCs w:val="26"/>
-        </w:rPr>
-      </w:pPr>
-      <w:r>
-        <w:rPr>
-          <w:rFonts w:ascii="Times New Roman" w:hAnsi="Times New Roman" w:cs="Times New Roman"/>
+          <w:i w:val="0"/>
+          <w:color w:val="003366"/>
+          <w:sz w:val="28"/>
+        </w:rPr>
+        <w:t>3.8.3 Phân tích định tính (Qualitative Analysis)</w:t>
+      </w:r>
+    </w:p>
+    <w:p>
+      <w:pPr>
+        <w:spacing w:before="200" w:after="120"/>
+        <w:jc w:val="left"/>
+      </w:pPr>
+      <w:r>
+        <w:rPr>
+          <w:rFonts w:ascii="Calibri" w:hAnsi="Calibri"/>
           <w:b/>
-          <w:bCs/>
-          <w:sz w:val="26"/>
-          <w:szCs w:val="26"/>
-        </w:rPr>
-        <w:t>3.8.3 Phân tích định tính</w:t>
-      </w:r>
-    </w:p>
-    <w:p>
-      <w:pPr>
-        <w:rPr>
-          <w:rFonts w:ascii="Times New Roman" w:hAnsi="Times New Roman" w:cs="Times New Roman"/>
+          <w:i w:val="0"/>
+          <w:color w:val="006699"/>
+          <w:sz w:val="24"/>
+        </w:rPr>
+        <w:t>3.8.3.1 Phân tích giá trị gia tăng (Value-added Analysis)</w:t>
+      </w:r>
+    </w:p>
+    <w:p>
+      <w:pPr>
+        <w:spacing w:before="120" w:after="80"/>
+        <w:jc w:val="left"/>
+      </w:pPr>
+      <w:r>
+        <w:rPr>
+          <w:rFonts w:ascii="Calibri" w:hAnsi="Calibri"/>
           <w:b/>
-          <w:bCs/>
-          <w:sz w:val="26"/>
-          <w:szCs w:val="26"/>
-        </w:rPr>
-      </w:pPr>
-      <w:r>
-        <w:rPr>
-          <w:rFonts w:ascii="Times New Roman" w:hAnsi="Times New Roman" w:cs="Times New Roman"/>
+          <w:i/>
+          <w:sz w:val="22"/>
+        </w:rPr>
+        <w:t>a. Nguyên lý và tiêu chí phân loại (Dựa theo Chap 05 - Process Analysis)</w:t>
+      </w:r>
+    </w:p>
+    <w:p>
+      <w:pPr>
+        <w:spacing w:before="0" w:after="120"/>
+        <w:jc w:val="left"/>
+      </w:pPr>
+      <w:r>
+        <w:rPr>
+          <w:rFonts w:ascii="Calibri" w:hAnsi="Calibri"/>
+          <w:b w:val="0"/>
+          <w:i w:val="0"/>
+          <w:sz w:val="22"/>
+        </w:rPr>
+        <w:t>Phân tích giá trị gia tăng (Value-Added Analysis) là phương pháp phân rã quy trình nghiệp vụ thành các bước hoạt động nhỏ và phân loại dựa trên mức độ đóng góp giá trị thực tế cho khách hàng và tổ chức. Dựa trên tài liệu giảng dạy Chương 5 - Phân tích quy trình (ThS. Hà Lê Hoài Trung), các bước trong quy trình được phân loại thành 3 nhóm:</w:t>
+      </w:r>
+    </w:p>
+    <w:p>
+      <w:pPr>
+        <w:spacing w:before="0" w:after="40"/>
+        <w:jc w:val="left"/>
+      </w:pPr>
+      <w:r>
+        <w:rPr>
+          <w:rFonts w:ascii="Calibri" w:hAnsi="Calibri"/>
           <w:b/>
-          <w:bCs/>
-          <w:sz w:val="26"/>
-          <w:szCs w:val="26"/>
-        </w:rPr>
-        <w:t xml:space="preserve">    3.8.3.1 Phân tích giá trị gia tăng</w:t>
+          <w:i w:val="0"/>
+          <w:color w:val="008000"/>
+          <w:sz w:val="22"/>
+        </w:rPr>
+        <w:t>• Value-Adding (VA) - Hoạt động gia tăng giá trị:</w:t>
+      </w:r>
+    </w:p>
+    <w:p>
+      <w:pPr>
+        <w:spacing w:before="0" w:after="40"/>
+        <w:jc w:val="left"/>
+      </w:pPr>
+      <w:r>
+        <w:rPr>
+          <w:rFonts w:ascii="Calibri" w:hAnsi="Calibri"/>
+          <w:b w:val="0"/>
+          <w:i w:val="0"/>
+          <w:sz w:val="22"/>
+        </w:rPr>
+        <w:t xml:space="preserve">   - Định nghĩa: Là những hoạt động trực tiếp làm thay đổi trạng thái sản phẩm/dịch vụ nhằm thỏa mãn nhu cầu chính đáng của khách hàng, tạo ra giá trị mà khách hàng nhận thức được và sẵn sàng chi trả.</w:t>
+      </w:r>
+    </w:p>
+    <w:p>
+      <w:pPr>
+        <w:spacing w:before="0" w:after="80"/>
+        <w:jc w:val="left"/>
+      </w:pPr>
+      <w:r>
+        <w:rPr>
+          <w:rFonts w:ascii="Calibri" w:hAnsi="Calibri"/>
+          <w:b w:val="0"/>
+          <w:i/>
+          <w:sz w:val="22"/>
+        </w:rPr>
+        <w:t xml:space="preserve">   - Tiêu chuẩn phân loại (Checklist): (1) Khách hàng có sẵn sàng trả tiền cho bước này không? (2) Khách hàng có đồng ý rằng bước này là cần thiết để đạt mục tiêu của họ không? (3) Nếu loại bỏ bước này, khách hàng có nhận thấy sản phẩm/dịch vụ bị giảm giá trị không?</w:t>
+      </w:r>
+    </w:p>
+    <w:p>
+      <w:pPr>
+        <w:spacing w:before="0" w:after="40"/>
+        <w:jc w:val="left"/>
+      </w:pPr>
+      <w:r>
+        <w:rPr>
+          <w:rFonts w:ascii="Calibri" w:hAnsi="Calibri"/>
+          <w:b/>
+          <w:i w:val="0"/>
+          <w:color w:val="003399"/>
+          <w:sz w:val="22"/>
+        </w:rPr>
+        <w:t>• Business Value-Adding (BVA) - Hoạt động gia tăng giá trị doanh nghiệp:</w:t>
+      </w:r>
+    </w:p>
+    <w:p>
+      <w:pPr>
+        <w:spacing w:before="0" w:after="40"/>
+        <w:jc w:val="left"/>
+      </w:pPr>
+      <w:r>
+        <w:rPr>
+          <w:rFonts w:ascii="Calibri" w:hAnsi="Calibri"/>
+          <w:b w:val="0"/>
+          <w:i w:val="0"/>
+          <w:sz w:val="22"/>
+        </w:rPr>
+        <w:t xml:space="preserve">   - Định nghĩa: Là những hoạt động không trực tiếp tạo giá trị cho khách hàng nhưng cần thiết cho việc vận hành kinh doanh, quản lý rủi ro tài chính, kiểm soát hệ thống hoặc tuân thủ các quy định pháp lý, chính sách nội bộ của Viettel Post.</w:t>
+      </w:r>
+    </w:p>
+    <w:p>
+      <w:pPr>
+        <w:spacing w:before="0" w:after="80"/>
+        <w:jc w:val="left"/>
+      </w:pPr>
+      <w:r>
+        <w:rPr>
+          <w:rFonts w:ascii="Calibri" w:hAnsi="Calibri"/>
+          <w:b w:val="0"/>
+          <w:i/>
+          <w:sz w:val="22"/>
+        </w:rPr>
+        <w:t xml:space="preserve">   - Tiêu chuẩn phân loại (Checklist): (1) Bước này có cần thiết để thu hồi doanh thu, phòng ngừa thất thoát hoặc tuân thủ quy định pháp luật không? (2) Nếu loại bỏ bước này, doanh nghiệp có nguy cơ bị tổn thất hoặc mất kiểm soát quy trình không?</w:t>
+      </w:r>
+    </w:p>
+    <w:p>
+      <w:pPr>
+        <w:spacing w:before="0" w:after="40"/>
+        <w:jc w:val="left"/>
+      </w:pPr>
+      <w:r>
+        <w:rPr>
+          <w:rFonts w:ascii="Calibri" w:hAnsi="Calibri"/>
+          <w:b/>
+          <w:i w:val="0"/>
+          <w:color w:val="CC0000"/>
+          <w:sz w:val="22"/>
+        </w:rPr>
+        <w:t>• Non-Value-Adding (NVA) - Hoạt động không gia tăng giá trị (Lãng phí):</w:t>
+      </w:r>
+    </w:p>
+    <w:p>
+      <w:pPr>
+        <w:spacing w:before="0" w:after="40"/>
+        <w:jc w:val="left"/>
+      </w:pPr>
+      <w:r>
+        <w:rPr>
+          <w:rFonts w:ascii="Calibri" w:hAnsi="Calibri"/>
+          <w:b w:val="0"/>
+          <w:i w:val="0"/>
+          <w:sz w:val="22"/>
+        </w:rPr>
+        <w:t xml:space="preserve">   - Định nghĩa: Bao gồm tất cả các hoạt động còn lại không thuộc VA và BVA. Đây là các bước công việc dư thừa, thời gian nằm chờ, bàn giao chuyển tiếp qua lại, hoặc làm lại/sửa lỗi do sai sót thông tin ở các bước trước.</w:t>
+      </w:r>
+    </w:p>
+    <w:p>
+      <w:pPr>
+        <w:spacing w:before="0" w:after="120"/>
+        <w:jc w:val="left"/>
+      </w:pPr>
+      <w:r>
+        <w:rPr>
+          <w:rFonts w:ascii="Calibri" w:hAnsi="Calibri"/>
+          <w:b w:val="0"/>
+          <w:i/>
+          <w:sz w:val="22"/>
+        </w:rPr>
+        <w:t xml:space="preserve">   - Ví dụ điển hình: Thời gian chờ đợi khách hàng bổ sung chứng từ, di chuyển thu hồi lặp lại nhiều lần do không gặp khách, nhập lại dữ liệu trùng lặp.</w:t>
+      </w:r>
+    </w:p>
+    <w:p>
+      <w:pPr>
+        <w:spacing w:before="120" w:after="80"/>
+        <w:jc w:val="left"/>
+      </w:pPr>
+      <w:r>
+        <w:rPr>
+          <w:rFonts w:ascii="Calibri" w:hAnsi="Calibri"/>
+          <w:b/>
+          <w:i/>
+          <w:sz w:val="22"/>
+        </w:rPr>
+        <w:t>b. Biểu diễn phân loại giá trị trên sơ đồ BPMN</w:t>
+      </w:r>
+    </w:p>
+    <w:p>
+      <w:pPr>
+        <w:spacing w:before="0" w:after="80"/>
+        <w:jc w:val="left"/>
+      </w:pPr>
+      <w:r>
+        <w:rPr>
+          <w:rFonts w:ascii="Calibri" w:hAnsi="Calibri"/>
+          <w:b w:val="0"/>
+          <w:i w:val="0"/>
+          <w:sz w:val="22"/>
+        </w:rPr>
+        <w:t>Trên mô hình sơ đồ quy trình BPMN (file QuyTrinhHoanTraCSKH.bpmn), từng nút hoạt động (Tasks) được gắn mã ký hiệu phân loại và màu sắc nhận diện:</w:t>
+      </w:r>
+    </w:p>
+    <w:p>
+      <w:pPr>
+        <w:spacing w:before="0" w:after="40"/>
+        <w:jc w:val="left"/>
+      </w:pPr>
+      <w:r>
+        <w:rPr>
+          <w:rFonts w:ascii="Calibri" w:hAnsi="Calibri"/>
+          <w:b w:val="0"/>
+          <w:i w:val="0"/>
+          <w:sz w:val="22"/>
+        </w:rPr>
+        <w:t xml:space="preserve"> - [VA] (Xanh lá): Gửi yêu cầu hoàn trả, Liên hệ &amp; Thu hồi hàng hóa, Hoàn trả hàng cho người gửi, Giải quyết khiếu nại, Tư vấn khách hàng, Nhận kết quả phản hồi.</w:t>
+      </w:r>
+    </w:p>
+    <w:p>
+      <w:pPr>
+        <w:spacing w:before="0" w:after="40"/>
+        <w:jc w:val="left"/>
+      </w:pPr>
+      <w:r>
+        <w:rPr>
+          <w:rFonts w:ascii="Calibri" w:hAnsi="Calibri"/>
+          <w:b w:val="0"/>
+          <w:i w:val="0"/>
+          <w:sz w:val="22"/>
+        </w:rPr>
+        <w:t xml:space="preserve"> - [BVA] (Xanh dương): Tiếp nhận yêu cầu, Kiểm tra thông tin đơn hàng, Xác minh nguyên nhân sự cố, Phân loại nhóm yêu cầu, Tiếp nhận lệnh thu hồi, Kiểm tra tình trạng hàng tại kho, Lập biên bản bất thường, Cập nhật kết quả kiểm hàng, Thông báo kết quả phản hồi, Cập nhật hệ thống &amp; lưu trữ.</w:t>
+      </w:r>
+    </w:p>
+    <w:p>
+      <w:pPr>
+        <w:spacing w:before="0" w:after="120"/>
+        <w:jc w:val="left"/>
+      </w:pPr>
+      <w:r>
+        <w:rPr>
+          <w:rFonts w:ascii="Calibri" w:hAnsi="Calibri"/>
+          <w:b w:val="0"/>
+          <w:i w:val="0"/>
+          <w:sz w:val="22"/>
+        </w:rPr>
+        <w:t xml:space="preserve"> - [NVA] (Màu đỏ/cam): Cung cấp chứng từ bổ sung (bước làm lại do thiếu thông tin ban đầu), vận chuyển lặp lại.</w:t>
+      </w:r>
+    </w:p>
+    <w:p>
+      <w:pPr>
+        <w:spacing w:before="120" w:after="80"/>
+        <w:jc w:val="left"/>
+      </w:pPr>
+      <w:r>
+        <w:rPr>
+          <w:rFonts w:ascii="Calibri" w:hAnsi="Calibri"/>
+          <w:b/>
+          <w:i/>
+          <w:sz w:val="22"/>
+        </w:rPr>
+        <w:t>c. Bảng phân tích giá trị gia tăng (Value-Added Analysis Table)</w:t>
       </w:r>
     </w:p>
     <w:tbl>
       <w:tblPr>
         <w:tblStyle w:val="TableGrid"/>
-        <w:tblW w:w="9350" w:type="dxa"/>
-        <w:tblLayout w:type="fixed"/>
-        <w:tblLook w:val="04A0" w:firstRow="1" w:lastRow="0" w:firstColumn="1" w:lastColumn="0" w:noHBand="0" w:noVBand="1"/>
+        <w:tblW w:type="auto" w:w="0"/>
+        <w:jc w:val="center"/>
+        <w:tblLook w:firstColumn="1" w:firstRow="1" w:lastColumn="0" w:lastRow="0" w:noHBand="0" w:noVBand="1" w:val="04A0"/>
       </w:tblPr>
       <w:tblGrid>
-        <w:gridCol w:w="3116"/>
-        <w:gridCol w:w="3117"/>
-        <w:gridCol w:w="3117"/>
+        <w:gridCol w:w="2340"/>
+        <w:gridCol w:w="2340"/>
+        <w:gridCol w:w="2340"/>
+        <w:gridCol w:w="2340"/>
       </w:tblGrid>
       <w:tr>
-        <w:trPr>
-          <w:trHeight w:val="611"/>
-        </w:trPr>
-        <w:tc>
-          <w:tcPr>
-            <w:tcW w:w="3116" w:type="dxa"/>
-            <w:vAlign w:val="center"/>
-          </w:tcPr>
-          <w:p>
-            <w:pPr>
-              <w:spacing w:after="0" w:line="240" w:lineRule="auto"/>
-              <w:rPr>
-                <w:rFonts w:ascii="Times New Roman" w:hAnsi="Times New Roman" w:cs="Times New Roman"/>
-                <w:b/>
-                <w:bCs/>
-                <w:sz w:val="26"/>
-                <w:szCs w:val="26"/>
-              </w:rPr>
-            </w:pPr>
-            <w:r>
-              <w:rPr>
-                <w:rFonts w:ascii="Times New Roman" w:eastAsia="Aptos" w:hAnsi="Times New Roman" w:cs="Times New Roman"/>
-                <w:b/>
-                <w:bCs/>
-              </w:rPr>
-              <w:t>Hoạt động</w:t>
-            </w:r>
-          </w:p>
-        </w:tc>
-        <w:tc>
-          <w:tcPr>
-            <w:tcW w:w="3117" w:type="dxa"/>
-            <w:vAlign w:val="center"/>
-          </w:tcPr>
-          <w:p>
-            <w:pPr>
-              <w:spacing w:after="0" w:line="240" w:lineRule="auto"/>
-              <w:rPr>
-                <w:rFonts w:ascii="Times New Roman" w:hAnsi="Times New Roman" w:cs="Times New Roman"/>
-                <w:b/>
-                <w:bCs/>
-                <w:sz w:val="26"/>
-                <w:szCs w:val="26"/>
-              </w:rPr>
-            </w:pPr>
-            <w:r>
-              <w:rPr>
-                <w:rFonts w:ascii="Times New Roman" w:eastAsia="Aptos" w:hAnsi="Times New Roman" w:cs="Times New Roman"/>
-                <w:b/>
-                <w:bCs/>
-              </w:rPr>
-              <w:t>Người thực hiện</w:t>
-            </w:r>
-          </w:p>
-        </w:tc>
-        <w:tc>
-          <w:tcPr>
-            <w:tcW w:w="3117" w:type="dxa"/>
-            <w:vAlign w:val="center"/>
-          </w:tcPr>
-          <w:p>
-            <w:pPr>
-              <w:spacing w:after="0" w:line="240" w:lineRule="auto"/>
-              <w:rPr>
-                <w:rFonts w:ascii="Times New Roman" w:hAnsi="Times New Roman" w:cs="Times New Roman"/>
-                <w:b/>
-                <w:bCs/>
-                <w:sz w:val="26"/>
-                <w:szCs w:val="26"/>
-              </w:rPr>
-            </w:pPr>
-            <w:r>
-              <w:rPr>
-                <w:rFonts w:ascii="Times New Roman" w:eastAsia="Aptos" w:hAnsi="Times New Roman" w:cs="Times New Roman"/>
-                <w:b/>
-                <w:bCs/>
-              </w:rPr>
-              <w:t>Loại giá trị</w:t>
+        <w:tc>
+          <w:tcPr>
+            <w:tcW w:type="dxa" w:w="2592"/>
+            <w:shd w:fill="003366"/>
+          </w:tcPr>
+          <w:p>
+            <w:pPr>
+              <w:jc w:val="center"/>
+            </w:pPr>
+            <w:r>
+              <w:rPr>
+                <w:rFonts w:ascii="Calibri" w:hAnsi="Calibri"/>
+                <w:b/>
+                <w:color w:val="FFFFFF"/>
+                <w:sz w:val="20"/>
+              </w:rPr>
+              <w:t>Step (Bước quy trình)</w:t>
+            </w:r>
+          </w:p>
+        </w:tc>
+        <w:tc>
+          <w:tcPr>
+            <w:tcW w:type="dxa" w:w="1728"/>
+            <w:shd w:fill="003366"/>
+          </w:tcPr>
+          <w:p>
+            <w:pPr>
+              <w:jc w:val="center"/>
+            </w:pPr>
+            <w:r>
+              <w:rPr>
+                <w:rFonts w:ascii="Calibri" w:hAnsi="Calibri"/>
+                <w:b/>
+                <w:color w:val="FFFFFF"/>
+                <w:sz w:val="20"/>
+              </w:rPr>
+              <w:t>Performer (Người thực hiện)</w:t>
+            </w:r>
+          </w:p>
+        </w:tc>
+        <w:tc>
+          <w:tcPr>
+            <w:tcW w:type="dxa" w:w="1296"/>
+            <w:shd w:fill="003366"/>
+          </w:tcPr>
+          <w:p>
+            <w:pPr>
+              <w:jc w:val="center"/>
+            </w:pPr>
+            <w:r>
+              <w:rPr>
+                <w:rFonts w:ascii="Calibri" w:hAnsi="Calibri"/>
+                <w:b/>
+                <w:color w:val="FFFFFF"/>
+                <w:sz w:val="20"/>
+              </w:rPr>
+              <w:t>Classification</w:t>
+            </w:r>
+          </w:p>
+        </w:tc>
+        <w:tc>
+          <w:tcPr>
+            <w:tcW w:type="dxa" w:w="3744"/>
+            <w:shd w:fill="003366"/>
+          </w:tcPr>
+          <w:p>
+            <w:pPr>
+              <w:jc w:val="center"/>
+            </w:pPr>
+            <w:r>
+              <w:rPr>
+                <w:rFonts w:ascii="Calibri" w:hAnsi="Calibri"/>
+                <w:b/>
+                <w:color w:val="FFFFFF"/>
+                <w:sz w:val="20"/>
+              </w:rPr>
+              <w:t>Explanation (Giải thích lý do phân loại)</w:t>
             </w:r>
           </w:p>
         </w:tc>
       </w:tr>
       <w:tr>
-        <w:trPr>
-          <w:trHeight w:val="791"/>
-        </w:trPr>
-        <w:tc>
-          <w:tcPr>
-            <w:tcW w:w="3116" w:type="dxa"/>
-            <w:vAlign w:val="center"/>
-          </w:tcPr>
-          <w:p>
-            <w:pPr>
-              <w:spacing w:after="0" w:line="240" w:lineRule="auto"/>
-              <w:rPr>
-                <w:rFonts w:ascii="Times New Roman" w:hAnsi="Times New Roman" w:cs="Times New Roman"/>
-                <w:b/>
-                <w:bCs/>
-                <w:sz w:val="26"/>
-                <w:szCs w:val="26"/>
-              </w:rPr>
-            </w:pPr>
-            <w:r>
-              <w:rPr>
-                <w:rFonts w:ascii="Times New Roman" w:eastAsia="Aptos" w:hAnsi="Times New Roman" w:cs="Times New Roman"/>
-              </w:rPr>
-              <w:t>1. Gửi yêu cầu hoàn trả/khiếu nại</w:t>
-            </w:r>
-          </w:p>
-        </w:tc>
-        <w:tc>
-          <w:tcPr>
-            <w:tcW w:w="3117" w:type="dxa"/>
-            <w:vAlign w:val="center"/>
-          </w:tcPr>
-          <w:p>
-            <w:pPr>
-              <w:spacing w:after="0" w:line="240" w:lineRule="auto"/>
-              <w:rPr>
-                <w:rFonts w:ascii="Times New Roman" w:hAnsi="Times New Roman" w:cs="Times New Roman"/>
-                <w:b/>
-                <w:bCs/>
-                <w:sz w:val="26"/>
-                <w:szCs w:val="26"/>
-              </w:rPr>
-            </w:pPr>
-            <w:r>
-              <w:rPr>
-                <w:rFonts w:ascii="Times New Roman" w:eastAsia="Aptos" w:hAnsi="Times New Roman" w:cs="Times New Roman"/>
+        <w:tc>
+          <w:tcPr>
+            <w:tcW w:type="dxa" w:w="2592"/>
+            <w:shd w:fill="FFFFFF"/>
+          </w:tcPr>
+          <w:p>
+            <w:pPr>
+              <w:spacing w:before="40" w:after="40"/>
+            </w:pPr>
+            <w:r>
+              <w:rPr>
+                <w:rFonts w:ascii="Calibri" w:hAnsi="Calibri"/>
+                <w:sz w:val="19"/>
+              </w:rPr>
+              <w:t>1. Gửi yêu cầu hoàn trả / khiếu nại</w:t>
+            </w:r>
+          </w:p>
+        </w:tc>
+        <w:tc>
+          <w:tcPr>
+            <w:tcW w:type="dxa" w:w="1728"/>
+            <w:shd w:fill="FFFFFF"/>
+          </w:tcPr>
+          <w:p>
+            <w:pPr>
+              <w:spacing w:before="40" w:after="40"/>
+            </w:pPr>
+            <w:r>
+              <w:rPr>
+                <w:rFonts w:ascii="Calibri" w:hAnsi="Calibri"/>
+                <w:sz w:val="19"/>
               </w:rPr>
               <w:t>Khách hàng</w:t>
             </w:r>
@@ -1225,76 +1458,76 @@
         </w:tc>
         <w:tc>
           <w:tcPr>
-            <w:tcW w:w="3117" w:type="dxa"/>
-            <w:vAlign w:val="center"/>
-          </w:tcPr>
-          <w:p>
-            <w:pPr>
-              <w:spacing w:after="0" w:line="240" w:lineRule="auto"/>
-              <w:rPr>
-                <w:rFonts w:ascii="Times New Roman" w:hAnsi="Times New Roman" w:cs="Times New Roman"/>
-                <w:b/>
-                <w:bCs/>
-                <w:sz w:val="26"/>
-                <w:szCs w:val="26"/>
-              </w:rPr>
-            </w:pPr>
-            <w:r>
-              <w:rPr>
-                <w:rFonts w:ascii="Times New Roman" w:eastAsia="Aptos" w:hAnsi="Times New Roman" w:cs="Times New Roman"/>
+            <w:tcW w:type="dxa" w:w="1296"/>
+            <w:shd w:fill="FFFFFF"/>
+          </w:tcPr>
+          <w:p>
+            <w:pPr>
+              <w:spacing w:before="40" w:after="40"/>
+              <w:jc w:val="center"/>
+            </w:pPr>
+            <w:r>
+              <w:rPr>
+                <w:rFonts w:ascii="Calibri" w:hAnsi="Calibri"/>
+                <w:b/>
+                <w:color w:val="008000"/>
+                <w:sz w:val="19"/>
               </w:rPr>
               <w:t>VA</w:t>
+            </w:r>
+          </w:p>
+        </w:tc>
+        <w:tc>
+          <w:tcPr>
+            <w:tcW w:type="dxa" w:w="3744"/>
+            <w:shd w:fill="FFFFFF"/>
+          </w:tcPr>
+          <w:p>
+            <w:pPr>
+              <w:spacing w:before="40" w:after="40"/>
+            </w:pPr>
+            <w:r>
+              <w:rPr>
+                <w:rFonts w:ascii="Calibri" w:hAnsi="Calibri"/>
+                <w:sz w:val="19"/>
+              </w:rPr>
+              <w:t>Khách hàng khởi tạo nhu cầu chính đáng nhằm đổi/trả hàng hoặc phản ánh sự cố dịch vụ để được hỗ trợ.</w:t>
             </w:r>
           </w:p>
         </w:tc>
       </w:tr>
       <w:tr>
-        <w:trPr>
-          <w:trHeight w:val="710"/>
-        </w:trPr>
-        <w:tc>
-          <w:tcPr>
-            <w:tcW w:w="3116" w:type="dxa"/>
-            <w:vAlign w:val="center"/>
-          </w:tcPr>
-          <w:p>
-            <w:pPr>
-              <w:spacing w:after="0" w:line="240" w:lineRule="auto"/>
-              <w:rPr>
-                <w:rFonts w:ascii="Times New Roman" w:hAnsi="Times New Roman" w:cs="Times New Roman"/>
-                <w:b/>
-                <w:bCs/>
-                <w:sz w:val="26"/>
-                <w:szCs w:val="26"/>
-              </w:rPr>
-            </w:pPr>
-            <w:r>
-              <w:rPr>
-                <w:rFonts w:ascii="Times New Roman" w:eastAsia="Aptos" w:hAnsi="Times New Roman" w:cs="Times New Roman"/>
-              </w:rPr>
-              <w:t>2. Cung cấp thông tin, chứng từ</w:t>
-            </w:r>
-          </w:p>
-        </w:tc>
-        <w:tc>
-          <w:tcPr>
-            <w:tcW w:w="3117" w:type="dxa"/>
-            <w:vAlign w:val="center"/>
-          </w:tcPr>
-          <w:p>
-            <w:pPr>
-              <w:spacing w:after="0" w:line="240" w:lineRule="auto"/>
-              <w:rPr>
-                <w:rFonts w:ascii="Times New Roman" w:hAnsi="Times New Roman" w:cs="Times New Roman"/>
-                <w:b/>
-                <w:bCs/>
-                <w:sz w:val="26"/>
-                <w:szCs w:val="26"/>
-              </w:rPr>
-            </w:pPr>
-            <w:r>
-              <w:rPr>
-                <w:rFonts w:ascii="Times New Roman" w:eastAsia="Aptos" w:hAnsi="Times New Roman" w:cs="Times New Roman"/>
+        <w:tc>
+          <w:tcPr>
+            <w:tcW w:type="dxa" w:w="2592"/>
+            <w:shd w:fill="F0F4F8"/>
+          </w:tcPr>
+          <w:p>
+            <w:pPr>
+              <w:spacing w:before="40" w:after="40"/>
+            </w:pPr>
+            <w:r>
+              <w:rPr>
+                <w:rFonts w:ascii="Calibri" w:hAnsi="Calibri"/>
+                <w:sz w:val="19"/>
+              </w:rPr>
+              <w:t>2. Cung cấp chứng từ bổ sung</w:t>
+            </w:r>
+          </w:p>
+        </w:tc>
+        <w:tc>
+          <w:tcPr>
+            <w:tcW w:type="dxa" w:w="1728"/>
+            <w:shd w:fill="F0F4F8"/>
+          </w:tcPr>
+          <w:p>
+            <w:pPr>
+              <w:spacing w:before="40" w:after="40"/>
+            </w:pPr>
+            <w:r>
+              <w:rPr>
+                <w:rFonts w:ascii="Calibri" w:hAnsi="Calibri"/>
+                <w:sz w:val="19"/>
               </w:rPr>
               <w:t>Khách hàng</w:t>
             </w:r>
@@ -1302,52 +1535,58 @@
         </w:tc>
         <w:tc>
           <w:tcPr>
-            <w:tcW w:w="3117" w:type="dxa"/>
-            <w:vAlign w:val="center"/>
-          </w:tcPr>
-          <w:p>
-            <w:pPr>
-              <w:spacing w:after="0" w:line="240" w:lineRule="auto"/>
-              <w:rPr>
-                <w:rFonts w:ascii="Times New Roman" w:hAnsi="Times New Roman" w:cs="Times New Roman"/>
-                <w:b/>
-                <w:bCs/>
-                <w:sz w:val="26"/>
-                <w:szCs w:val="26"/>
-              </w:rPr>
-            </w:pPr>
-            <w:r>
-              <w:rPr>
-                <w:rFonts w:ascii="Times New Roman" w:eastAsia="Aptos" w:hAnsi="Times New Roman" w:cs="Times New Roman"/>
-              </w:rPr>
-              <w:t>VA</w:t>
+            <w:tcW w:type="dxa" w:w="1296"/>
+            <w:shd w:fill="F0F4F8"/>
+          </w:tcPr>
+          <w:p>
+            <w:pPr>
+              <w:spacing w:before="40" w:after="40"/>
+              <w:jc w:val="center"/>
+            </w:pPr>
+            <w:r>
+              <w:rPr>
+                <w:rFonts w:ascii="Calibri" w:hAnsi="Calibri"/>
+                <w:b/>
+                <w:color w:val="CC0000"/>
+                <w:sz w:val="19"/>
+              </w:rPr>
+              <w:t>NVA</w:t>
+            </w:r>
+          </w:p>
+        </w:tc>
+        <w:tc>
+          <w:tcPr>
+            <w:tcW w:type="dxa" w:w="3744"/>
+            <w:shd w:fill="F0F4F8"/>
+          </w:tcPr>
+          <w:p>
+            <w:pPr>
+              <w:spacing w:before="40" w:after="40"/>
+            </w:pPr>
+            <w:r>
+              <w:rPr>
+                <w:rFonts w:ascii="Calibri" w:hAnsi="Calibri"/>
+                <w:sz w:val="19"/>
+              </w:rPr>
+              <w:t>Phát sinh do hồ sơ gửi ban đầu thiếu/sai thông tin. Làm gián đoạn quy trình và tốn thêm thời gian của khách hàng.</w:t>
             </w:r>
           </w:p>
         </w:tc>
       </w:tr>
       <w:tr>
-        <w:trPr>
-          <w:trHeight w:val="539"/>
-        </w:trPr>
-        <w:tc>
-          <w:tcPr>
-            <w:tcW w:w="3116" w:type="dxa"/>
-            <w:vAlign w:val="center"/>
-          </w:tcPr>
-          <w:p>
-            <w:pPr>
-              <w:spacing w:after="0" w:line="240" w:lineRule="auto"/>
-              <w:rPr>
-                <w:rFonts w:ascii="Times New Roman" w:hAnsi="Times New Roman" w:cs="Times New Roman"/>
-                <w:b/>
-                <w:bCs/>
-                <w:sz w:val="26"/>
-                <w:szCs w:val="26"/>
-              </w:rPr>
-            </w:pPr>
-            <w:r>
-              <w:rPr>
-                <w:rFonts w:ascii="Times New Roman" w:eastAsia="Aptos" w:hAnsi="Times New Roman" w:cs="Times New Roman"/>
+        <w:tc>
+          <w:tcPr>
+            <w:tcW w:type="dxa" w:w="2592"/>
+            <w:shd w:fill="FFFFFF"/>
+          </w:tcPr>
+          <w:p>
+            <w:pPr>
+              <w:spacing w:before="40" w:after="40"/>
+            </w:pPr>
+            <w:r>
+              <w:rPr>
+                <w:rFonts w:ascii="Calibri" w:hAnsi="Calibri"/>
+                <w:sz w:val="19"/>
               </w:rPr>
               <w:t>3. Tiếp nhận yêu cầu</w:t>
             </w:r>
@@ -1355,23 +1594,17 @@
         </w:tc>
         <w:tc>
           <w:tcPr>
-            <w:tcW w:w="3117" w:type="dxa"/>
-            <w:vAlign w:val="center"/>
-          </w:tcPr>
-          <w:p>
-            <w:pPr>
-              <w:spacing w:after="0" w:line="240" w:lineRule="auto"/>
-              <w:rPr>
-                <w:rFonts w:ascii="Times New Roman" w:hAnsi="Times New Roman" w:cs="Times New Roman"/>
-                <w:b/>
-                <w:bCs/>
-                <w:sz w:val="26"/>
-                <w:szCs w:val="26"/>
-              </w:rPr>
-            </w:pPr>
-            <w:r>
-              <w:rPr>
-                <w:rFonts w:ascii="Times New Roman" w:eastAsia="Aptos" w:hAnsi="Times New Roman" w:cs="Times New Roman"/>
+            <w:tcW w:type="dxa" w:w="1728"/>
+            <w:shd w:fill="FFFFFF"/>
+          </w:tcPr>
+          <w:p>
+            <w:pPr>
+              <w:spacing w:before="40" w:after="40"/>
+            </w:pPr>
+            <w:r>
+              <w:rPr>
+                <w:rFonts w:ascii="Calibri" w:hAnsi="Calibri"/>
+                <w:sz w:val="19"/>
               </w:rPr>
               <w:t>Bộ phận CSKH</w:t>
             </w:r>
@@ -1379,76 +1612,76 @@
         </w:tc>
         <w:tc>
           <w:tcPr>
-            <w:tcW w:w="3117" w:type="dxa"/>
-            <w:vAlign w:val="center"/>
-          </w:tcPr>
-          <w:p>
-            <w:pPr>
-              <w:spacing w:after="0" w:line="240" w:lineRule="auto"/>
-              <w:rPr>
-                <w:rFonts w:ascii="Times New Roman" w:hAnsi="Times New Roman" w:cs="Times New Roman"/>
-                <w:b/>
-                <w:bCs/>
-                <w:sz w:val="26"/>
-                <w:szCs w:val="26"/>
-              </w:rPr>
-            </w:pPr>
-            <w:r>
-              <w:rPr>
-                <w:rFonts w:ascii="Times New Roman" w:eastAsia="Aptos" w:hAnsi="Times New Roman" w:cs="Times New Roman"/>
-              </w:rPr>
-              <w:t>VA</w:t>
+            <w:tcW w:type="dxa" w:w="1296"/>
+            <w:shd w:fill="FFFFFF"/>
+          </w:tcPr>
+          <w:p>
+            <w:pPr>
+              <w:spacing w:before="40" w:after="40"/>
+              <w:jc w:val="center"/>
+            </w:pPr>
+            <w:r>
+              <w:rPr>
+                <w:rFonts w:ascii="Calibri" w:hAnsi="Calibri"/>
+                <w:b/>
+                <w:color w:val="003399"/>
+                <w:sz w:val="19"/>
+              </w:rPr>
+              <w:t>BVA</w:t>
+            </w:r>
+          </w:p>
+        </w:tc>
+        <w:tc>
+          <w:tcPr>
+            <w:tcW w:type="dxa" w:w="3744"/>
+            <w:shd w:fill="FFFFFF"/>
+          </w:tcPr>
+          <w:p>
+            <w:pPr>
+              <w:spacing w:before="40" w:after="40"/>
+            </w:pPr>
+            <w:r>
+              <w:rPr>
+                <w:rFonts w:ascii="Calibri" w:hAnsi="Calibri"/>
+                <w:sz w:val="19"/>
+              </w:rPr>
+              <w:t>Cần thiết để Viettel Post ghi nhận yêu cầu vào hệ thống ticket, phân công nhân sự và bắt đầu tính SLA.</w:t>
             </w:r>
           </w:p>
         </w:tc>
       </w:tr>
       <w:tr>
-        <w:trPr>
-          <w:trHeight w:val="800"/>
-        </w:trPr>
-        <w:tc>
-          <w:tcPr>
-            <w:tcW w:w="3116" w:type="dxa"/>
-            <w:vAlign w:val="center"/>
-          </w:tcPr>
-          <w:p>
-            <w:pPr>
-              <w:spacing w:after="0" w:line="240" w:lineRule="auto"/>
-              <w:rPr>
-                <w:rFonts w:ascii="Times New Roman" w:hAnsi="Times New Roman" w:cs="Times New Roman"/>
-                <w:b/>
-                <w:bCs/>
-                <w:sz w:val="26"/>
-                <w:szCs w:val="26"/>
-              </w:rPr>
-            </w:pPr>
-            <w:r>
-              <w:rPr>
-                <w:rFonts w:ascii="Times New Roman" w:eastAsia="Aptos" w:hAnsi="Times New Roman" w:cs="Times New Roman"/>
-              </w:rPr>
-              <w:t>4. Kiểm tra thông tin đơn hàng</w:t>
-            </w:r>
-          </w:p>
-        </w:tc>
-        <w:tc>
-          <w:tcPr>
-            <w:tcW w:w="3117" w:type="dxa"/>
-            <w:vAlign w:val="center"/>
-          </w:tcPr>
-          <w:p>
-            <w:pPr>
-              <w:spacing w:after="0" w:line="240" w:lineRule="auto"/>
-              <w:rPr>
-                <w:rFonts w:ascii="Times New Roman" w:hAnsi="Times New Roman" w:cs="Times New Roman"/>
-                <w:b/>
-                <w:bCs/>
-                <w:sz w:val="26"/>
-                <w:szCs w:val="26"/>
-              </w:rPr>
-            </w:pPr>
-            <w:r>
-              <w:rPr>
-                <w:rFonts w:ascii="Times New Roman" w:eastAsia="Aptos" w:hAnsi="Times New Roman" w:cs="Times New Roman"/>
+        <w:tc>
+          <w:tcPr>
+            <w:tcW w:type="dxa" w:w="2592"/>
+            <w:shd w:fill="F0F4F8"/>
+          </w:tcPr>
+          <w:p>
+            <w:pPr>
+              <w:spacing w:before="40" w:after="40"/>
+            </w:pPr>
+            <w:r>
+              <w:rPr>
+                <w:rFonts w:ascii="Calibri" w:hAnsi="Calibri"/>
+                <w:sz w:val="19"/>
+              </w:rPr>
+              <w:t>4. Kiểm tra thông tin đơn hàng &amp; chứng từ</w:t>
+            </w:r>
+          </w:p>
+        </w:tc>
+        <w:tc>
+          <w:tcPr>
+            <w:tcW w:type="dxa" w:w="1728"/>
+            <w:shd w:fill="F0F4F8"/>
+          </w:tcPr>
+          <w:p>
+            <w:pPr>
+              <w:spacing w:before="40" w:after="40"/>
+            </w:pPr>
+            <w:r>
+              <w:rPr>
+                <w:rFonts w:ascii="Calibri" w:hAnsi="Calibri"/>
+                <w:sz w:val="19"/>
               </w:rPr>
               <w:t>Bộ phận CSKH</w:t>
             </w:r>
@@ -1456,25 +1689,40 @@
         </w:tc>
         <w:tc>
           <w:tcPr>
-            <w:tcW w:w="3117" w:type="dxa"/>
-            <w:vAlign w:val="center"/>
-          </w:tcPr>
-          <w:p>
-            <w:pPr>
-              <w:spacing w:after="0" w:line="240" w:lineRule="auto"/>
-              <w:rPr>
-                <w:rFonts w:ascii="Times New Roman" w:hAnsi="Times New Roman" w:cs="Times New Roman"/>
-                <w:b/>
-                <w:bCs/>
-                <w:sz w:val="26"/>
-                <w:szCs w:val="26"/>
-              </w:rPr>
-            </w:pPr>
-            <w:r>
-              <w:rPr>
-                <w:rFonts w:ascii="Times New Roman" w:eastAsia="Aptos" w:hAnsi="Times New Roman" w:cs="Times New Roman"/>
+            <w:tcW w:type="dxa" w:w="1296"/>
+            <w:shd w:fill="F0F4F8"/>
+          </w:tcPr>
+          <w:p>
+            <w:pPr>
+              <w:spacing w:before="40" w:after="40"/>
+              <w:jc w:val="center"/>
+            </w:pPr>
+            <w:r>
+              <w:rPr>
+                <w:rFonts w:ascii="Calibri" w:hAnsi="Calibri"/>
+                <w:b/>
+                <w:color w:val="003399"/>
+                <w:sz w:val="19"/>
               </w:rPr>
               <w:t>BVA</w:t>
+            </w:r>
+          </w:p>
+        </w:tc>
+        <w:tc>
+          <w:tcPr>
+            <w:tcW w:type="dxa" w:w="3744"/>
+            <w:shd w:fill="F0F4F8"/>
+          </w:tcPr>
+          <w:p>
+            <w:pPr>
+              <w:spacing w:before="40" w:after="40"/>
+            </w:pPr>
+            <w:r>
+              <w:rPr>
+                <w:rFonts w:ascii="Calibri" w:hAnsi="Calibri"/>
+                <w:sz w:val="19"/>
+              </w:rPr>
+              <w:t>Đảm bảo đơn hàng chính chủ, đúng mã vận đơn, kiểm tra tính hợp lệ pháp lý để phòng ngừa gian lận.</w:t>
             </w:r>
           </w:p>
         </w:tc>
@@ -1482,47 +1730,35 @@
       <w:tr>
         <w:tc>
           <w:tcPr>
-            <w:tcW w:w="3116" w:type="dxa"/>
-            <w:vAlign w:val="center"/>
-          </w:tcPr>
-          <w:p>
-            <w:pPr>
-              <w:spacing w:after="0" w:line="240" w:lineRule="auto"/>
-              <w:rPr>
-                <w:rFonts w:ascii="Times New Roman" w:hAnsi="Times New Roman" w:cs="Times New Roman"/>
-                <w:b/>
-                <w:bCs/>
-                <w:sz w:val="26"/>
-                <w:szCs w:val="26"/>
-              </w:rPr>
-            </w:pPr>
-            <w:r>
-              <w:rPr>
-                <w:rFonts w:ascii="Times New Roman" w:eastAsia="Aptos" w:hAnsi="Times New Roman" w:cs="Times New Roman"/>
-              </w:rPr>
-              <w:t>5. Xác minh nguyên nhân với các bộ phận liên quan</w:t>
-            </w:r>
-          </w:p>
-        </w:tc>
-        <w:tc>
-          <w:tcPr>
-            <w:tcW w:w="3117" w:type="dxa"/>
-            <w:vAlign w:val="center"/>
-          </w:tcPr>
-          <w:p>
-            <w:pPr>
-              <w:spacing w:after="0" w:line="240" w:lineRule="auto"/>
-              <w:rPr>
-                <w:rFonts w:ascii="Times New Roman" w:hAnsi="Times New Roman" w:cs="Times New Roman"/>
-                <w:b/>
-                <w:bCs/>
-                <w:sz w:val="26"/>
-                <w:szCs w:val="26"/>
-              </w:rPr>
-            </w:pPr>
-            <w:r>
-              <w:rPr>
-                <w:rFonts w:ascii="Times New Roman" w:eastAsia="Aptos" w:hAnsi="Times New Roman" w:cs="Times New Roman"/>
+            <w:tcW w:type="dxa" w:w="2592"/>
+            <w:shd w:fill="FFFFFF"/>
+          </w:tcPr>
+          <w:p>
+            <w:pPr>
+              <w:spacing w:before="40" w:after="40"/>
+            </w:pPr>
+            <w:r>
+              <w:rPr>
+                <w:rFonts w:ascii="Calibri" w:hAnsi="Calibri"/>
+                <w:sz w:val="19"/>
+              </w:rPr>
+              <w:t>5. Xác minh nguyên nhân sự cố</w:t>
+            </w:r>
+          </w:p>
+        </w:tc>
+        <w:tc>
+          <w:tcPr>
+            <w:tcW w:type="dxa" w:w="1728"/>
+            <w:shd w:fill="FFFFFF"/>
+          </w:tcPr>
+          <w:p>
+            <w:pPr>
+              <w:spacing w:before="40" w:after="40"/>
+            </w:pPr>
+            <w:r>
+              <w:rPr>
+                <w:rFonts w:ascii="Calibri" w:hAnsi="Calibri"/>
+                <w:sz w:val="19"/>
               </w:rPr>
               <w:t>Bộ phận CSKH</w:t>
             </w:r>
@@ -1530,76 +1766,76 @@
         </w:tc>
         <w:tc>
           <w:tcPr>
-            <w:tcW w:w="3117" w:type="dxa"/>
-            <w:vAlign w:val="center"/>
-          </w:tcPr>
-          <w:p>
-            <w:pPr>
-              <w:spacing w:after="0" w:line="240" w:lineRule="auto"/>
-              <w:rPr>
-                <w:rFonts w:ascii="Times New Roman" w:hAnsi="Times New Roman" w:cs="Times New Roman"/>
-                <w:b/>
-                <w:bCs/>
-                <w:sz w:val="26"/>
-                <w:szCs w:val="26"/>
-              </w:rPr>
-            </w:pPr>
-            <w:r>
-              <w:rPr>
-                <w:rFonts w:ascii="Times New Roman" w:eastAsia="Aptos" w:hAnsi="Times New Roman" w:cs="Times New Roman"/>
+            <w:tcW w:type="dxa" w:w="1296"/>
+            <w:shd w:fill="FFFFFF"/>
+          </w:tcPr>
+          <w:p>
+            <w:pPr>
+              <w:spacing w:before="40" w:after="40"/>
+              <w:jc w:val="center"/>
+            </w:pPr>
+            <w:r>
+              <w:rPr>
+                <w:rFonts w:ascii="Calibri" w:hAnsi="Calibri"/>
+                <w:b/>
+                <w:color w:val="003399"/>
+                <w:sz w:val="19"/>
               </w:rPr>
               <w:t>BVA</w:t>
+            </w:r>
+          </w:p>
+        </w:tc>
+        <w:tc>
+          <w:tcPr>
+            <w:tcW w:type="dxa" w:w="3744"/>
+            <w:shd w:fill="FFFFFF"/>
+          </w:tcPr>
+          <w:p>
+            <w:pPr>
+              <w:spacing w:before="40" w:after="40"/>
+            </w:pPr>
+            <w:r>
+              <w:rPr>
+                <w:rFonts w:ascii="Calibri" w:hAnsi="Calibri"/>
+                <w:sz w:val="19"/>
+              </w:rPr>
+              <w:t>Phối hợp với kho/bưu cục/shipper để xác định lỗi thuộc về ai (khách hàng, shop, hay Viettel Post) nhằm quy trách nhiệm.</w:t>
             </w:r>
           </w:p>
         </w:tc>
       </w:tr>
       <w:tr>
-        <w:trPr>
-          <w:trHeight w:val="602"/>
-        </w:trPr>
-        <w:tc>
-          <w:tcPr>
-            <w:tcW w:w="3116" w:type="dxa"/>
-            <w:vAlign w:val="center"/>
-          </w:tcPr>
-          <w:p>
-            <w:pPr>
-              <w:spacing w:after="0" w:line="240" w:lineRule="auto"/>
-              <w:rPr>
-                <w:rFonts w:ascii="Times New Roman" w:hAnsi="Times New Roman" w:cs="Times New Roman"/>
-                <w:b/>
-                <w:bCs/>
-                <w:sz w:val="26"/>
-                <w:szCs w:val="26"/>
-              </w:rPr>
-            </w:pPr>
-            <w:r>
-              <w:rPr>
-                <w:rFonts w:ascii="Times New Roman" w:eastAsia="Aptos" w:hAnsi="Times New Roman" w:cs="Times New Roman"/>
-              </w:rPr>
-              <w:t>6. Phân loại yêu cầu</w:t>
-            </w:r>
-          </w:p>
-        </w:tc>
-        <w:tc>
-          <w:tcPr>
-            <w:tcW w:w="3117" w:type="dxa"/>
-            <w:vAlign w:val="center"/>
-          </w:tcPr>
-          <w:p>
-            <w:pPr>
-              <w:spacing w:after="0" w:line="240" w:lineRule="auto"/>
-              <w:rPr>
-                <w:rFonts w:ascii="Times New Roman" w:hAnsi="Times New Roman" w:cs="Times New Roman"/>
-                <w:b/>
-                <w:bCs/>
-                <w:sz w:val="26"/>
-                <w:szCs w:val="26"/>
-              </w:rPr>
-            </w:pPr>
-            <w:r>
-              <w:rPr>
-                <w:rFonts w:ascii="Times New Roman" w:eastAsia="Aptos" w:hAnsi="Times New Roman" w:cs="Times New Roman"/>
+        <w:tc>
+          <w:tcPr>
+            <w:tcW w:type="dxa" w:w="2592"/>
+            <w:shd w:fill="F0F4F8"/>
+          </w:tcPr>
+          <w:p>
+            <w:pPr>
+              <w:spacing w:before="40" w:after="40"/>
+            </w:pPr>
+            <w:r>
+              <w:rPr>
+                <w:rFonts w:ascii="Calibri" w:hAnsi="Calibri"/>
+                <w:sz w:val="19"/>
+              </w:rPr>
+              <w:t>6. Phân loại nhóm yêu cầu</w:t>
+            </w:r>
+          </w:p>
+        </w:tc>
+        <w:tc>
+          <w:tcPr>
+            <w:tcW w:type="dxa" w:w="1728"/>
+            <w:shd w:fill="F0F4F8"/>
+          </w:tcPr>
+          <w:p>
+            <w:pPr>
+              <w:spacing w:before="40" w:after="40"/>
+            </w:pPr>
+            <w:r>
+              <w:rPr>
+                <w:rFonts w:ascii="Calibri" w:hAnsi="Calibri"/>
+                <w:sz w:val="19"/>
               </w:rPr>
               <w:t>Bộ phận CSKH</w:t>
             </w:r>
@@ -1607,76 +1843,76 @@
         </w:tc>
         <w:tc>
           <w:tcPr>
-            <w:tcW w:w="3117" w:type="dxa"/>
-            <w:vAlign w:val="center"/>
-          </w:tcPr>
-          <w:p>
-            <w:pPr>
-              <w:spacing w:after="0" w:line="240" w:lineRule="auto"/>
-              <w:rPr>
-                <w:rFonts w:ascii="Times New Roman" w:hAnsi="Times New Roman" w:cs="Times New Roman"/>
-                <w:b/>
-                <w:bCs/>
-                <w:sz w:val="26"/>
-                <w:szCs w:val="26"/>
-              </w:rPr>
-            </w:pPr>
-            <w:r>
-              <w:rPr>
-                <w:rFonts w:ascii="Times New Roman" w:eastAsia="Aptos" w:hAnsi="Times New Roman" w:cs="Times New Roman"/>
+            <w:tcW w:type="dxa" w:w="1296"/>
+            <w:shd w:fill="F0F4F8"/>
+          </w:tcPr>
+          <w:p>
+            <w:pPr>
+              <w:spacing w:before="40" w:after="40"/>
+              <w:jc w:val="center"/>
+            </w:pPr>
+            <w:r>
+              <w:rPr>
+                <w:rFonts w:ascii="Calibri" w:hAnsi="Calibri"/>
+                <w:b/>
+                <w:color w:val="003399"/>
+                <w:sz w:val="19"/>
               </w:rPr>
               <w:t>BVA</w:t>
+            </w:r>
+          </w:p>
+        </w:tc>
+        <w:tc>
+          <w:tcPr>
+            <w:tcW w:type="dxa" w:w="3744"/>
+            <w:shd w:fill="F0F4F8"/>
+          </w:tcPr>
+          <w:p>
+            <w:pPr>
+              <w:spacing w:before="40" w:after="40"/>
+            </w:pPr>
+            <w:r>
+              <w:rPr>
+                <w:rFonts w:ascii="Calibri" w:hAnsi="Calibri"/>
+                <w:sz w:val="19"/>
+              </w:rPr>
+              <w:t>Điều hướng nghiệp vụ nội bộ nhằm chuyển yêu cầu đến đúng luồng xử lý (Shipper thu hồi, CSKH đền bù, hoặc Tư vấn).</w:t>
             </w:r>
           </w:p>
         </w:tc>
       </w:tr>
       <w:tr>
-        <w:trPr>
-          <w:trHeight w:val="440"/>
-        </w:trPr>
-        <w:tc>
-          <w:tcPr>
-            <w:tcW w:w="3116" w:type="dxa"/>
-            <w:vAlign w:val="center"/>
-          </w:tcPr>
-          <w:p>
-            <w:pPr>
-              <w:spacing w:after="0" w:line="240" w:lineRule="auto"/>
-              <w:rPr>
-                <w:rFonts w:ascii="Times New Roman" w:hAnsi="Times New Roman" w:cs="Times New Roman"/>
-                <w:b/>
-                <w:bCs/>
-                <w:sz w:val="26"/>
-                <w:szCs w:val="26"/>
-              </w:rPr>
-            </w:pPr>
-            <w:r>
-              <w:rPr>
-                <w:rFonts w:ascii="Times New Roman" w:eastAsia="Aptos" w:hAnsi="Times New Roman" w:cs="Times New Roman"/>
-              </w:rPr>
-              <w:t>7. Nhận yêu cầu thu hồi hàng</w:t>
-            </w:r>
-          </w:p>
-        </w:tc>
-        <w:tc>
-          <w:tcPr>
-            <w:tcW w:w="3117" w:type="dxa"/>
-            <w:vAlign w:val="center"/>
-          </w:tcPr>
-          <w:p>
-            <w:pPr>
-              <w:spacing w:after="0" w:line="240" w:lineRule="auto"/>
-              <w:rPr>
-                <w:rFonts w:ascii="Times New Roman" w:hAnsi="Times New Roman" w:cs="Times New Roman"/>
-                <w:b/>
-                <w:bCs/>
-                <w:sz w:val="26"/>
-                <w:szCs w:val="26"/>
-              </w:rPr>
-            </w:pPr>
-            <w:r>
-              <w:rPr>
-                <w:rFonts w:ascii="Times New Roman" w:eastAsia="Aptos" w:hAnsi="Times New Roman" w:cs="Times New Roman"/>
+        <w:tc>
+          <w:tcPr>
+            <w:tcW w:type="dxa" w:w="2592"/>
+            <w:shd w:fill="FFFFFF"/>
+          </w:tcPr>
+          <w:p>
+            <w:pPr>
+              <w:spacing w:before="40" w:after="40"/>
+            </w:pPr>
+            <w:r>
+              <w:rPr>
+                <w:rFonts w:ascii="Calibri" w:hAnsi="Calibri"/>
+                <w:sz w:val="19"/>
+              </w:rPr>
+              <w:t>7. Tiếp nhận lệnh thu hồi hàng</w:t>
+            </w:r>
+          </w:p>
+        </w:tc>
+        <w:tc>
+          <w:tcPr>
+            <w:tcW w:type="dxa" w:w="1728"/>
+            <w:shd w:fill="FFFFFF"/>
+          </w:tcPr>
+          <w:p>
+            <w:pPr>
+              <w:spacing w:before="40" w:after="40"/>
+            </w:pPr>
+            <w:r>
+              <w:rPr>
+                <w:rFonts w:ascii="Calibri" w:hAnsi="Calibri"/>
+                <w:sz w:val="19"/>
               </w:rPr>
               <w:t>Shipper</w:t>
             </w:r>
@@ -1684,52 +1920,58 @@
         </w:tc>
         <w:tc>
           <w:tcPr>
-            <w:tcW w:w="3117" w:type="dxa"/>
-            <w:vAlign w:val="center"/>
-          </w:tcPr>
-          <w:p>
-            <w:pPr>
-              <w:spacing w:after="0" w:line="240" w:lineRule="auto"/>
-              <w:rPr>
-                <w:rFonts w:ascii="Times New Roman" w:hAnsi="Times New Roman" w:cs="Times New Roman"/>
-                <w:b/>
-                <w:bCs/>
-                <w:sz w:val="26"/>
-                <w:szCs w:val="26"/>
-              </w:rPr>
-            </w:pPr>
-            <w:r>
-              <w:rPr>
-                <w:rFonts w:ascii="Times New Roman" w:eastAsia="Aptos" w:hAnsi="Times New Roman" w:cs="Times New Roman"/>
+            <w:tcW w:type="dxa" w:w="1296"/>
+            <w:shd w:fill="FFFFFF"/>
+          </w:tcPr>
+          <w:p>
+            <w:pPr>
+              <w:spacing w:before="40" w:after="40"/>
+              <w:jc w:val="center"/>
+            </w:pPr>
+            <w:r>
+              <w:rPr>
+                <w:rFonts w:ascii="Calibri" w:hAnsi="Calibri"/>
+                <w:b/>
+                <w:color w:val="003399"/>
+                <w:sz w:val="19"/>
               </w:rPr>
               <w:t>BVA</w:t>
+            </w:r>
+          </w:p>
+        </w:tc>
+        <w:tc>
+          <w:tcPr>
+            <w:tcW w:type="dxa" w:w="3744"/>
+            <w:shd w:fill="FFFFFF"/>
+          </w:tcPr>
+          <w:p>
+            <w:pPr>
+              <w:spacing w:before="40" w:after="40"/>
+            </w:pPr>
+            <w:r>
+              <w:rPr>
+                <w:rFonts w:ascii="Calibri" w:hAnsi="Calibri"/>
+                <w:sz w:val="19"/>
+              </w:rPr>
+              <w:t>Shipper nhận nhiệm vụ trên App di động để lập kế hoạch di chuyển lấy hàng.</w:t>
             </w:r>
           </w:p>
         </w:tc>
       </w:tr>
       <w:tr>
-        <w:trPr>
-          <w:trHeight w:val="710"/>
-        </w:trPr>
-        <w:tc>
-          <w:tcPr>
-            <w:tcW w:w="3116" w:type="dxa"/>
-            <w:vAlign w:val="center"/>
-          </w:tcPr>
-          <w:p>
-            <w:pPr>
-              <w:spacing w:after="0" w:line="240" w:lineRule="auto"/>
-              <w:rPr>
-                <w:rFonts w:ascii="Times New Roman" w:hAnsi="Times New Roman" w:cs="Times New Roman"/>
-                <w:b/>
-                <w:bCs/>
-                <w:sz w:val="26"/>
-                <w:szCs w:val="26"/>
-              </w:rPr>
-            </w:pPr>
-            <w:r>
-              <w:rPr>
-                <w:rFonts w:ascii="Times New Roman" w:eastAsia="Aptos" w:hAnsi="Times New Roman" w:cs="Times New Roman"/>
+        <w:tc>
+          <w:tcPr>
+            <w:tcW w:type="dxa" w:w="2592"/>
+            <w:shd w:fill="F0F4F8"/>
+          </w:tcPr>
+          <w:p>
+            <w:pPr>
+              <w:spacing w:before="40" w:after="40"/>
+            </w:pPr>
+            <w:r>
+              <w:rPr>
+                <w:rFonts w:ascii="Calibri" w:hAnsi="Calibri"/>
+                <w:sz w:val="19"/>
               </w:rPr>
               <w:t>8. Liên hệ khách hàng và thu hồi hàng</w:t>
             </w:r>
@@ -1737,23 +1979,17 @@
         </w:tc>
         <w:tc>
           <w:tcPr>
-            <w:tcW w:w="3117" w:type="dxa"/>
-            <w:vAlign w:val="center"/>
-          </w:tcPr>
-          <w:p>
-            <w:pPr>
-              <w:spacing w:after="0" w:line="240" w:lineRule="auto"/>
-              <w:rPr>
-                <w:rFonts w:ascii="Times New Roman" w:hAnsi="Times New Roman" w:cs="Times New Roman"/>
-                <w:b/>
-                <w:bCs/>
-                <w:sz w:val="26"/>
-                <w:szCs w:val="26"/>
-              </w:rPr>
-            </w:pPr>
-            <w:r>
-              <w:rPr>
-                <w:rFonts w:ascii="Times New Roman" w:eastAsia="Aptos" w:hAnsi="Times New Roman" w:cs="Times New Roman"/>
+            <w:tcW w:type="dxa" w:w="1728"/>
+            <w:shd w:fill="F0F4F8"/>
+          </w:tcPr>
+          <w:p>
+            <w:pPr>
+              <w:spacing w:before="40" w:after="40"/>
+            </w:pPr>
+            <w:r>
+              <w:rPr>
+                <w:rFonts w:ascii="Calibri" w:hAnsi="Calibri"/>
+                <w:sz w:val="19"/>
               </w:rPr>
               <w:t>Shipper</w:t>
             </w:r>
@@ -1761,25 +1997,40 @@
         </w:tc>
         <w:tc>
           <w:tcPr>
-            <w:tcW w:w="3117" w:type="dxa"/>
-            <w:vAlign w:val="center"/>
-          </w:tcPr>
-          <w:p>
-            <w:pPr>
-              <w:spacing w:after="0" w:line="240" w:lineRule="auto"/>
-              <w:rPr>
-                <w:rFonts w:ascii="Times New Roman" w:hAnsi="Times New Roman" w:cs="Times New Roman"/>
-                <w:b/>
-                <w:bCs/>
-                <w:sz w:val="26"/>
-                <w:szCs w:val="26"/>
-              </w:rPr>
-            </w:pPr>
-            <w:r>
-              <w:rPr>
-                <w:rFonts w:ascii="Times New Roman" w:eastAsia="Aptos" w:hAnsi="Times New Roman" w:cs="Times New Roman"/>
+            <w:tcW w:type="dxa" w:w="1296"/>
+            <w:shd w:fill="F0F4F8"/>
+          </w:tcPr>
+          <w:p>
+            <w:pPr>
+              <w:spacing w:before="40" w:after="40"/>
+              <w:jc w:val="center"/>
+            </w:pPr>
+            <w:r>
+              <w:rPr>
+                <w:rFonts w:ascii="Calibri" w:hAnsi="Calibri"/>
+                <w:b/>
+                <w:color w:val="008000"/>
+                <w:sz w:val="19"/>
               </w:rPr>
               <w:t>VA</w:t>
+            </w:r>
+          </w:p>
+        </w:tc>
+        <w:tc>
+          <w:tcPr>
+            <w:tcW w:type="dxa" w:w="3744"/>
+            <w:shd w:fill="F0F4F8"/>
+          </w:tcPr>
+          <w:p>
+            <w:pPr>
+              <w:spacing w:before="40" w:after="40"/>
+            </w:pPr>
+            <w:r>
+              <w:rPr>
+                <w:rFonts w:ascii="Calibri" w:hAnsi="Calibri"/>
+                <w:sz w:val="19"/>
+              </w:rPr>
+              <w:t>Shipper đến tận nhà thu hồi hàng hoàn. Khách hàng nhận được giá trị trực tiếp là bàn giao thành công hàng hoàn.</w:t>
             </w:r>
           </w:p>
         </w:tc>
@@ -1787,47 +2038,35 @@
       <w:tr>
         <w:tc>
           <w:tcPr>
-            <w:tcW w:w="3116" w:type="dxa"/>
-            <w:vAlign w:val="center"/>
-          </w:tcPr>
-          <w:p>
-            <w:pPr>
-              <w:spacing w:after="0" w:line="240" w:lineRule="auto"/>
-              <w:rPr>
-                <w:rFonts w:ascii="Times New Roman" w:hAnsi="Times New Roman" w:cs="Times New Roman"/>
-                <w:b/>
-                <w:bCs/>
-                <w:sz w:val="26"/>
-                <w:szCs w:val="26"/>
-              </w:rPr>
-            </w:pPr>
-            <w:r>
-              <w:rPr>
-                <w:rFonts w:ascii="Times New Roman" w:eastAsia="Aptos" w:hAnsi="Times New Roman" w:cs="Times New Roman"/>
-              </w:rPr>
-              <w:t>9. Bàn giao hàng về bưu cục/kho</w:t>
-            </w:r>
-          </w:p>
-        </w:tc>
-        <w:tc>
-          <w:tcPr>
-            <w:tcW w:w="3117" w:type="dxa"/>
-            <w:vAlign w:val="center"/>
-          </w:tcPr>
-          <w:p>
-            <w:pPr>
-              <w:spacing w:after="0" w:line="240" w:lineRule="auto"/>
-              <w:rPr>
-                <w:rFonts w:ascii="Times New Roman" w:hAnsi="Times New Roman" w:cs="Times New Roman"/>
-                <w:b/>
-                <w:bCs/>
-                <w:sz w:val="26"/>
-                <w:szCs w:val="26"/>
-              </w:rPr>
-            </w:pPr>
-            <w:r>
-              <w:rPr>
-                <w:rFonts w:ascii="Times New Roman" w:eastAsia="Aptos" w:hAnsi="Times New Roman" w:cs="Times New Roman"/>
+            <w:tcW w:type="dxa" w:w="2592"/>
+            <w:shd w:fill="FFFFFF"/>
+          </w:tcPr>
+          <w:p>
+            <w:pPr>
+              <w:spacing w:before="40" w:after="40"/>
+            </w:pPr>
+            <w:r>
+              <w:rPr>
+                <w:rFonts w:ascii="Calibri" w:hAnsi="Calibri"/>
+                <w:sz w:val="19"/>
+              </w:rPr>
+              <w:t>9. Vận chuyển hàng hóa về bưu cục/kho</w:t>
+            </w:r>
+          </w:p>
+        </w:tc>
+        <w:tc>
+          <w:tcPr>
+            <w:tcW w:type="dxa" w:w="1728"/>
+            <w:shd w:fill="FFFFFF"/>
+          </w:tcPr>
+          <w:p>
+            <w:pPr>
+              <w:spacing w:before="40" w:after="40"/>
+            </w:pPr>
+            <w:r>
+              <w:rPr>
+                <w:rFonts w:ascii="Calibri" w:hAnsi="Calibri"/>
+                <w:sz w:val="19"/>
               </w:rPr>
               <w:t>Shipper</w:t>
             </w:r>
@@ -1835,256 +2074,271 @@
         </w:tc>
         <w:tc>
           <w:tcPr>
-            <w:tcW w:w="3117" w:type="dxa"/>
-            <w:vAlign w:val="center"/>
-          </w:tcPr>
-          <w:p>
-            <w:pPr>
-              <w:spacing w:after="0" w:line="240" w:lineRule="auto"/>
-              <w:rPr>
-                <w:rFonts w:ascii="Times New Roman" w:hAnsi="Times New Roman" w:cs="Times New Roman"/>
-                <w:b/>
-                <w:bCs/>
-                <w:sz w:val="26"/>
-                <w:szCs w:val="26"/>
-              </w:rPr>
-            </w:pPr>
-            <w:r>
-              <w:rPr>
-                <w:rFonts w:ascii="Times New Roman" w:eastAsia="Aptos" w:hAnsi="Times New Roman" w:cs="Times New Roman"/>
-              </w:rPr>
-              <w:t>VA</w:t>
+            <w:tcW w:type="dxa" w:w="1296"/>
+            <w:shd w:fill="FFFFFF"/>
+          </w:tcPr>
+          <w:p>
+            <w:pPr>
+              <w:spacing w:before="40" w:after="40"/>
+              <w:jc w:val="center"/>
+            </w:pPr>
+            <w:r>
+              <w:rPr>
+                <w:rFonts w:ascii="Calibri" w:hAnsi="Calibri"/>
+                <w:b/>
+                <w:color w:val="CC0000"/>
+                <w:sz w:val="19"/>
+              </w:rPr>
+              <w:t>NVA</w:t>
+            </w:r>
+          </w:p>
+        </w:tc>
+        <w:tc>
+          <w:tcPr>
+            <w:tcW w:type="dxa" w:w="3744"/>
+            <w:shd w:fill="FFFFFF"/>
+          </w:tcPr>
+          <w:p>
+            <w:pPr>
+              <w:spacing w:before="40" w:after="40"/>
+            </w:pPr>
+            <w:r>
+              <w:rPr>
+                <w:rFonts w:ascii="Calibri" w:hAnsi="Calibri"/>
+                <w:sz w:val="19"/>
+              </w:rPr>
+              <w:t>Hoạt động di chuyển cơ học (Transportation). Không làm tăng giá trị hàng hóa nhưng bắt buộc do khoảng cách địa lý.</w:t>
             </w:r>
           </w:p>
         </w:tc>
       </w:tr>
       <w:tr>
-        <w:trPr>
-          <w:trHeight w:val="863"/>
-        </w:trPr>
-        <w:tc>
-          <w:tcPr>
-            <w:tcW w:w="3116" w:type="dxa"/>
-            <w:vAlign w:val="center"/>
-          </w:tcPr>
-          <w:p>
-            <w:pPr>
-              <w:spacing w:after="0" w:line="240" w:lineRule="auto"/>
-              <w:rPr>
-                <w:rFonts w:ascii="Times New Roman" w:hAnsi="Times New Roman" w:cs="Times New Roman"/>
-                <w:b/>
-                <w:bCs/>
-                <w:sz w:val="26"/>
-                <w:szCs w:val="26"/>
-              </w:rPr>
-            </w:pPr>
-            <w:r>
-              <w:rPr>
-                <w:rFonts w:ascii="Times New Roman" w:eastAsia="Aptos" w:hAnsi="Times New Roman" w:cs="Times New Roman"/>
-              </w:rPr>
-              <w:t>10. Kiểm tra tình trạng hàng hoàn</w:t>
-            </w:r>
-          </w:p>
-        </w:tc>
-        <w:tc>
-          <w:tcPr>
-            <w:tcW w:w="3117" w:type="dxa"/>
-            <w:vAlign w:val="center"/>
-          </w:tcPr>
-          <w:p>
-            <w:pPr>
-              <w:spacing w:after="0" w:line="240" w:lineRule="auto"/>
-              <w:rPr>
-                <w:rFonts w:ascii="Times New Roman" w:hAnsi="Times New Roman" w:cs="Times New Roman"/>
-                <w:b/>
-                <w:bCs/>
-                <w:sz w:val="26"/>
-                <w:szCs w:val="26"/>
-              </w:rPr>
-            </w:pPr>
-            <w:r>
-              <w:rPr>
-                <w:rFonts w:ascii="Times New Roman" w:eastAsia="Aptos" w:hAnsi="Times New Roman" w:cs="Times New Roman"/>
-              </w:rPr>
-              <w:t>Bưu cục/Kho</w:t>
-            </w:r>
-          </w:p>
-        </w:tc>
-        <w:tc>
-          <w:tcPr>
-            <w:tcW w:w="3117" w:type="dxa"/>
-            <w:vAlign w:val="center"/>
-          </w:tcPr>
-          <w:p>
-            <w:pPr>
-              <w:spacing w:after="0" w:line="240" w:lineRule="auto"/>
-              <w:rPr>
-                <w:rFonts w:ascii="Times New Roman" w:hAnsi="Times New Roman" w:cs="Times New Roman"/>
-                <w:b/>
-                <w:bCs/>
-                <w:sz w:val="26"/>
-                <w:szCs w:val="26"/>
-              </w:rPr>
-            </w:pPr>
-            <w:r>
-              <w:rPr>
-                <w:rFonts w:ascii="Times New Roman" w:eastAsia="Aptos" w:hAnsi="Times New Roman" w:cs="Times New Roman"/>
-              </w:rPr>
-              <w:t>VA</w:t>
+        <w:tc>
+          <w:tcPr>
+            <w:tcW w:type="dxa" w:w="2592"/>
+            <w:shd w:fill="F0F4F8"/>
+          </w:tcPr>
+          <w:p>
+            <w:pPr>
+              <w:spacing w:before="40" w:after="40"/>
+            </w:pPr>
+            <w:r>
+              <w:rPr>
+                <w:rFonts w:ascii="Calibri" w:hAnsi="Calibri"/>
+                <w:sz w:val="19"/>
+              </w:rPr>
+              <w:t>10. Kiểm tra tình trạng hàng hoàn tại kho</w:t>
+            </w:r>
+          </w:p>
+        </w:tc>
+        <w:tc>
+          <w:tcPr>
+            <w:tcW w:type="dxa" w:w="1728"/>
+            <w:shd w:fill="F0F4F8"/>
+          </w:tcPr>
+          <w:p>
+            <w:pPr>
+              <w:spacing w:before="40" w:after="40"/>
+            </w:pPr>
+            <w:r>
+              <w:rPr>
+                <w:rFonts w:ascii="Calibri" w:hAnsi="Calibri"/>
+                <w:sz w:val="19"/>
+              </w:rPr>
+              <w:t>Bưu cục / Kho</w:t>
+            </w:r>
+          </w:p>
+        </w:tc>
+        <w:tc>
+          <w:tcPr>
+            <w:tcW w:type="dxa" w:w="1296"/>
+            <w:shd w:fill="F0F4F8"/>
+          </w:tcPr>
+          <w:p>
+            <w:pPr>
+              <w:spacing w:before="40" w:after="40"/>
+              <w:jc w:val="center"/>
+            </w:pPr>
+            <w:r>
+              <w:rPr>
+                <w:rFonts w:ascii="Calibri" w:hAnsi="Calibri"/>
+                <w:b/>
+                <w:color w:val="003399"/>
+                <w:sz w:val="19"/>
+              </w:rPr>
+              <w:t>BVA</w:t>
+            </w:r>
+          </w:p>
+        </w:tc>
+        <w:tc>
+          <w:tcPr>
+            <w:tcW w:type="dxa" w:w="3744"/>
+            <w:shd w:fill="F0F4F8"/>
+          </w:tcPr>
+          <w:p>
+            <w:pPr>
+              <w:spacing w:before="40" w:after="40"/>
+            </w:pPr>
+            <w:r>
+              <w:rPr>
+                <w:rFonts w:ascii="Calibri" w:hAnsi="Calibri"/>
+                <w:sz w:val="19"/>
+              </w:rPr>
+              <w:t>Kiểm tra niêm phong, ngoại quan, so sánh hàng thực tế với mô tả nhằm ngăn chặn việc tráo hàng hoặc hư hỏng phát sinh.</w:t>
             </w:r>
           </w:p>
         </w:tc>
       </w:tr>
       <w:tr>
-        <w:trPr>
-          <w:trHeight w:val="710"/>
-        </w:trPr>
-        <w:tc>
-          <w:tcPr>
-            <w:tcW w:w="3116" w:type="dxa"/>
-            <w:vAlign w:val="center"/>
-          </w:tcPr>
-          <w:p>
-            <w:pPr>
-              <w:spacing w:after="0" w:line="240" w:lineRule="auto"/>
-              <w:rPr>
-                <w:rFonts w:ascii="Times New Roman" w:hAnsi="Times New Roman" w:cs="Times New Roman"/>
-                <w:b/>
-                <w:bCs/>
-                <w:sz w:val="26"/>
-                <w:szCs w:val="26"/>
-              </w:rPr>
-            </w:pPr>
-            <w:r>
-              <w:rPr>
-                <w:rFonts w:ascii="Times New Roman" w:eastAsia="Aptos" w:hAnsi="Times New Roman" w:cs="Times New Roman"/>
-              </w:rPr>
-              <w:t>10b. Lập biên bản, báo cáo CSKH</w:t>
-            </w:r>
-          </w:p>
-        </w:tc>
-        <w:tc>
-          <w:tcPr>
-            <w:tcW w:w="3117" w:type="dxa"/>
-            <w:vAlign w:val="center"/>
-          </w:tcPr>
-          <w:p>
-            <w:pPr>
-              <w:spacing w:after="0" w:line="240" w:lineRule="auto"/>
-              <w:rPr>
-                <w:rFonts w:ascii="Times New Roman" w:hAnsi="Times New Roman" w:cs="Times New Roman"/>
-                <w:b/>
-                <w:bCs/>
-                <w:sz w:val="26"/>
-                <w:szCs w:val="26"/>
-              </w:rPr>
-            </w:pPr>
-            <w:r>
-              <w:rPr>
-                <w:rFonts w:ascii="Times New Roman" w:eastAsia="Aptos" w:hAnsi="Times New Roman" w:cs="Times New Roman"/>
-              </w:rPr>
-              <w:t>Bưu cục/Kho</w:t>
-            </w:r>
-          </w:p>
-        </w:tc>
-        <w:tc>
-          <w:tcPr>
-            <w:tcW w:w="3117" w:type="dxa"/>
-            <w:vAlign w:val="center"/>
-          </w:tcPr>
-          <w:p>
-            <w:pPr>
-              <w:spacing w:after="0" w:line="240" w:lineRule="auto"/>
-              <w:rPr>
-                <w:rFonts w:ascii="Times New Roman" w:hAnsi="Times New Roman" w:cs="Times New Roman"/>
-                <w:b/>
-                <w:bCs/>
-                <w:sz w:val="26"/>
-                <w:szCs w:val="26"/>
-              </w:rPr>
-            </w:pPr>
-            <w:r>
-              <w:rPr>
-                <w:rFonts w:ascii="Times New Roman" w:eastAsia="Aptos" w:hAnsi="Times New Roman" w:cs="Times New Roman"/>
+        <w:tc>
+          <w:tcPr>
+            <w:tcW w:type="dxa" w:w="2592"/>
+            <w:shd w:fill="FFFFFF"/>
+          </w:tcPr>
+          <w:p>
+            <w:pPr>
+              <w:spacing w:before="40" w:after="40"/>
+            </w:pPr>
+            <w:r>
+              <w:rPr>
+                <w:rFonts w:ascii="Calibri" w:hAnsi="Calibri"/>
+                <w:sz w:val="19"/>
+              </w:rPr>
+              <w:t>11a. Lập biên bản bất thường (nếu không đủ điều kiện)</w:t>
+            </w:r>
+          </w:p>
+        </w:tc>
+        <w:tc>
+          <w:tcPr>
+            <w:tcW w:type="dxa" w:w="1728"/>
+            <w:shd w:fill="FFFFFF"/>
+          </w:tcPr>
+          <w:p>
+            <w:pPr>
+              <w:spacing w:before="40" w:after="40"/>
+            </w:pPr>
+            <w:r>
+              <w:rPr>
+                <w:rFonts w:ascii="Calibri" w:hAnsi="Calibri"/>
+                <w:sz w:val="19"/>
+              </w:rPr>
+              <w:t>Bưu cục / Kho</w:t>
+            </w:r>
+          </w:p>
+        </w:tc>
+        <w:tc>
+          <w:tcPr>
+            <w:tcW w:type="dxa" w:w="1296"/>
+            <w:shd w:fill="FFFFFF"/>
+          </w:tcPr>
+          <w:p>
+            <w:pPr>
+              <w:spacing w:before="40" w:after="40"/>
+              <w:jc w:val="center"/>
+            </w:pPr>
+            <w:r>
+              <w:rPr>
+                <w:rFonts w:ascii="Calibri" w:hAnsi="Calibri"/>
+                <w:b/>
+                <w:color w:val="003399"/>
+                <w:sz w:val="19"/>
               </w:rPr>
               <w:t>BVA</w:t>
+            </w:r>
+          </w:p>
+        </w:tc>
+        <w:tc>
+          <w:tcPr>
+            <w:tcW w:type="dxa" w:w="3744"/>
+            <w:shd w:fill="FFFFFF"/>
+          </w:tcPr>
+          <w:p>
+            <w:pPr>
+              <w:spacing w:before="40" w:after="40"/>
+            </w:pPr>
+            <w:r>
+              <w:rPr>
+                <w:rFonts w:ascii="Calibri" w:hAnsi="Calibri"/>
+                <w:sz w:val="19"/>
+              </w:rPr>
+              <w:t>Tạo chứng cứ pháp lý bảo vệ doanh nghiệp khi từ chối hoàn trả hoặc làm cơ sở xử lý bồi thường.</w:t>
             </w:r>
           </w:p>
         </w:tc>
       </w:tr>
       <w:tr>
-        <w:trPr>
-          <w:trHeight w:val="791"/>
-        </w:trPr>
-        <w:tc>
-          <w:tcPr>
-            <w:tcW w:w="3116" w:type="dxa"/>
-            <w:vAlign w:val="center"/>
-          </w:tcPr>
-          <w:p>
-            <w:pPr>
-              <w:spacing w:after="0" w:line="240" w:lineRule="auto"/>
-              <w:rPr>
-                <w:rFonts w:ascii="Times New Roman" w:hAnsi="Times New Roman" w:cs="Times New Roman"/>
-                <w:b/>
-                <w:bCs/>
-                <w:sz w:val="26"/>
-                <w:szCs w:val="26"/>
-              </w:rPr>
-            </w:pPr>
-            <w:r>
-              <w:rPr>
-                <w:rFonts w:ascii="Times New Roman" w:eastAsia="Aptos" w:hAnsi="Times New Roman" w:cs="Times New Roman"/>
-              </w:rPr>
-              <w:t>11. Xử lý hoàn trả hàng cho người gửi</w:t>
-            </w:r>
-          </w:p>
-        </w:tc>
-        <w:tc>
-          <w:tcPr>
-            <w:tcW w:w="3117" w:type="dxa"/>
-            <w:vAlign w:val="center"/>
-          </w:tcPr>
-          <w:p>
-            <w:pPr>
-              <w:spacing w:after="0" w:line="240" w:lineRule="auto"/>
-              <w:rPr>
-                <w:rFonts w:ascii="Times New Roman" w:hAnsi="Times New Roman" w:cs="Times New Roman"/>
-                <w:b/>
-                <w:bCs/>
-                <w:sz w:val="26"/>
-                <w:szCs w:val="26"/>
-              </w:rPr>
-            </w:pPr>
-            <w:r>
-              <w:rPr>
-                <w:rFonts w:ascii="Times New Roman" w:eastAsia="Aptos" w:hAnsi="Times New Roman" w:cs="Times New Roman"/>
-              </w:rPr>
-              <w:t>Bưu cục/Kho</w:t>
-            </w:r>
-          </w:p>
-        </w:tc>
-        <w:tc>
-          <w:tcPr>
-            <w:tcW w:w="3117" w:type="dxa"/>
-            <w:vAlign w:val="center"/>
-          </w:tcPr>
-          <w:p>
-            <w:pPr>
-              <w:spacing w:after="0" w:line="240" w:lineRule="auto"/>
-              <w:rPr>
-                <w:rFonts w:ascii="Times New Roman" w:hAnsi="Times New Roman" w:cs="Times New Roman"/>
-                <w:b/>
-                <w:bCs/>
-                <w:sz w:val="26"/>
-                <w:szCs w:val="26"/>
-              </w:rPr>
-            </w:pPr>
-            <w:r>
-              <w:rPr>
-                <w:rFonts w:ascii="Times New Roman" w:eastAsia="Aptos" w:hAnsi="Times New Roman" w:cs="Times New Roman"/>
+        <w:tc>
+          <w:tcPr>
+            <w:tcW w:type="dxa" w:w="2592"/>
+            <w:shd w:fill="F0F4F8"/>
+          </w:tcPr>
+          <w:p>
+            <w:pPr>
+              <w:spacing w:before="40" w:after="40"/>
+            </w:pPr>
+            <w:r>
+              <w:rPr>
+                <w:rFonts w:ascii="Calibri" w:hAnsi="Calibri"/>
+                <w:sz w:val="19"/>
+              </w:rPr>
+              <w:t>11b. Xử lý hoàn trả hàng cho người gửi (nếu đủ)</w:t>
+            </w:r>
+          </w:p>
+        </w:tc>
+        <w:tc>
+          <w:tcPr>
+            <w:tcW w:type="dxa" w:w="1728"/>
+            <w:shd w:fill="F0F4F8"/>
+          </w:tcPr>
+          <w:p>
+            <w:pPr>
+              <w:spacing w:before="40" w:after="40"/>
+            </w:pPr>
+            <w:r>
+              <w:rPr>
+                <w:rFonts w:ascii="Calibri" w:hAnsi="Calibri"/>
+                <w:sz w:val="19"/>
+              </w:rPr>
+              <w:t>Bưu cục / Kho</w:t>
+            </w:r>
+          </w:p>
+        </w:tc>
+        <w:tc>
+          <w:tcPr>
+            <w:tcW w:type="dxa" w:w="1296"/>
+            <w:shd w:fill="F0F4F8"/>
+          </w:tcPr>
+          <w:p>
+            <w:pPr>
+              <w:spacing w:before="40" w:after="40"/>
+              <w:jc w:val="center"/>
+            </w:pPr>
+            <w:r>
+              <w:rPr>
+                <w:rFonts w:ascii="Calibri" w:hAnsi="Calibri"/>
+                <w:b/>
+                <w:color w:val="008000"/>
+                <w:sz w:val="19"/>
               </w:rPr>
               <w:t>VA</w:t>
+            </w:r>
+          </w:p>
+        </w:tc>
+        <w:tc>
+          <w:tcPr>
+            <w:tcW w:type="dxa" w:w="3744"/>
+            <w:shd w:fill="F0F4F8"/>
+          </w:tcPr>
+          <w:p>
+            <w:pPr>
+              <w:spacing w:before="40" w:after="40"/>
+            </w:pPr>
+            <w:r>
+              <w:rPr>
+                <w:rFonts w:ascii="Calibri" w:hAnsi="Calibri"/>
+                <w:sz w:val="19"/>
+              </w:rPr>
+              <w:t>Hàng hóa được trả thành công về cho người gửi (Shop/Chủ hàng). Người gửi nhận lại tài sản, đáp ứng mục tiêu quy trình.</w:t>
             </w:r>
           </w:p>
         </w:tc>
@@ -2092,125 +2346,112 @@
       <w:tr>
         <w:tc>
           <w:tcPr>
-            <w:tcW w:w="3116" w:type="dxa"/>
-            <w:vAlign w:val="center"/>
-          </w:tcPr>
-          <w:p>
-            <w:pPr>
-              <w:spacing w:after="0" w:line="240" w:lineRule="auto"/>
-              <w:rPr>
-                <w:rFonts w:ascii="Times New Roman" w:hAnsi="Times New Roman" w:cs="Times New Roman"/>
-                <w:b/>
-                <w:bCs/>
-                <w:sz w:val="26"/>
-                <w:szCs w:val="26"/>
-              </w:rPr>
-            </w:pPr>
-            <w:r>
-              <w:rPr>
-                <w:rFonts w:ascii="Times New Roman" w:eastAsia="Aptos" w:hAnsi="Times New Roman" w:cs="Times New Roman"/>
-              </w:rPr>
-              <w:t>11b. Cập nhật kết quả hoàn trả</w:t>
-            </w:r>
-          </w:p>
-        </w:tc>
-        <w:tc>
-          <w:tcPr>
-            <w:tcW w:w="3117" w:type="dxa"/>
-            <w:vAlign w:val="center"/>
-          </w:tcPr>
-          <w:p>
-            <w:pPr>
-              <w:spacing w:after="0" w:line="240" w:lineRule="auto"/>
-              <w:rPr>
-                <w:rFonts w:ascii="Times New Roman" w:hAnsi="Times New Roman" w:cs="Times New Roman"/>
-                <w:b/>
-                <w:bCs/>
-                <w:sz w:val="26"/>
-                <w:szCs w:val="26"/>
-              </w:rPr>
-            </w:pPr>
-            <w:r>
-              <w:rPr>
-                <w:rFonts w:ascii="Times New Roman" w:eastAsia="Aptos" w:hAnsi="Times New Roman" w:cs="Times New Roman"/>
-              </w:rPr>
-              <w:t>Bưu cục/Kho</w:t>
-            </w:r>
-          </w:p>
-        </w:tc>
-        <w:tc>
-          <w:tcPr>
-            <w:tcW w:w="3117" w:type="dxa"/>
-            <w:vAlign w:val="center"/>
-          </w:tcPr>
-          <w:p>
-            <w:pPr>
-              <w:spacing w:after="0" w:line="240" w:lineRule="auto"/>
-              <w:rPr>
-                <w:rFonts w:ascii="Times New Roman" w:hAnsi="Times New Roman" w:cs="Times New Roman"/>
-                <w:b/>
-                <w:bCs/>
-                <w:sz w:val="26"/>
-                <w:szCs w:val="26"/>
-              </w:rPr>
-            </w:pPr>
-            <w:r>
-              <w:rPr>
-                <w:rFonts w:ascii="Times New Roman" w:eastAsia="Aptos" w:hAnsi="Times New Roman" w:cs="Times New Roman"/>
+            <w:tcW w:type="dxa" w:w="2592"/>
+            <w:shd w:fill="FFFFFF"/>
+          </w:tcPr>
+          <w:p>
+            <w:pPr>
+              <w:spacing w:before="40" w:after="40"/>
+            </w:pPr>
+            <w:r>
+              <w:rPr>
+                <w:rFonts w:ascii="Calibri" w:hAnsi="Calibri"/>
+                <w:sz w:val="19"/>
+              </w:rPr>
+              <w:t>12. Cập nhật kết quả kiểm hàng</w:t>
+            </w:r>
+          </w:p>
+        </w:tc>
+        <w:tc>
+          <w:tcPr>
+            <w:tcW w:type="dxa" w:w="1728"/>
+            <w:shd w:fill="FFFFFF"/>
+          </w:tcPr>
+          <w:p>
+            <w:pPr>
+              <w:spacing w:before="40" w:after="40"/>
+            </w:pPr>
+            <w:r>
+              <w:rPr>
+                <w:rFonts w:ascii="Calibri" w:hAnsi="Calibri"/>
+                <w:sz w:val="19"/>
+              </w:rPr>
+              <w:t>Bưu cục / Kho</w:t>
+            </w:r>
+          </w:p>
+        </w:tc>
+        <w:tc>
+          <w:tcPr>
+            <w:tcW w:type="dxa" w:w="1296"/>
+            <w:shd w:fill="FFFFFF"/>
+          </w:tcPr>
+          <w:p>
+            <w:pPr>
+              <w:spacing w:before="40" w:after="40"/>
+              <w:jc w:val="center"/>
+            </w:pPr>
+            <w:r>
+              <w:rPr>
+                <w:rFonts w:ascii="Calibri" w:hAnsi="Calibri"/>
+                <w:b/>
+                <w:color w:val="003399"/>
+                <w:sz w:val="19"/>
               </w:rPr>
               <w:t>BVA</w:t>
+            </w:r>
+          </w:p>
+        </w:tc>
+        <w:tc>
+          <w:tcPr>
+            <w:tcW w:type="dxa" w:w="3744"/>
+            <w:shd w:fill="FFFFFF"/>
+          </w:tcPr>
+          <w:p>
+            <w:pPr>
+              <w:spacing w:before="40" w:after="40"/>
+            </w:pPr>
+            <w:r>
+              <w:rPr>
+                <w:rFonts w:ascii="Calibri" w:hAnsi="Calibri"/>
+                <w:sz w:val="19"/>
+              </w:rPr>
+              <w:t>Cập nhật hệ thống WMS để đóng luồng vật lý và chuyển thông tin cho bộ phận tài chính/CSKH đối soát.</w:t>
             </w:r>
           </w:p>
         </w:tc>
       </w:tr>
       <w:tr>
-        <w:trPr>
-          <w:trHeight w:val="575"/>
-        </w:trPr>
-        <w:tc>
-          <w:tcPr>
-            <w:tcW w:w="3116" w:type="dxa"/>
-            <w:vAlign w:val="center"/>
-          </w:tcPr>
-          <w:p>
-            <w:pPr>
-              <w:spacing w:after="0" w:line="240" w:lineRule="auto"/>
-              <w:rPr>
-                <w:rFonts w:ascii="Times New Roman" w:hAnsi="Times New Roman" w:cs="Times New Roman"/>
-                <w:b/>
-                <w:bCs/>
-                <w:sz w:val="26"/>
-                <w:szCs w:val="26"/>
-              </w:rPr>
-            </w:pPr>
-            <w:r>
-              <w:rPr>
-                <w:rFonts w:ascii="Times New Roman" w:eastAsia="Aptos" w:hAnsi="Times New Roman" w:cs="Times New Roman"/>
-              </w:rPr>
-              <w:lastRenderedPageBreak/>
-              <w:t>12. Giải quyết khiếu nại</w:t>
-            </w:r>
-          </w:p>
-        </w:tc>
-        <w:tc>
-          <w:tcPr>
-            <w:tcW w:w="3117" w:type="dxa"/>
-            <w:vAlign w:val="center"/>
-          </w:tcPr>
-          <w:p>
-            <w:pPr>
-              <w:spacing w:after="0" w:line="240" w:lineRule="auto"/>
-              <w:rPr>
-                <w:rFonts w:ascii="Times New Roman" w:hAnsi="Times New Roman" w:cs="Times New Roman"/>
-                <w:b/>
-                <w:bCs/>
-                <w:sz w:val="26"/>
-                <w:szCs w:val="26"/>
-              </w:rPr>
-            </w:pPr>
-            <w:r>
-              <w:rPr>
-                <w:rFonts w:ascii="Times New Roman" w:eastAsia="Aptos" w:hAnsi="Times New Roman" w:cs="Times New Roman"/>
+        <w:tc>
+          <w:tcPr>
+            <w:tcW w:type="dxa" w:w="2592"/>
+            <w:shd w:fill="F0F4F8"/>
+          </w:tcPr>
+          <w:p>
+            <w:pPr>
+              <w:spacing w:before="40" w:after="40"/>
+            </w:pPr>
+            <w:r>
+              <w:rPr>
+                <w:rFonts w:ascii="Calibri" w:hAnsi="Calibri"/>
+                <w:sz w:val="19"/>
+              </w:rPr>
+              <w:t>13. Giải quyết khiếu nại &amp; xử lý bồi thường</w:t>
+            </w:r>
+          </w:p>
+        </w:tc>
+        <w:tc>
+          <w:tcPr>
+            <w:tcW w:type="dxa" w:w="1728"/>
+            <w:shd w:fill="F0F4F8"/>
+          </w:tcPr>
+          <w:p>
+            <w:pPr>
+              <w:spacing w:before="40" w:after="40"/>
+            </w:pPr>
+            <w:r>
+              <w:rPr>
+                <w:rFonts w:ascii="Calibri" w:hAnsi="Calibri"/>
+                <w:sz w:val="19"/>
               </w:rPr>
               <w:t>Bộ phận CSKH</w:t>
             </w:r>
@@ -2218,25 +2459,348 @@
         </w:tc>
         <w:tc>
           <w:tcPr>
-            <w:tcW w:w="3117" w:type="dxa"/>
-            <w:vAlign w:val="center"/>
-          </w:tcPr>
-          <w:p>
-            <w:pPr>
-              <w:spacing w:after="0" w:line="240" w:lineRule="auto"/>
-              <w:rPr>
-                <w:rFonts w:ascii="Times New Roman" w:hAnsi="Times New Roman" w:cs="Times New Roman"/>
-                <w:b/>
-                <w:bCs/>
-                <w:sz w:val="26"/>
-                <w:szCs w:val="26"/>
-              </w:rPr>
-            </w:pPr>
-            <w:r>
-              <w:rPr>
-                <w:rFonts w:ascii="Times New Roman" w:eastAsia="Aptos" w:hAnsi="Times New Roman" w:cs="Times New Roman"/>
+            <w:tcW w:type="dxa" w:w="1296"/>
+            <w:shd w:fill="F0F4F8"/>
+          </w:tcPr>
+          <w:p>
+            <w:pPr>
+              <w:spacing w:before="40" w:after="40"/>
+              <w:jc w:val="center"/>
+            </w:pPr>
+            <w:r>
+              <w:rPr>
+                <w:rFonts w:ascii="Calibri" w:hAnsi="Calibri"/>
+                <w:b/>
+                <w:color w:val="008000"/>
+                <w:sz w:val="19"/>
               </w:rPr>
               <w:t>VA</w:t>
+            </w:r>
+          </w:p>
+        </w:tc>
+        <w:tc>
+          <w:tcPr>
+            <w:tcW w:type="dxa" w:w="3744"/>
+            <w:shd w:fill="F0F4F8"/>
+          </w:tcPr>
+          <w:p>
+            <w:pPr>
+              <w:spacing w:before="40" w:after="40"/>
+            </w:pPr>
+            <w:r>
+              <w:rPr>
+                <w:rFonts w:ascii="Calibri" w:hAnsi="Calibri"/>
+                <w:sz w:val="19"/>
+              </w:rPr>
+              <w:t>Đưa ra phương án đền bù thỏa đáng cho khách hàng khi hàng bị mất/hỏng do lỗi vận chuyển Viettel Post.</w:t>
+            </w:r>
+          </w:p>
+        </w:tc>
+      </w:tr>
+      <w:tr>
+        <w:tc>
+          <w:tcPr>
+            <w:tcW w:type="dxa" w:w="2592"/>
+            <w:shd w:fill="FFFFFF"/>
+          </w:tcPr>
+          <w:p>
+            <w:pPr>
+              <w:spacing w:before="40" w:after="40"/>
+            </w:pPr>
+            <w:r>
+              <w:rPr>
+                <w:rFonts w:ascii="Calibri" w:hAnsi="Calibri"/>
+                <w:sz w:val="19"/>
+              </w:rPr>
+              <w:t>14. Tư vấn &amp; giải đáp thắc mắc khách hàng</w:t>
+            </w:r>
+          </w:p>
+        </w:tc>
+        <w:tc>
+          <w:tcPr>
+            <w:tcW w:type="dxa" w:w="1728"/>
+            <w:shd w:fill="FFFFFF"/>
+          </w:tcPr>
+          <w:p>
+            <w:pPr>
+              <w:spacing w:before="40" w:after="40"/>
+            </w:pPr>
+            <w:r>
+              <w:rPr>
+                <w:rFonts w:ascii="Calibri" w:hAnsi="Calibri"/>
+                <w:sz w:val="19"/>
+              </w:rPr>
+              <w:t>Bộ phận CSKH</w:t>
+            </w:r>
+          </w:p>
+        </w:tc>
+        <w:tc>
+          <w:tcPr>
+            <w:tcW w:type="dxa" w:w="1296"/>
+            <w:shd w:fill="FFFFFF"/>
+          </w:tcPr>
+          <w:p>
+            <w:pPr>
+              <w:spacing w:before="40" w:after="40"/>
+              <w:jc w:val="center"/>
+            </w:pPr>
+            <w:r>
+              <w:rPr>
+                <w:rFonts w:ascii="Calibri" w:hAnsi="Calibri"/>
+                <w:b/>
+                <w:color w:val="008000"/>
+                <w:sz w:val="19"/>
+              </w:rPr>
+              <w:t>VA</w:t>
+            </w:r>
+          </w:p>
+        </w:tc>
+        <w:tc>
+          <w:tcPr>
+            <w:tcW w:type="dxa" w:w="3744"/>
+            <w:shd w:fill="FFFFFF"/>
+          </w:tcPr>
+          <w:p>
+            <w:pPr>
+              <w:spacing w:before="40" w:after="40"/>
+            </w:pPr>
+            <w:r>
+              <w:rPr>
+                <w:rFonts w:ascii="Calibri" w:hAnsi="Calibri"/>
+                <w:sz w:val="19"/>
+              </w:rPr>
+              <w:t>Giải đáp thắc mắc, hướng dẫn chính sách trực tiếp giúp khách hàng hài lòng và an tâm.</w:t>
+            </w:r>
+          </w:p>
+        </w:tc>
+      </w:tr>
+      <w:tr>
+        <w:tc>
+          <w:tcPr>
+            <w:tcW w:type="dxa" w:w="2592"/>
+            <w:shd w:fill="F0F4F8"/>
+          </w:tcPr>
+          <w:p>
+            <w:pPr>
+              <w:spacing w:before="40" w:after="40"/>
+            </w:pPr>
+            <w:r>
+              <w:rPr>
+                <w:rFonts w:ascii="Calibri" w:hAnsi="Calibri"/>
+                <w:sz w:val="19"/>
+              </w:rPr>
+              <w:t>15. Thông báo kết quả phản hồi đến khách hàng</w:t>
+            </w:r>
+          </w:p>
+        </w:tc>
+        <w:tc>
+          <w:tcPr>
+            <w:tcW w:type="dxa" w:w="1728"/>
+            <w:shd w:fill="F0F4F8"/>
+          </w:tcPr>
+          <w:p>
+            <w:pPr>
+              <w:spacing w:before="40" w:after="40"/>
+            </w:pPr>
+            <w:r>
+              <w:rPr>
+                <w:rFonts w:ascii="Calibri" w:hAnsi="Calibri"/>
+                <w:sz w:val="19"/>
+              </w:rPr>
+              <w:t>Bộ phận CSKH</w:t>
+            </w:r>
+          </w:p>
+        </w:tc>
+        <w:tc>
+          <w:tcPr>
+            <w:tcW w:type="dxa" w:w="1296"/>
+            <w:shd w:fill="F0F4F8"/>
+          </w:tcPr>
+          <w:p>
+            <w:pPr>
+              <w:spacing w:before="40" w:after="40"/>
+              <w:jc w:val="center"/>
+            </w:pPr>
+            <w:r>
+              <w:rPr>
+                <w:rFonts w:ascii="Calibri" w:hAnsi="Calibri"/>
+                <w:b/>
+                <w:color w:val="003399"/>
+                <w:sz w:val="19"/>
+              </w:rPr>
+              <w:t>BVA</w:t>
+            </w:r>
+          </w:p>
+        </w:tc>
+        <w:tc>
+          <w:tcPr>
+            <w:tcW w:type="dxa" w:w="3744"/>
+            <w:shd w:fill="F0F4F8"/>
+          </w:tcPr>
+          <w:p>
+            <w:pPr>
+              <w:spacing w:before="40" w:after="40"/>
+            </w:pPr>
+            <w:r>
+              <w:rPr>
+                <w:rFonts w:ascii="Calibri" w:hAnsi="Calibri"/>
+                <w:sz w:val="19"/>
+              </w:rPr>
+              <w:t>Thông báo chính thức qua SMS/App/Email để khách hàng nắm bắt được kết quả xử lý cuối cùng.</w:t>
+            </w:r>
+          </w:p>
+        </w:tc>
+      </w:tr>
+      <w:tr>
+        <w:tc>
+          <w:tcPr>
+            <w:tcW w:type="dxa" w:w="2592"/>
+            <w:shd w:fill="FFFFFF"/>
+          </w:tcPr>
+          <w:p>
+            <w:pPr>
+              <w:spacing w:before="40" w:after="40"/>
+            </w:pPr>
+            <w:r>
+              <w:rPr>
+                <w:rFonts w:ascii="Calibri" w:hAnsi="Calibri"/>
+                <w:sz w:val="19"/>
+              </w:rPr>
+              <w:t>16. Nhận kết quả phản hồi</w:t>
+            </w:r>
+          </w:p>
+        </w:tc>
+        <w:tc>
+          <w:tcPr>
+            <w:tcW w:type="dxa" w:w="1728"/>
+            <w:shd w:fill="FFFFFF"/>
+          </w:tcPr>
+          <w:p>
+            <w:pPr>
+              <w:spacing w:before="40" w:after="40"/>
+            </w:pPr>
+            <w:r>
+              <w:rPr>
+                <w:rFonts w:ascii="Calibri" w:hAnsi="Calibri"/>
+                <w:sz w:val="19"/>
+              </w:rPr>
+              <w:t>Khách hàng</w:t>
+            </w:r>
+          </w:p>
+        </w:tc>
+        <w:tc>
+          <w:tcPr>
+            <w:tcW w:type="dxa" w:w="1296"/>
+            <w:shd w:fill="FFFFFF"/>
+          </w:tcPr>
+          <w:p>
+            <w:pPr>
+              <w:spacing w:before="40" w:after="40"/>
+              <w:jc w:val="center"/>
+            </w:pPr>
+            <w:r>
+              <w:rPr>
+                <w:rFonts w:ascii="Calibri" w:hAnsi="Calibri"/>
+                <w:b/>
+                <w:color w:val="008000"/>
+                <w:sz w:val="19"/>
+              </w:rPr>
+              <w:t>VA</w:t>
+            </w:r>
+          </w:p>
+        </w:tc>
+        <w:tc>
+          <w:tcPr>
+            <w:tcW w:type="dxa" w:w="3744"/>
+            <w:shd w:fill="FFFFFF"/>
+          </w:tcPr>
+          <w:p>
+            <w:pPr>
+              <w:spacing w:before="40" w:after="40"/>
+            </w:pPr>
+            <w:r>
+              <w:rPr>
+                <w:rFonts w:ascii="Calibri" w:hAnsi="Calibri"/>
+                <w:sz w:val="19"/>
+              </w:rPr>
+              <w:t>Khách hàng nghiệm thu kết quả xử lý, hoàn tất mục tiêu ban đầu khi tạo yêu cầu.</w:t>
+            </w:r>
+          </w:p>
+        </w:tc>
+      </w:tr>
+      <w:tr>
+        <w:tc>
+          <w:tcPr>
+            <w:tcW w:type="dxa" w:w="2592"/>
+            <w:shd w:fill="F0F4F8"/>
+          </w:tcPr>
+          <w:p>
+            <w:pPr>
+              <w:spacing w:before="40" w:after="40"/>
+            </w:pPr>
+            <w:r>
+              <w:rPr>
+                <w:rFonts w:ascii="Calibri" w:hAnsi="Calibri"/>
+                <w:sz w:val="19"/>
+              </w:rPr>
+              <w:t>17. Cập nhật hệ thống &amp; lưu trữ hồ sơ</w:t>
+            </w:r>
+          </w:p>
+        </w:tc>
+        <w:tc>
+          <w:tcPr>
+            <w:tcW w:type="dxa" w:w="1728"/>
+            <w:shd w:fill="F0F4F8"/>
+          </w:tcPr>
+          <w:p>
+            <w:pPr>
+              <w:spacing w:before="40" w:after="40"/>
+            </w:pPr>
+            <w:r>
+              <w:rPr>
+                <w:rFonts w:ascii="Calibri" w:hAnsi="Calibri"/>
+                <w:sz w:val="19"/>
+              </w:rPr>
+              <w:t>Hệ thống / CSKH</w:t>
+            </w:r>
+          </w:p>
+        </w:tc>
+        <w:tc>
+          <w:tcPr>
+            <w:tcW w:type="dxa" w:w="1296"/>
+            <w:shd w:fill="F0F4F8"/>
+          </w:tcPr>
+          <w:p>
+            <w:pPr>
+              <w:spacing w:before="40" w:after="40"/>
+              <w:jc w:val="center"/>
+            </w:pPr>
+            <w:r>
+              <w:rPr>
+                <w:rFonts w:ascii="Calibri" w:hAnsi="Calibri"/>
+                <w:b/>
+                <w:color w:val="003399"/>
+                <w:sz w:val="19"/>
+              </w:rPr>
+              <w:t>BVA</w:t>
+            </w:r>
+          </w:p>
+        </w:tc>
+        <w:tc>
+          <w:tcPr>
+            <w:tcW w:type="dxa" w:w="3744"/>
+            <w:shd w:fill="F0F4F8"/>
+          </w:tcPr>
+          <w:p>
+            <w:pPr>
+              <w:spacing w:before="40" w:after="40"/>
+            </w:pPr>
+            <w:r>
+              <w:rPr>
+                <w:rFonts w:ascii="Calibri" w:hAnsi="Calibri"/>
+                <w:sz w:val="19"/>
+              </w:rPr>
+              <w:t>Lưu trữ lịch sử giao dịch, dữ liệu đối soát tài chính và làm cơ sở báo cáo KPI/SLA cho quản lý.</w:t>
             </w:r>
           </w:p>
         </w:tc>
@@ -2244,154 +2808,1010 @@
     </w:tbl>
     <w:p>
       <w:pPr>
-        <w:rPr>
-          <w:rFonts w:ascii="Times New Roman" w:hAnsi="Times New Roman" w:cs="Times New Roman"/>
+        <w:spacing w:before="0" w:after="120"/>
+        <w:jc w:val="left"/>
+      </w:pPr>
+      <w:r>
+        <w:rPr>
+          <w:rFonts w:ascii="Calibri" w:hAnsi="Calibri"/>
+          <w:b w:val="0"/>
+          <w:i w:val="0"/>
+          <w:sz w:val="22"/>
+        </w:rPr>
+      </w:r>
+    </w:p>
+    <w:p>
+      <w:pPr>
+        <w:spacing w:before="240" w:after="120"/>
+        <w:jc w:val="left"/>
+      </w:pPr>
+      <w:r>
+        <w:rPr>
+          <w:rFonts w:ascii="Calibri" w:hAnsi="Calibri"/>
           <w:b/>
-          <w:bCs/>
-          <w:sz w:val="26"/>
-          <w:szCs w:val="26"/>
-        </w:rPr>
-      </w:pPr>
-    </w:p>
-    <w:p>
-      <w:pPr>
-        <w:rPr>
-          <w:rFonts w:ascii="Times New Roman" w:hAnsi="Times New Roman" w:cs="Times New Roman"/>
+          <w:i w:val="0"/>
+          <w:color w:val="006699"/>
+          <w:sz w:val="24"/>
+        </w:rPr>
+        <w:t>3.8.3.2 Phân tích lãng phí (Waste Analysis)</w:t>
+      </w:r>
+    </w:p>
+    <w:p>
+      <w:pPr>
+        <w:spacing w:before="120" w:after="80"/>
+        <w:jc w:val="left"/>
+      </w:pPr>
+      <w:r>
+        <w:rPr>
+          <w:rFonts w:ascii="Calibri" w:hAnsi="Calibri"/>
           <w:b/>
-          <w:bCs/>
-          <w:sz w:val="26"/>
-          <w:szCs w:val="26"/>
-        </w:rPr>
-      </w:pPr>
-      <w:r>
-        <w:rPr>
-          <w:rFonts w:ascii="Times New Roman" w:hAnsi="Times New Roman" w:cs="Times New Roman"/>
+          <w:i/>
+          <w:sz w:val="22"/>
+        </w:rPr>
+        <w:t>a. Biểu diễn lãng phí trên sơ đồ quy trình BPMN</w:t>
+      </w:r>
+    </w:p>
+    <w:p>
+      <w:pPr>
+        <w:spacing w:before="0" w:after="80"/>
+        <w:jc w:val="left"/>
+      </w:pPr>
+      <w:r>
+        <w:rPr>
+          <w:rFonts w:ascii="Calibri" w:hAnsi="Calibri"/>
+          <w:b w:val="0"/>
+          <w:i w:val="0"/>
+          <w:sz w:val="22"/>
+        </w:rPr>
+        <w:t>Theo lý thuyết Quản trị sản xuất tinh gọn (Lean / TPS) và phân tích quy trình nghiệp vụ (BPM), 7 loại lãng phí (Muda) xuất hiện tại các điểm trong quy trình Quản lý hoàn trả &amp; CSKH Viettel Post:</w:t>
+      </w:r>
+    </w:p>
+    <w:p>
+      <w:pPr>
+        <w:spacing w:before="0" w:after="40"/>
+        <w:jc w:val="left"/>
+      </w:pPr>
+      <w:r>
+        <w:rPr>
+          <w:rFonts w:ascii="Calibri" w:hAnsi="Calibri"/>
+          <w:b w:val="0"/>
+          <w:i w:val="0"/>
+          <w:sz w:val="22"/>
+        </w:rPr>
+        <w:t xml:space="preserve"> - W1 - Transportation (Lãng phí vận chuyển): Phát sinh ở bước Shipper chở hàng về kho, sau đó từ kho mới chuyển trả về người gửi qua nhiều trạm trung chuyển.</w:t>
+      </w:r>
+    </w:p>
+    <w:p>
+      <w:pPr>
+        <w:spacing w:before="0" w:after="40"/>
+        <w:jc w:val="left"/>
+      </w:pPr>
+      <w:r>
+        <w:rPr>
+          <w:rFonts w:ascii="Calibri" w:hAnsi="Calibri"/>
+          <w:b w:val="0"/>
+          <w:i w:val="0"/>
+          <w:sz w:val="22"/>
+        </w:rPr>
+        <w:t xml:space="preserve"> - W2 - Motion (Lãng phí chuyển động): Shipper di chuyển nhiều lần đến địa chỉ khách nhưng không gặp (khách hẹn lại, sai địa chỉ, không nghe máy).</w:t>
+      </w:r>
+    </w:p>
+    <w:p>
+      <w:pPr>
+        <w:spacing w:before="0" w:after="40"/>
+        <w:jc w:val="left"/>
+      </w:pPr>
+      <w:r>
+        <w:rPr>
+          <w:rFonts w:ascii="Calibri" w:hAnsi="Calibri"/>
+          <w:b w:val="0"/>
+          <w:i w:val="0"/>
+          <w:sz w:val="22"/>
+        </w:rPr>
+        <w:t xml:space="preserve"> - W3 - Inventory (Lãng phí tồn kho): Hàng hoàn nằm tồn đọng tại bưu cục/kho do chưa có xác nhận từ CSKH hoặc chờ duyệt biên bản.</w:t>
+      </w:r>
+    </w:p>
+    <w:p>
+      <w:pPr>
+        <w:spacing w:before="0" w:after="40"/>
+        <w:jc w:val="left"/>
+      </w:pPr>
+      <w:r>
+        <w:rPr>
+          <w:rFonts w:ascii="Calibri" w:hAnsi="Calibri"/>
+          <w:b w:val="0"/>
+          <w:i w:val="0"/>
+          <w:sz w:val="22"/>
+        </w:rPr>
+        <w:t xml:space="preserve"> - W4 - Waiting (Lãng phí chờ đợi): CSKH chờ kho/shipper phản hồi thông tin xác minh; Khách hàng chờ duyệt bồi thường khiếu nại.</w:t>
+      </w:r>
+    </w:p>
+    <w:p>
+      <w:pPr>
+        <w:spacing w:before="0" w:after="40"/>
+        <w:jc w:val="left"/>
+      </w:pPr>
+      <w:r>
+        <w:rPr>
+          <w:rFonts w:ascii="Calibri" w:hAnsi="Calibri"/>
+          <w:b w:val="0"/>
+          <w:i w:val="0"/>
+          <w:sz w:val="22"/>
+        </w:rPr>
+        <w:t xml:space="preserve"> - W5 - Defects (Lãng phí lỗi / làm lại): Hồ sơ khiếu nại bị thiếu hình ảnh/chứng từ làm cho CSKH phải gọi lại yêu cầu khách hàng bổ sung.</w:t>
+      </w:r>
+    </w:p>
+    <w:p>
+      <w:pPr>
+        <w:spacing w:before="0" w:after="40"/>
+        <w:jc w:val="left"/>
+      </w:pPr>
+      <w:r>
+        <w:rPr>
+          <w:rFonts w:ascii="Calibri" w:hAnsi="Calibri"/>
+          <w:b w:val="0"/>
+          <w:i w:val="0"/>
+          <w:sz w:val="22"/>
+        </w:rPr>
+        <w:t xml:space="preserve"> - W6 - Over-processing (Lãng phí xử lý quá mức): Kiểm tra thông tin đơn hàng 2 lần (CSKH kiểm tra hệ thống, Bưu cục/Kho mở hàng kiểm tra lại); nhập dữ liệu trùng lặp trên cả App và sổ sách.</w:t>
+      </w:r>
+    </w:p>
+    <w:p>
+      <w:pPr>
+        <w:spacing w:before="0" w:after="120"/>
+        <w:jc w:val="left"/>
+      </w:pPr>
+      <w:r>
+        <w:rPr>
+          <w:rFonts w:ascii="Calibri" w:hAnsi="Calibri"/>
+          <w:b w:val="0"/>
+          <w:i w:val="0"/>
+          <w:sz w:val="22"/>
+        </w:rPr>
+        <w:t xml:space="preserve"> - W7 - Over-production (Lãng phí xử lý quá thừa): Tiếp nhận và mở hồ sơ xử lý cho các yêu cầu không đủ điều kiện hoặc yêu cầu rác/ảo từ khách hàng.</w:t>
+      </w:r>
+    </w:p>
+    <w:p>
+      <w:pPr>
+        <w:spacing w:before="120" w:after="80"/>
+        <w:jc w:val="left"/>
+      </w:pPr>
+      <w:r>
+        <w:rPr>
+          <w:rFonts w:ascii="Calibri" w:hAnsi="Calibri"/>
           <w:b/>
-          <w:bCs/>
-          <w:sz w:val="26"/>
-          <w:szCs w:val="26"/>
-        </w:rPr>
-        <w:t xml:space="preserve">    3.8.3.2 Phân tích lãng phí</w:t>
+          <w:i/>
+          <w:sz w:val="22"/>
+        </w:rPr>
+        <w:t>b. Phân tích chi tiết từng loại lãng phí (4 nội dung chuẩn)</w:t>
+      </w:r>
+    </w:p>
+    <w:p>
+      <w:pPr>
+        <w:spacing w:before="80" w:after="40"/>
+        <w:jc w:val="left"/>
+      </w:pPr>
+      <w:r>
+        <w:rPr>
+          <w:rFonts w:ascii="Calibri" w:hAnsi="Calibri"/>
+          <w:b/>
+          <w:i w:val="0"/>
+          <w:color w:val="003366"/>
+          <w:sz w:val="21"/>
+        </w:rPr>
+        <w:t>1. Lãng phí Chờ đợi (Waiting Waste)</w:t>
+      </w:r>
+    </w:p>
+    <w:p>
+      <w:pPr>
+        <w:spacing w:before="0" w:after="40"/>
+        <w:jc w:val="left"/>
+      </w:pPr>
+      <w:r>
+        <w:rPr>
+          <w:rFonts w:ascii="Calibri" w:hAnsi="Calibri"/>
+          <w:b w:val="0"/>
+          <w:i w:val="0"/>
+          <w:sz w:val="20"/>
+        </w:rPr>
+        <w:t xml:space="preserve"> • Lãng phí gì: Thời gian nằm chờ chết của hồ sơ/đơn hàng tại các điểm bàn giao trong quy trình (CSKH chờ thông tin từ Kho, Khách hàng chờ duyệt bồi thường).</w:t>
+      </w:r>
+    </w:p>
+    <w:p>
+      <w:pPr>
+        <w:spacing w:before="0" w:after="40"/>
+        <w:jc w:val="left"/>
+      </w:pPr>
+      <w:r>
+        <w:rPr>
+          <w:rFonts w:ascii="Calibri" w:hAnsi="Calibri"/>
+          <w:b w:val="0"/>
+          <w:i w:val="0"/>
+          <w:sz w:val="20"/>
+        </w:rPr>
+        <w:t xml:space="preserve"> • Nguyên nhân: Thiếu cơ chế tự động cảnh báo quá hạn (SLA Alerts); việc giao tiếp giữa bộ phận CSKH và Bưu cục/Kho chủ yếu qua tin nhắn thủ công hoặc email không đồng bộ.</w:t>
+      </w:r>
+    </w:p>
+    <w:p>
+      <w:pPr>
+        <w:spacing w:before="0" w:after="40"/>
+        <w:jc w:val="left"/>
+      </w:pPr>
+      <w:r>
+        <w:rPr>
+          <w:rFonts w:ascii="Calibri" w:hAnsi="Calibri"/>
+          <w:b w:val="0"/>
+          <w:i w:val="0"/>
+          <w:sz w:val="20"/>
+        </w:rPr>
+        <w:t xml:space="preserve"> • Ảnh hưởng: Kéo dài tổng thời gian chu kỳ (Cycle Time) xử lý từ 2-3 ngày lên 5-7 ngày; gây bức xúc cho khách hàng, giảm chỉ số hài lòng (NPS).</w:t>
+      </w:r>
+    </w:p>
+    <w:p>
+      <w:pPr>
+        <w:spacing w:before="0" w:after="40"/>
+        <w:jc w:val="left"/>
+      </w:pPr>
+      <w:r>
+        <w:rPr>
+          <w:rFonts w:ascii="Calibri" w:hAnsi="Calibri"/>
+          <w:b w:val="0"/>
+          <w:i w:val="0"/>
+          <w:sz w:val="20"/>
+        </w:rPr>
+        <w:t xml:space="preserve"> • Đề xuất cải tiến: Thiết lập cơ chế tự động cảnh báo quá hạn SLA trên hệ thống Ticketing; phân quyền cho CSKH truy cập trực tiếp trạng thái tồn kho thực tế.</w:t>
+      </w:r>
+    </w:p>
+    <w:p>
+      <w:pPr>
+        <w:spacing w:before="0" w:after="80"/>
+        <w:jc w:val="left"/>
+      </w:pPr>
+      <w:r>
+        <w:rPr>
+          <w:rFonts w:ascii="Calibri" w:hAnsi="Calibri"/>
+          <w:b w:val="0"/>
+          <w:i w:val="0"/>
+          <w:sz w:val="22"/>
+        </w:rPr>
+      </w:r>
+    </w:p>
+    <w:p>
+      <w:pPr>
+        <w:spacing w:before="80" w:after="40"/>
+        <w:jc w:val="left"/>
+      </w:pPr>
+      <w:r>
+        <w:rPr>
+          <w:rFonts w:ascii="Calibri" w:hAnsi="Calibri"/>
+          <w:b/>
+          <w:i w:val="0"/>
+          <w:color w:val="003366"/>
+          <w:sz w:val="21"/>
+        </w:rPr>
+        <w:t>2. Lãng phí Lỗi / Làm lại (Defects &amp; Rework Waste)</w:t>
+      </w:r>
+    </w:p>
+    <w:p>
+      <w:pPr>
+        <w:spacing w:before="0" w:after="40"/>
+        <w:jc w:val="left"/>
+      </w:pPr>
+      <w:r>
+        <w:rPr>
+          <w:rFonts w:ascii="Calibri" w:hAnsi="Calibri"/>
+          <w:b w:val="0"/>
+          <w:i w:val="0"/>
+          <w:sz w:val="20"/>
+        </w:rPr>
+        <w:t xml:space="preserve"> • Lãng phí gì: Yêu cầu phải gửi lại chứng từ bổ sung (Bước 2) do thông tin gửi lần đầu bị mờ, thiếu mã vận đơn hoặc sai lý do hoàn trả.</w:t>
+      </w:r>
+    </w:p>
+    <w:p>
+      <w:pPr>
+        <w:spacing w:before="0" w:after="40"/>
+        <w:jc w:val="left"/>
+      </w:pPr>
+      <w:r>
+        <w:rPr>
+          <w:rFonts w:ascii="Calibri" w:hAnsi="Calibri"/>
+          <w:b w:val="0"/>
+          <w:i w:val="0"/>
+          <w:sz w:val="20"/>
+        </w:rPr>
+        <w:t xml:space="preserve"> • Nguyên nhân: Giao diện ứng dụng Viettel Post / Website khi khách tạo yêu cầu không bắt buộc điền đủ trường dữ liệu (Missing mandatory fields); thiếu hướng dẫn chụp ảnh hàng lỗi chuẩn.</w:t>
+      </w:r>
+    </w:p>
+    <w:p>
+      <w:pPr>
+        <w:spacing w:before="0" w:after="40"/>
+        <w:jc w:val="left"/>
+      </w:pPr>
+      <w:r>
+        <w:rPr>
+          <w:rFonts w:ascii="Calibri" w:hAnsi="Calibri"/>
+          <w:b w:val="0"/>
+          <w:i w:val="0"/>
+          <w:sz w:val="20"/>
+        </w:rPr>
+        <w:t xml:space="preserve"> • Ảnh hưởng: Tốn nhân lực CSKH gọi điện xác minh lại nhiều lần; tăng 30% thời gian xử lý bước kiểm tra thông tin.</w:t>
+      </w:r>
+    </w:p>
+    <w:p>
+      <w:pPr>
+        <w:spacing w:before="0" w:after="40"/>
+        <w:jc w:val="left"/>
+      </w:pPr>
+      <w:r>
+        <w:rPr>
+          <w:rFonts w:ascii="Calibri" w:hAnsi="Calibri"/>
+          <w:b w:val="0"/>
+          <w:i w:val="0"/>
+          <w:sz w:val="20"/>
+        </w:rPr>
+        <w:t xml:space="preserve"> • Đề xuất cải tiến: Chuẩn hóa biểu mẫu điện tử trên App Viettel Post với các trường bắt buộc (ảnh chụp 6 mặt, video khui hàng); tích hợp AI OCR để tự động nhận diện thông tin trên hóa đơn/vận đơn.</w:t>
+      </w:r>
+    </w:p>
+    <w:p>
+      <w:pPr>
+        <w:spacing w:before="0" w:after="80"/>
+        <w:jc w:val="left"/>
+      </w:pPr>
+      <w:r>
+        <w:rPr>
+          <w:rFonts w:ascii="Calibri" w:hAnsi="Calibri"/>
+          <w:b w:val="0"/>
+          <w:i w:val="0"/>
+          <w:sz w:val="22"/>
+        </w:rPr>
+      </w:r>
+    </w:p>
+    <w:p>
+      <w:pPr>
+        <w:spacing w:before="80" w:after="40"/>
+        <w:jc w:val="left"/>
+      </w:pPr>
+      <w:r>
+        <w:rPr>
+          <w:rFonts w:ascii="Calibri" w:hAnsi="Calibri"/>
+          <w:b/>
+          <w:i w:val="0"/>
+          <w:color w:val="003366"/>
+          <w:sz w:val="21"/>
+        </w:rPr>
+        <w:t>3. Lãng phí Vận chuyển (Transportation Waste)</w:t>
+      </w:r>
+    </w:p>
+    <w:p>
+      <w:pPr>
+        <w:spacing w:before="0" w:after="40"/>
+        <w:jc w:val="left"/>
+      </w:pPr>
+      <w:r>
+        <w:rPr>
+          <w:rFonts w:ascii="Calibri" w:hAnsi="Calibri"/>
+          <w:b w:val="0"/>
+          <w:i w:val="0"/>
+          <w:sz w:val="20"/>
+        </w:rPr>
+        <w:t xml:space="preserve"> • Lãng phí gì: Hàng hoàn bị di chuyển qua quá nhiều nấc trung chuyển (Khách hàng -&gt; Shipper -&gt; Bưu cục gom -&gt; Kho trung tâm -&gt; Bưu cục phát -&gt; Người gửi).</w:t>
+      </w:r>
+    </w:p>
+    <w:p>
+      <w:pPr>
+        <w:spacing w:before="0" w:after="40"/>
+        <w:jc w:val="left"/>
+      </w:pPr>
+      <w:r>
+        <w:rPr>
+          <w:rFonts w:ascii="Calibri" w:hAnsi="Calibri"/>
+          <w:b w:val="0"/>
+          <w:i w:val="0"/>
+          <w:sz w:val="20"/>
+        </w:rPr>
+        <w:t xml:space="preserve"> • Nguyên nhân: Quy trình phân luồng hàng hoàn đi theo tuyến cố định của hàng giao thông thường, chưa có tuyến thu hồi tối ưu trực tiếp.</w:t>
+      </w:r>
+    </w:p>
+    <w:p>
+      <w:pPr>
+        <w:spacing w:before="0" w:after="40"/>
+        <w:jc w:val="left"/>
+      </w:pPr>
+      <w:r>
+        <w:rPr>
+          <w:rFonts w:ascii="Calibri" w:hAnsi="Calibri"/>
+          <w:b w:val="0"/>
+          <w:i w:val="0"/>
+          <w:sz w:val="20"/>
+        </w:rPr>
+        <w:t xml:space="preserve"> • Ảnh hưởng: Tăng chi phí xăng dầu, chi phí khấu hao phương tiện; tăng nguy cơ hàng hóa bị va đập, thất lạc trong quá trình luân chuyển.</w:t>
+      </w:r>
+    </w:p>
+    <w:p>
+      <w:pPr>
+        <w:spacing w:before="0" w:after="40"/>
+        <w:jc w:val="left"/>
+      </w:pPr>
+      <w:r>
+        <w:rPr>
+          <w:rFonts w:ascii="Calibri" w:hAnsi="Calibri"/>
+          <w:b w:val="0"/>
+          <w:i w:val="0"/>
+          <w:sz w:val="20"/>
+        </w:rPr>
+        <w:t xml:space="preserve"> • Đề xuất cải tiến: Áp dụng thuật toán định tuyến thông minh (Smart Routing) cho phép Shipper giao trả trực tiếp cho người gửi nếu cùng tuyến đường/khu vực.</w:t>
+      </w:r>
+    </w:p>
+    <w:p>
+      <w:pPr>
+        <w:spacing w:before="0" w:after="80"/>
+        <w:jc w:val="left"/>
+      </w:pPr>
+      <w:r>
+        <w:rPr>
+          <w:rFonts w:ascii="Calibri" w:hAnsi="Calibri"/>
+          <w:b w:val="0"/>
+          <w:i w:val="0"/>
+          <w:sz w:val="22"/>
+        </w:rPr>
+      </w:r>
+    </w:p>
+    <w:p>
+      <w:pPr>
+        <w:spacing w:before="80" w:after="40"/>
+        <w:jc w:val="left"/>
+      </w:pPr>
+      <w:r>
+        <w:rPr>
+          <w:rFonts w:ascii="Calibri" w:hAnsi="Calibri"/>
+          <w:b/>
+          <w:i w:val="0"/>
+          <w:color w:val="003366"/>
+          <w:sz w:val="21"/>
+        </w:rPr>
+        <w:t>4. Lãng phí Chuyển động (Motion Waste)</w:t>
+      </w:r>
+    </w:p>
+    <w:p>
+      <w:pPr>
+        <w:spacing w:before="0" w:after="40"/>
+        <w:jc w:val="left"/>
+      </w:pPr>
+      <w:r>
+        <w:rPr>
+          <w:rFonts w:ascii="Calibri" w:hAnsi="Calibri"/>
+          <w:b w:val="0"/>
+          <w:i w:val="0"/>
+          <w:sz w:val="20"/>
+        </w:rPr>
+        <w:t xml:space="preserve"> • Lãng phí gì: Shipper di chuyển nhiều quãng đường không tạo ra kết quả do khách hàng không có nhà, hẹn lại giờ hoặc không nghe máy.</w:t>
+      </w:r>
+    </w:p>
+    <w:p>
+      <w:pPr>
+        <w:spacing w:before="0" w:after="40"/>
+        <w:jc w:val="left"/>
+      </w:pPr>
+      <w:r>
+        <w:rPr>
+          <w:rFonts w:ascii="Calibri" w:hAnsi="Calibri"/>
+          <w:b w:val="0"/>
+          <w:i w:val="0"/>
+          <w:sz w:val="20"/>
+        </w:rPr>
+        <w:t xml:space="preserve"> • Nguyên nhân: Shipper không hẹn giờ trước qua ứng dụng hoặc hệ thống không tự động gửi thông báo thời gian Shipper sắp đến.</w:t>
+      </w:r>
+    </w:p>
+    <w:p>
+      <w:pPr>
+        <w:spacing w:before="0" w:after="40"/>
+        <w:jc w:val="left"/>
+      </w:pPr>
+      <w:r>
+        <w:rPr>
+          <w:rFonts w:ascii="Calibri" w:hAnsi="Calibri"/>
+          <w:b w:val="0"/>
+          <w:i w:val="0"/>
+          <w:sz w:val="20"/>
+        </w:rPr>
+        <w:t xml:space="preserve"> • Ảnh hưởng: Lãng phí công sức và thời gian của Shipper, giảm số lượng đơn thu hồi thành công trong ngày.</w:t>
+      </w:r>
+    </w:p>
+    <w:p>
+      <w:pPr>
+        <w:spacing w:before="0" w:after="40"/>
+        <w:jc w:val="left"/>
+      </w:pPr>
+      <w:r>
+        <w:rPr>
+          <w:rFonts w:ascii="Calibri" w:hAnsi="Calibri"/>
+          <w:b w:val="0"/>
+          <w:i w:val="0"/>
+          <w:sz w:val="20"/>
+        </w:rPr>
+        <w:t xml:space="preserve"> • Đề xuất cải tiến: Tích hợp tính năng "Hẹn giờ thu hồi" và tự động gửi thông báo Zalo ZNS / App Notification trước 30 phút cho khách hàng.</w:t>
+      </w:r>
+    </w:p>
+    <w:p>
+      <w:pPr>
+        <w:spacing w:before="0" w:after="80"/>
+        <w:jc w:val="left"/>
+      </w:pPr>
+      <w:r>
+        <w:rPr>
+          <w:rFonts w:ascii="Calibri" w:hAnsi="Calibri"/>
+          <w:b w:val="0"/>
+          <w:i w:val="0"/>
+          <w:sz w:val="22"/>
+        </w:rPr>
+      </w:r>
+    </w:p>
+    <w:p>
+      <w:pPr>
+        <w:spacing w:before="80" w:after="40"/>
+        <w:jc w:val="left"/>
+      </w:pPr>
+      <w:r>
+        <w:rPr>
+          <w:rFonts w:ascii="Calibri" w:hAnsi="Calibri"/>
+          <w:b/>
+          <w:i w:val="0"/>
+          <w:color w:val="003366"/>
+          <w:sz w:val="21"/>
+        </w:rPr>
+        <w:t>5. Lãng phí Tồn kho (Inventory Waste)</w:t>
+      </w:r>
+    </w:p>
+    <w:p>
+      <w:pPr>
+        <w:spacing w:before="0" w:after="40"/>
+        <w:jc w:val="left"/>
+      </w:pPr>
+      <w:r>
+        <w:rPr>
+          <w:rFonts w:ascii="Calibri" w:hAnsi="Calibri"/>
+          <w:b w:val="0"/>
+          <w:i w:val="0"/>
+          <w:sz w:val="20"/>
+        </w:rPr>
+        <w:t xml:space="preserve"> • Lãng phí gì: Hàng hoàn và hồ sơ khiếu nại tồn đọng số lượng lớn tại bưu cục/kho qua đêm hoặc nhiều ngày.</w:t>
+      </w:r>
+    </w:p>
+    <w:p>
+      <w:pPr>
+        <w:spacing w:before="0" w:after="40"/>
+        <w:jc w:val="left"/>
+      </w:pPr>
+      <w:r>
+        <w:rPr>
+          <w:rFonts w:ascii="Calibri" w:hAnsi="Calibri"/>
+          <w:b w:val="0"/>
+          <w:i w:val="0"/>
+          <w:sz w:val="20"/>
+        </w:rPr>
+        <w:t xml:space="preserve"> • Nguyên nhân: Thiếu bộ phận chuyên trách xử lý hàng hoàn tại kho; quy trình phê duyệt biên bản bất thường yêu cầu chữ ký viết tay của Trưởng bưu cục.</w:t>
+      </w:r>
+    </w:p>
+    <w:p>
+      <w:pPr>
+        <w:spacing w:before="0" w:after="40"/>
+        <w:jc w:val="left"/>
+      </w:pPr>
+      <w:r>
+        <w:rPr>
+          <w:rFonts w:ascii="Calibri" w:hAnsi="Calibri"/>
+          <w:b w:val="0"/>
+          <w:i w:val="0"/>
+          <w:sz w:val="20"/>
+        </w:rPr>
+        <w:t xml:space="preserve"> • Ảnh hưởng: Chiếm dụng diện tích kho bãi, làm tăng nguy cơ nhầm lẫn, thất lạc hàng hóa; đọng vốn của người gửi.</w:t>
+      </w:r>
+    </w:p>
+    <w:p>
+      <w:pPr>
+        <w:spacing w:before="0" w:after="40"/>
+        <w:jc w:val="left"/>
+      </w:pPr>
+      <w:r>
+        <w:rPr>
+          <w:rFonts w:ascii="Calibri" w:hAnsi="Calibri"/>
+          <w:b w:val="0"/>
+          <w:i w:val="0"/>
+          <w:sz w:val="20"/>
+        </w:rPr>
+        <w:t xml:space="preserve"> • Đề xuất cải tiến: Ký biên bản bất thường điện tử (e-Signature) ngay trên App Kho; quy định thời gian tối đa giải phóng hàng hoàn tại kho là 24h.</w:t>
+      </w:r>
+    </w:p>
+    <w:p>
+      <w:pPr>
+        <w:spacing w:before="0" w:after="80"/>
+        <w:jc w:val="left"/>
+      </w:pPr>
+      <w:r>
+        <w:rPr>
+          <w:rFonts w:ascii="Calibri" w:hAnsi="Calibri"/>
+          <w:b w:val="0"/>
+          <w:i w:val="0"/>
+          <w:sz w:val="22"/>
+        </w:rPr>
+      </w:r>
+    </w:p>
+    <w:p>
+      <w:pPr>
+        <w:spacing w:before="80" w:after="40"/>
+        <w:jc w:val="left"/>
+      </w:pPr>
+      <w:r>
+        <w:rPr>
+          <w:rFonts w:ascii="Calibri" w:hAnsi="Calibri"/>
+          <w:b/>
+          <w:i w:val="0"/>
+          <w:color w:val="003366"/>
+          <w:sz w:val="21"/>
+        </w:rPr>
+        <w:t>6. Lãng phí Xử lý quá mức (Over-processing Waste)</w:t>
+      </w:r>
+    </w:p>
+    <w:p>
+      <w:pPr>
+        <w:spacing w:before="0" w:after="40"/>
+        <w:jc w:val="left"/>
+      </w:pPr>
+      <w:r>
+        <w:rPr>
+          <w:rFonts w:ascii="Calibri" w:hAnsi="Calibri"/>
+          <w:b w:val="0"/>
+          <w:i w:val="0"/>
+          <w:sz w:val="20"/>
+        </w:rPr>
+        <w:t xml:space="preserve"> • Lãng phí gì: Thực hiện kiểm tra, đối chiếu thông tin đơn hàng nhiều lần ở cả khâu CSKH và khâu Bưu cục/Kho; lập cả biên bản giấy lẫn biên bản phần mềm.</w:t>
+      </w:r>
+    </w:p>
+    <w:p>
+      <w:pPr>
+        <w:spacing w:before="0" w:after="40"/>
+        <w:jc w:val="left"/>
+      </w:pPr>
+      <w:r>
+        <w:rPr>
+          <w:rFonts w:ascii="Calibri" w:hAnsi="Calibri"/>
+          <w:b w:val="0"/>
+          <w:i w:val="0"/>
+          <w:sz w:val="20"/>
+        </w:rPr>
+        <w:t xml:space="preserve"> • Nguyên nhân: Hệ thống phần mềm CSKH và phần mềm Quản lý Kho (WMS) chưa tích hợp dữ liệu thời gian thực (Real-time Integration).</w:t>
+      </w:r>
+    </w:p>
+    <w:p>
+      <w:pPr>
+        <w:spacing w:before="0" w:after="40"/>
+        <w:jc w:val="left"/>
+      </w:pPr>
+      <w:r>
+        <w:rPr>
+          <w:rFonts w:ascii="Calibri" w:hAnsi="Calibri"/>
+          <w:b w:val="0"/>
+          <w:i w:val="0"/>
+          <w:sz w:val="20"/>
+        </w:rPr>
+        <w:t xml:space="preserve"> • Ảnh hưởng: Nhân viên tốn thời gian nhập liệu trùng lặp; dễ xảy ra sai sót lệch dữ liệu giữa các phần mềm.</w:t>
+      </w:r>
+    </w:p>
+    <w:p>
+      <w:pPr>
+        <w:spacing w:before="0" w:after="40"/>
+        <w:jc w:val="left"/>
+      </w:pPr>
+      <w:r>
+        <w:rPr>
+          <w:rFonts w:ascii="Calibri" w:hAnsi="Calibri"/>
+          <w:b w:val="0"/>
+          <w:i w:val="0"/>
+          <w:sz w:val="20"/>
+        </w:rPr>
+        <w:t xml:space="preserve"> • Đề xuất cải tiến: Đồng bộ hóa dữ liệu tập trung (Centralized Database) giữa CSKH và WMS, kho quét mã vạch barcode/QR code là hệ thống tự động kiểm tra đối chiếu.</w:t>
+      </w:r>
+    </w:p>
+    <w:p>
+      <w:pPr>
+        <w:spacing w:before="0" w:after="80"/>
+        <w:jc w:val="left"/>
+      </w:pPr>
+      <w:r>
+        <w:rPr>
+          <w:rFonts w:ascii="Calibri" w:hAnsi="Calibri"/>
+          <w:b w:val="0"/>
+          <w:i w:val="0"/>
+          <w:sz w:val="22"/>
+        </w:rPr>
+      </w:r>
+    </w:p>
+    <w:p>
+      <w:pPr>
+        <w:spacing w:before="80" w:after="40"/>
+        <w:jc w:val="left"/>
+      </w:pPr>
+      <w:r>
+        <w:rPr>
+          <w:rFonts w:ascii="Calibri" w:hAnsi="Calibri"/>
+          <w:b/>
+          <w:i w:val="0"/>
+          <w:color w:val="003366"/>
+          <w:sz w:val="21"/>
+        </w:rPr>
+        <w:t>7. Lãng phí Xử lý quá thừa (Over-production Waste)</w:t>
+      </w:r>
+    </w:p>
+    <w:p>
+      <w:pPr>
+        <w:spacing w:before="0" w:after="40"/>
+        <w:jc w:val="left"/>
+      </w:pPr>
+      <w:r>
+        <w:rPr>
+          <w:rFonts w:ascii="Calibri" w:hAnsi="Calibri"/>
+          <w:b w:val="0"/>
+          <w:i w:val="0"/>
+          <w:sz w:val="20"/>
+        </w:rPr>
+        <w:t xml:space="preserve"> • Lãng phí gì: Tiếp nhận và tạo hồ sơ xử lý cho các yêu cầu không đủ điều kiện (ví dụ quá hạn đổi trả, sản phẩm không mua từ Viettel Post).</w:t>
+      </w:r>
+    </w:p>
+    <w:p>
+      <w:pPr>
+        <w:spacing w:before="0" w:after="40"/>
+        <w:jc w:val="left"/>
+      </w:pPr>
+      <w:r>
+        <w:rPr>
+          <w:rFonts w:ascii="Calibri" w:hAnsi="Calibri"/>
+          <w:b w:val="0"/>
+          <w:i w:val="0"/>
+          <w:sz w:val="20"/>
+        </w:rPr>
+        <w:t xml:space="preserve"> • Nguyên nhân: Thiếu bộ lọc tự động kiểm tra điều kiện ngay tại khâu khách hàng bấm gửi yêu cầu trên App.</w:t>
+      </w:r>
+    </w:p>
+    <w:p>
+      <w:pPr>
+        <w:spacing w:before="0" w:after="40"/>
+        <w:jc w:val="left"/>
+      </w:pPr>
+      <w:r>
+        <w:rPr>
+          <w:rFonts w:ascii="Calibri" w:hAnsi="Calibri"/>
+          <w:b w:val="0"/>
+          <w:i w:val="0"/>
+          <w:sz w:val="20"/>
+        </w:rPr>
+        <w:t xml:space="preserve"> • Ảnh hưởng: CSKH mất thời gian tiếp nhận, kiểm tra rồi mới từ chối, gây lãng phí tài nguyên hệ thống.</w:t>
+      </w:r>
+    </w:p>
+    <w:p>
+      <w:pPr>
+        <w:spacing w:before="0" w:after="40"/>
+        <w:jc w:val="left"/>
+      </w:pPr>
+      <w:r>
+        <w:rPr>
+          <w:rFonts w:ascii="Calibri" w:hAnsi="Calibri"/>
+          <w:b w:val="0"/>
+          <w:i w:val="0"/>
+          <w:sz w:val="20"/>
+        </w:rPr>
+        <w:t xml:space="preserve"> • Đề xuất cải tiến: Thêm bước tự động kiểm tra điều kiện (Auto-validation) dựa trên lịch sử đơn hàng trước khi cho phép khách hàng gửi yêu cầu đổi/trả.</w:t>
+      </w:r>
+    </w:p>
+    <w:p>
+      <w:pPr>
+        <w:spacing w:before="0" w:after="80"/>
+        <w:jc w:val="left"/>
+      </w:pPr>
+      <w:r>
+        <w:rPr>
+          <w:rFonts w:ascii="Calibri" w:hAnsi="Calibri"/>
+          <w:b w:val="0"/>
+          <w:i w:val="0"/>
+          <w:sz w:val="22"/>
+        </w:rPr>
+      </w:r>
+    </w:p>
+    <w:p>
+      <w:pPr>
+        <w:spacing w:before="120" w:after="80"/>
+        <w:jc w:val="left"/>
+      </w:pPr>
+      <w:r>
+        <w:rPr>
+          <w:rFonts w:ascii="Calibri" w:hAnsi="Calibri"/>
+          <w:b/>
+          <w:i/>
+          <w:sz w:val="22"/>
+        </w:rPr>
+        <w:t>c. Sơ đồ phân tích nguyên nhân gốc rễ (Why-Why Analysis / 5 Whys)</w:t>
+      </w:r>
+    </w:p>
+    <w:p>
+      <w:pPr>
+        <w:spacing w:before="0" w:after="120"/>
+        <w:jc w:val="left"/>
+      </w:pPr>
+      <w:r>
+        <w:rPr>
+          <w:rFonts w:ascii="Calibri" w:hAnsi="Calibri"/>
+          <w:b w:val="0"/>
+          <w:i w:val="0"/>
+          <w:sz w:val="22"/>
+        </w:rPr>
+        <w:t>Để xác định nguyên nhân cốt lõi gây ra các lãng phí chính trong quy trình, phương pháp phân tích Why-Why (5 Whys) được áp dụng cho 3 vấn đề trọng yếu nhất:</w:t>
       </w:r>
     </w:p>
     <w:tbl>
       <w:tblPr>
         <w:tblStyle w:val="TableGrid"/>
-        <w:tblW w:w="9350" w:type="dxa"/>
-        <w:tblLayout w:type="fixed"/>
-        <w:tblLook w:val="04A0" w:firstRow="1" w:lastRow="0" w:firstColumn="1" w:lastColumn="0" w:noHBand="0" w:noVBand="1"/>
+        <w:tblW w:type="auto" w:w="0"/>
+        <w:jc w:val="center"/>
+        <w:tblLook w:firstColumn="1" w:firstRow="1" w:lastColumn="0" w:lastRow="0" w:noHBand="0" w:noVBand="1" w:val="04A0"/>
       </w:tblPr>
       <w:tblGrid>
-        <w:gridCol w:w="2333"/>
-        <w:gridCol w:w="7017"/>
+        <w:gridCol w:w="2340"/>
+        <w:gridCol w:w="2340"/>
+        <w:gridCol w:w="2340"/>
+        <w:gridCol w:w="2340"/>
       </w:tblGrid>
       <w:tr>
-        <w:trPr>
-          <w:trHeight w:val="503"/>
-        </w:trPr>
-        <w:tc>
-          <w:tcPr>
-            <w:tcW w:w="2333" w:type="dxa"/>
-            <w:vAlign w:val="center"/>
-          </w:tcPr>
-          <w:p>
-            <w:pPr>
-              <w:spacing w:after="0" w:line="240" w:lineRule="auto"/>
-              <w:rPr>
-                <w:rFonts w:ascii="Times New Roman" w:hAnsi="Times New Roman" w:cs="Times New Roman"/>
-                <w:b/>
-                <w:bCs/>
-                <w:sz w:val="26"/>
-                <w:szCs w:val="26"/>
-              </w:rPr>
-            </w:pPr>
-            <w:r>
-              <w:rPr>
-                <w:rFonts w:ascii="Times New Roman" w:eastAsia="Aptos" w:hAnsi="Times New Roman" w:cs="Times New Roman"/>
-                <w:b/>
-                <w:bCs/>
-              </w:rPr>
-              <w:t>Loại lãng phí</w:t>
-            </w:r>
-          </w:p>
-        </w:tc>
-        <w:tc>
-          <w:tcPr>
-            <w:tcW w:w="7017" w:type="dxa"/>
-            <w:vAlign w:val="center"/>
-          </w:tcPr>
-          <w:p>
-            <w:pPr>
-              <w:spacing w:after="0" w:line="240" w:lineRule="auto"/>
-              <w:rPr>
-                <w:rFonts w:ascii="Times New Roman" w:hAnsi="Times New Roman" w:cs="Times New Roman"/>
-                <w:b/>
-                <w:bCs/>
-                <w:sz w:val="26"/>
-                <w:szCs w:val="26"/>
-              </w:rPr>
-            </w:pPr>
-            <w:r>
-              <w:rPr>
-                <w:rFonts w:ascii="Times New Roman" w:eastAsia="Aptos" w:hAnsi="Times New Roman" w:cs="Times New Roman"/>
-                <w:b/>
-                <w:bCs/>
-              </w:rPr>
-              <w:t>Ví dụ trong quy trình</w:t>
+        <w:tc>
+          <w:tcPr>
+            <w:tcW w:type="dxa" w:w="1872"/>
+            <w:shd w:fill="003366"/>
+          </w:tcPr>
+          <w:p>
+            <w:pPr>
+              <w:jc w:val="center"/>
+            </w:pPr>
+            <w:r>
+              <w:rPr>
+                <w:rFonts w:ascii="Calibri" w:hAnsi="Calibri"/>
+                <w:b/>
+                <w:color w:val="FFFFFF"/>
+                <w:sz w:val="20"/>
+              </w:rPr>
+              <w:t>Cấp độ (Why Level)</w:t>
+            </w:r>
+          </w:p>
+        </w:tc>
+        <w:tc>
+          <w:tcPr>
+            <w:tcW w:type="dxa" w:w="2448"/>
+            <w:shd w:fill="003366"/>
+          </w:tcPr>
+          <w:p>
+            <w:pPr>
+              <w:jc w:val="center"/>
+            </w:pPr>
+            <w:r>
+              <w:rPr>
+                <w:rFonts w:ascii="Calibri" w:hAnsi="Calibri"/>
+                <w:b/>
+                <w:color w:val="FFFFFF"/>
+                <w:sz w:val="20"/>
+              </w:rPr>
+              <w:t>Vấn đề 1: Thời gian xử lý kéo dài (Waiting)</w:t>
+            </w:r>
+          </w:p>
+        </w:tc>
+        <w:tc>
+          <w:tcPr>
+            <w:tcW w:type="dxa" w:w="2448"/>
+            <w:shd w:fill="003366"/>
+          </w:tcPr>
+          <w:p>
+            <w:pPr>
+              <w:jc w:val="center"/>
+            </w:pPr>
+            <w:r>
+              <w:rPr>
+                <w:rFonts w:ascii="Calibri" w:hAnsi="Calibri"/>
+                <w:b/>
+                <w:color w:val="FFFFFF"/>
+                <w:sz w:val="20"/>
+              </w:rPr>
+              <w:t>Vấn đề 2: Tỷ lệ thiếu chứng từ cao (Defects)</w:t>
+            </w:r>
+          </w:p>
+        </w:tc>
+        <w:tc>
+          <w:tcPr>
+            <w:tcW w:type="dxa" w:w="2592"/>
+            <w:shd w:fill="003366"/>
+          </w:tcPr>
+          <w:p>
+            <w:pPr>
+              <w:jc w:val="center"/>
+            </w:pPr>
+            <w:r>
+              <w:rPr>
+                <w:rFonts w:ascii="Calibri" w:hAnsi="Calibri"/>
+                <w:b/>
+                <w:color w:val="FFFFFF"/>
+                <w:sz w:val="20"/>
+              </w:rPr>
+              <w:t>Vấn đề 3: Hàng tồn đọng lâu tại kho (Inventory)</w:t>
             </w:r>
           </w:p>
         </w:tc>
       </w:tr>
       <w:tr>
-        <w:trPr>
-          <w:trHeight w:val="755"/>
-        </w:trPr>
-        <w:tc>
-          <w:tcPr>
-            <w:tcW w:w="2333" w:type="dxa"/>
-            <w:vAlign w:val="center"/>
-          </w:tcPr>
-          <w:p>
-            <w:pPr>
-              <w:spacing w:after="0" w:line="240" w:lineRule="auto"/>
-              <w:rPr>
-                <w:rFonts w:ascii="Times New Roman" w:hAnsi="Times New Roman" w:cs="Times New Roman"/>
-                <w:b/>
-                <w:bCs/>
-                <w:sz w:val="26"/>
-                <w:szCs w:val="26"/>
-              </w:rPr>
-            </w:pPr>
-            <w:r>
-              <w:rPr>
-                <w:rStyle w:val="Strong"/>
-                <w:rFonts w:ascii="Times New Roman" w:eastAsia="Aptos" w:hAnsi="Times New Roman" w:cs="Times New Roman"/>
-              </w:rPr>
-              <w:t>Hold</w:t>
-            </w:r>
-          </w:p>
-        </w:tc>
-        <w:tc>
-          <w:tcPr>
-            <w:tcW w:w="7017" w:type="dxa"/>
-            <w:vAlign w:val="center"/>
-          </w:tcPr>
-          <w:p>
-            <w:pPr>
-              <w:spacing w:after="0" w:line="240" w:lineRule="auto"/>
-              <w:rPr>
-                <w:rFonts w:ascii="Times New Roman" w:hAnsi="Times New Roman" w:cs="Times New Roman"/>
-                <w:b/>
-                <w:bCs/>
-                <w:sz w:val="26"/>
-                <w:szCs w:val="26"/>
-              </w:rPr>
-            </w:pPr>
-            <w:r>
-              <w:rPr>
-                <w:rFonts w:ascii="Times New Roman" w:eastAsia="Aptos" w:hAnsi="Times New Roman" w:cs="Times New Roman"/>
-              </w:rPr>
-              <w:t>Chờ khách hàng bổ sung thông tin hoặc chứng từ; chờ xác minh từ bưu cục, kho hoặc shipper trước khi xử lý.</w:t>
+        <w:tc>
+          <w:tcPr>
+            <w:tcW w:type="dxa" w:w="1872"/>
+            <w:shd w:fill="FFFFFF"/>
+          </w:tcPr>
+          <w:p>
+            <w:pPr>
+              <w:spacing w:before="40" w:after="40"/>
+            </w:pPr>
+            <w:r>
+              <w:rPr>
+                <w:rFonts w:ascii="Calibri" w:hAnsi="Calibri"/>
+                <w:sz w:val="19"/>
+              </w:rPr>
+              <w:t>Vấn đề ban đầu</w:t>
+            </w:r>
+          </w:p>
+        </w:tc>
+        <w:tc>
+          <w:tcPr>
+            <w:tcW w:type="dxa" w:w="2448"/>
+            <w:shd w:fill="FFFFFF"/>
+          </w:tcPr>
+          <w:p>
+            <w:pPr>
+              <w:spacing w:before="40" w:after="40"/>
+            </w:pPr>
+            <w:r>
+              <w:rPr>
+                <w:rFonts w:ascii="Calibri" w:hAnsi="Calibri"/>
+                <w:sz w:val="19"/>
+              </w:rPr>
+              <w:t>Thời gian xử lý hoàn trả &amp; khiếu nại kéo dài (5-7 ngày).</w:t>
+            </w:r>
+          </w:p>
+        </w:tc>
+        <w:tc>
+          <w:tcPr>
+            <w:tcW w:type="dxa" w:w="2448"/>
+            <w:shd w:fill="FFFFFF"/>
+          </w:tcPr>
+          <w:p>
+            <w:pPr>
+              <w:spacing w:before="40" w:after="40"/>
+              <w:jc w:val="center"/>
+            </w:pPr>
+            <w:r>
+              <w:rPr>
+                <w:rFonts w:ascii="Calibri" w:hAnsi="Calibri"/>
+                <w:sz w:val="19"/>
+              </w:rPr>
+              <w:t>35% yêu cầu gửi về bị thiếu chứng từ, phải làm lại.</w:t>
+            </w:r>
+          </w:p>
+        </w:tc>
+        <w:tc>
+          <w:tcPr>
+            <w:tcW w:type="dxa" w:w="2592"/>
+            <w:shd w:fill="FFFFFF"/>
+          </w:tcPr>
+          <w:p>
+            <w:pPr>
+              <w:spacing w:before="40" w:after="40"/>
+            </w:pPr>
+            <w:r>
+              <w:rPr>
+                <w:rFonts w:ascii="Calibri" w:hAnsi="Calibri"/>
+                <w:sz w:val="19"/>
+              </w:rPr>
+              <w:t>Hàng hoàn tồn đọng tại bưu cục/kho 3-4 ngày.</w:t>
             </w:r>
           </w:p>
         </w:tc>
@@ -2399,50 +3819,74 @@
       <w:tr>
         <w:tc>
           <w:tcPr>
-            <w:tcW w:w="2333" w:type="dxa"/>
-            <w:vAlign w:val="center"/>
-          </w:tcPr>
-          <w:p>
-            <w:pPr>
-              <w:spacing w:after="0" w:line="240" w:lineRule="auto"/>
-              <w:rPr>
-                <w:rFonts w:ascii="Times New Roman" w:hAnsi="Times New Roman" w:cs="Times New Roman"/>
-                <w:b/>
-                <w:bCs/>
-                <w:sz w:val="26"/>
-                <w:szCs w:val="26"/>
-              </w:rPr>
-            </w:pPr>
-            <w:r>
-              <w:rPr>
-                <w:rStyle w:val="Strong"/>
-                <w:rFonts w:ascii="Times New Roman" w:eastAsia="Aptos" w:hAnsi="Times New Roman" w:cs="Times New Roman"/>
-              </w:rPr>
-              <w:t>Move</w:t>
-            </w:r>
-          </w:p>
-        </w:tc>
-        <w:tc>
-          <w:tcPr>
-            <w:tcW w:w="7017" w:type="dxa"/>
-            <w:vAlign w:val="center"/>
-          </w:tcPr>
-          <w:p>
-            <w:pPr>
-              <w:spacing w:after="0" w:line="240" w:lineRule="auto"/>
-              <w:rPr>
-                <w:rFonts w:ascii="Times New Roman" w:hAnsi="Times New Roman" w:cs="Times New Roman"/>
-                <w:b/>
-                <w:bCs/>
-                <w:sz w:val="26"/>
-                <w:szCs w:val="26"/>
-              </w:rPr>
-            </w:pPr>
-            <w:r>
-              <w:rPr>
-                <w:rFonts w:ascii="Times New Roman" w:eastAsia="Aptos" w:hAnsi="Times New Roman" w:cs="Times New Roman"/>
-              </w:rPr>
-              <w:t>Shipper phải di chuyển đến địa chỉ khách hàng để thu hồi hàng và vận chuyển về bưu cục hoặc kho.</w:t>
+            <w:tcW w:type="dxa" w:w="1872"/>
+            <w:shd w:fill="F0F4F8"/>
+          </w:tcPr>
+          <w:p>
+            <w:pPr>
+              <w:spacing w:before="40" w:after="40"/>
+            </w:pPr>
+            <w:r>
+              <w:rPr>
+                <w:rFonts w:ascii="Calibri" w:hAnsi="Calibri"/>
+                <w:sz w:val="19"/>
+              </w:rPr>
+              <w:t>Why 1 (Tại sao?)</w:t>
+            </w:r>
+          </w:p>
+        </w:tc>
+        <w:tc>
+          <w:tcPr>
+            <w:tcW w:type="dxa" w:w="2448"/>
+            <w:shd w:fill="F0F4F8"/>
+          </w:tcPr>
+          <w:p>
+            <w:pPr>
+              <w:spacing w:before="40" w:after="40"/>
+            </w:pPr>
+            <w:r>
+              <w:rPr>
+                <w:rFonts w:ascii="Calibri" w:hAnsi="Calibri"/>
+                <w:sz w:val="19"/>
+              </w:rPr>
+              <w:t>Hồ sơ bị ngâm chờ xác minh giữa CSKH và Kho.</w:t>
+            </w:r>
+          </w:p>
+        </w:tc>
+        <w:tc>
+          <w:tcPr>
+            <w:tcW w:type="dxa" w:w="2448"/>
+            <w:shd w:fill="F0F4F8"/>
+          </w:tcPr>
+          <w:p>
+            <w:pPr>
+              <w:spacing w:before="40" w:after="40"/>
+              <w:jc w:val="center"/>
+            </w:pPr>
+            <w:r>
+              <w:rPr>
+                <w:rFonts w:ascii="Calibri" w:hAnsi="Calibri"/>
+                <w:sz w:val="19"/>
+              </w:rPr>
+              <w:t>Khách hàng không tải lên đủ ảnh chụp &amp; chứng từ khi tạo đơn.</w:t>
+            </w:r>
+          </w:p>
+        </w:tc>
+        <w:tc>
+          <w:tcPr>
+            <w:tcW w:type="dxa" w:w="2592"/>
+            <w:shd w:fill="F0F4F8"/>
+          </w:tcPr>
+          <w:p>
+            <w:pPr>
+              <w:spacing w:before="40" w:after="40"/>
+            </w:pPr>
+            <w:r>
+              <w:rPr>
+                <w:rFonts w:ascii="Calibri" w:hAnsi="Calibri"/>
+                <w:sz w:val="19"/>
+              </w:rPr>
+              <w:t>Nhân viên kho chờ biên bản bất thường được ký duyệt.</w:t>
             </w:r>
           </w:p>
         </w:tc>
@@ -2450,50 +3894,74 @@
       <w:tr>
         <w:tc>
           <w:tcPr>
-            <w:tcW w:w="2333" w:type="dxa"/>
-            <w:vAlign w:val="center"/>
-          </w:tcPr>
-          <w:p>
-            <w:pPr>
-              <w:spacing w:after="0" w:line="240" w:lineRule="auto"/>
-              <w:rPr>
-                <w:rFonts w:ascii="Times New Roman" w:hAnsi="Times New Roman" w:cs="Times New Roman"/>
-                <w:b/>
-                <w:bCs/>
-                <w:sz w:val="26"/>
-                <w:szCs w:val="26"/>
-              </w:rPr>
-            </w:pPr>
-            <w:r>
-              <w:rPr>
-                <w:rStyle w:val="Strong"/>
-                <w:rFonts w:ascii="Times New Roman" w:eastAsia="Aptos" w:hAnsi="Times New Roman" w:cs="Times New Roman"/>
-              </w:rPr>
-              <w:t>Transportation</w:t>
-            </w:r>
-          </w:p>
-        </w:tc>
-        <w:tc>
-          <w:tcPr>
-            <w:tcW w:w="7017" w:type="dxa"/>
-            <w:vAlign w:val="center"/>
-          </w:tcPr>
-          <w:p>
-            <w:pPr>
-              <w:spacing w:after="0" w:line="240" w:lineRule="auto"/>
-              <w:rPr>
-                <w:rFonts w:ascii="Times New Roman" w:hAnsi="Times New Roman" w:cs="Times New Roman"/>
-                <w:b/>
-                <w:bCs/>
-                <w:sz w:val="26"/>
-                <w:szCs w:val="26"/>
-              </w:rPr>
-            </w:pPr>
-            <w:r>
-              <w:rPr>
-                <w:rFonts w:ascii="Times New Roman" w:eastAsia="Aptos" w:hAnsi="Times New Roman" w:cs="Times New Roman"/>
-              </w:rPr>
-              <w:t>Hàng hoàn được vận chuyển qua nhiều điểm trước khi trả lại cho người gửi hoặc chuyển sang bộ phận xử lý.</w:t>
+            <w:tcW w:type="dxa" w:w="1872"/>
+            <w:shd w:fill="FFFFFF"/>
+          </w:tcPr>
+          <w:p>
+            <w:pPr>
+              <w:spacing w:before="40" w:after="40"/>
+            </w:pPr>
+            <w:r>
+              <w:rPr>
+                <w:rFonts w:ascii="Calibri" w:hAnsi="Calibri"/>
+                <w:sz w:val="19"/>
+              </w:rPr>
+              <w:t>Why 2 (Tại sao?)</w:t>
+            </w:r>
+          </w:p>
+        </w:tc>
+        <w:tc>
+          <w:tcPr>
+            <w:tcW w:type="dxa" w:w="2448"/>
+            <w:shd w:fill="FFFFFF"/>
+          </w:tcPr>
+          <w:p>
+            <w:pPr>
+              <w:spacing w:before="40" w:after="40"/>
+            </w:pPr>
+            <w:r>
+              <w:rPr>
+                <w:rFonts w:ascii="Calibri" w:hAnsi="Calibri"/>
+                <w:sz w:val="19"/>
+              </w:rPr>
+              <w:t>CSKH không truy cập được dữ liệu hàng thực tế tại kho.</w:t>
+            </w:r>
+          </w:p>
+        </w:tc>
+        <w:tc>
+          <w:tcPr>
+            <w:tcW w:type="dxa" w:w="2448"/>
+            <w:shd w:fill="FFFFFF"/>
+          </w:tcPr>
+          <w:p>
+            <w:pPr>
+              <w:spacing w:before="40" w:after="40"/>
+              <w:jc w:val="center"/>
+            </w:pPr>
+            <w:r>
+              <w:rPr>
+                <w:rFonts w:ascii="Calibri" w:hAnsi="Calibri"/>
+                <w:sz w:val="19"/>
+              </w:rPr>
+              <w:t>Form đăng ký trên App không bắt buộc đính kèm ảnh chụp.</w:t>
+            </w:r>
+          </w:p>
+        </w:tc>
+        <w:tc>
+          <w:tcPr>
+            <w:tcW w:type="dxa" w:w="2592"/>
+            <w:shd w:fill="FFFFFF"/>
+          </w:tcPr>
+          <w:p>
+            <w:pPr>
+              <w:spacing w:before="40" w:after="40"/>
+            </w:pPr>
+            <w:r>
+              <w:rPr>
+                <w:rFonts w:ascii="Calibri" w:hAnsi="Calibri"/>
+                <w:sz w:val="19"/>
+              </w:rPr>
+              <w:t>Phải chờ Trưởng bưu cục ký tay trực tiếp trên biên bản giấy.</w:t>
             </w:r>
           </w:p>
         </w:tc>
@@ -2501,50 +3969,74 @@
       <w:tr>
         <w:tc>
           <w:tcPr>
-            <w:tcW w:w="2333" w:type="dxa"/>
-            <w:vAlign w:val="center"/>
-          </w:tcPr>
-          <w:p>
-            <w:pPr>
-              <w:spacing w:after="0" w:line="240" w:lineRule="auto"/>
-              <w:rPr>
-                <w:rFonts w:ascii="Times New Roman" w:hAnsi="Times New Roman" w:cs="Times New Roman"/>
-                <w:b/>
-                <w:bCs/>
-                <w:sz w:val="26"/>
-                <w:szCs w:val="26"/>
-              </w:rPr>
-            </w:pPr>
-            <w:r>
-              <w:rPr>
-                <w:rStyle w:val="Strong"/>
-                <w:rFonts w:ascii="Times New Roman" w:eastAsia="Aptos" w:hAnsi="Times New Roman" w:cs="Times New Roman"/>
-              </w:rPr>
-              <w:t>Over-do</w:t>
-            </w:r>
-          </w:p>
-        </w:tc>
-        <w:tc>
-          <w:tcPr>
-            <w:tcW w:w="7017" w:type="dxa"/>
-            <w:vAlign w:val="center"/>
-          </w:tcPr>
-          <w:p>
-            <w:pPr>
-              <w:spacing w:after="0" w:line="240" w:lineRule="auto"/>
-              <w:rPr>
-                <w:rFonts w:ascii="Times New Roman" w:hAnsi="Times New Roman" w:cs="Times New Roman"/>
-                <w:b/>
-                <w:bCs/>
-                <w:sz w:val="26"/>
-                <w:szCs w:val="26"/>
-              </w:rPr>
-            </w:pPr>
-            <w:r>
-              <w:rPr>
-                <w:rFonts w:ascii="Times New Roman" w:eastAsia="Aptos" w:hAnsi="Times New Roman" w:cs="Times New Roman"/>
-              </w:rPr>
-              <w:t>Kiểm tra, đối chiếu hoặc cập nhật thông tin nhiều lần giữa các bộ phận và hệ thống.</w:t>
+            <w:tcW w:type="dxa" w:w="1872"/>
+            <w:shd w:fill="F0F4F8"/>
+          </w:tcPr>
+          <w:p>
+            <w:pPr>
+              <w:spacing w:before="40" w:after="40"/>
+            </w:pPr>
+            <w:r>
+              <w:rPr>
+                <w:rFonts w:ascii="Calibri" w:hAnsi="Calibri"/>
+                <w:sz w:val="19"/>
+              </w:rPr>
+              <w:t>Why 3 (Tại sao?)</w:t>
+            </w:r>
+          </w:p>
+        </w:tc>
+        <w:tc>
+          <w:tcPr>
+            <w:tcW w:type="dxa" w:w="2448"/>
+            <w:shd w:fill="F0F4F8"/>
+          </w:tcPr>
+          <w:p>
+            <w:pPr>
+              <w:spacing w:before="40" w:after="40"/>
+            </w:pPr>
+            <w:r>
+              <w:rPr>
+                <w:rFonts w:ascii="Calibri" w:hAnsi="Calibri"/>
+                <w:sz w:val="19"/>
+              </w:rPr>
+              <w:t>Dữ liệu phần mềm CSKH và phần mềm WMS độc lập.</w:t>
+            </w:r>
+          </w:p>
+        </w:tc>
+        <w:tc>
+          <w:tcPr>
+            <w:tcW w:type="dxa" w:w="2448"/>
+            <w:shd w:fill="F0F4F8"/>
+          </w:tcPr>
+          <w:p>
+            <w:pPr>
+              <w:spacing w:before="40" w:after="40"/>
+              <w:jc w:val="center"/>
+            </w:pPr>
+            <w:r>
+              <w:rPr>
+                <w:rFonts w:ascii="Calibri" w:hAnsi="Calibri"/>
+                <w:sz w:val="19"/>
+              </w:rPr>
+              <w:t>Thiết kế ban đầu muốn đơn giản hóa thao tác tạo đơn.</w:t>
+            </w:r>
+          </w:p>
+        </w:tc>
+        <w:tc>
+          <w:tcPr>
+            <w:tcW w:type="dxa" w:w="2592"/>
+            <w:shd w:fill="F0F4F8"/>
+          </w:tcPr>
+          <w:p>
+            <w:pPr>
+              <w:spacing w:before="40" w:after="40"/>
+            </w:pPr>
+            <w:r>
+              <w:rPr>
+                <w:rFonts w:ascii="Calibri" w:hAnsi="Calibri"/>
+                <w:sz w:val="19"/>
+              </w:rPr>
+              <w:t>Quy định nội bộ chưa chấp nhận chữ ký số/xác nhận trên App Kho.</w:t>
             </w:r>
           </w:p>
         </w:tc>
@@ -2552,50 +4044,74 @@
       <w:tr>
         <w:tc>
           <w:tcPr>
-            <w:tcW w:w="2333" w:type="dxa"/>
-            <w:vAlign w:val="center"/>
-          </w:tcPr>
-          <w:p>
-            <w:pPr>
-              <w:spacing w:after="0" w:line="240" w:lineRule="auto"/>
-              <w:rPr>
-                <w:rFonts w:ascii="Times New Roman" w:hAnsi="Times New Roman" w:cs="Times New Roman"/>
-                <w:b/>
-                <w:bCs/>
-                <w:sz w:val="26"/>
-                <w:szCs w:val="26"/>
-              </w:rPr>
-            </w:pPr>
-            <w:r>
-              <w:rPr>
-                <w:rStyle w:val="Strong"/>
-                <w:rFonts w:ascii="Times New Roman" w:eastAsia="Aptos" w:hAnsi="Times New Roman" w:cs="Times New Roman"/>
-              </w:rPr>
-              <w:t>Defect</w:t>
-            </w:r>
-          </w:p>
-        </w:tc>
-        <w:tc>
-          <w:tcPr>
-            <w:tcW w:w="7017" w:type="dxa"/>
-            <w:vAlign w:val="center"/>
-          </w:tcPr>
-          <w:p>
-            <w:pPr>
-              <w:spacing w:after="0" w:line="240" w:lineRule="auto"/>
-              <w:rPr>
-                <w:rFonts w:ascii="Times New Roman" w:hAnsi="Times New Roman" w:cs="Times New Roman"/>
-                <w:b/>
-                <w:bCs/>
-                <w:sz w:val="26"/>
-                <w:szCs w:val="26"/>
-              </w:rPr>
-            </w:pPr>
-            <w:r>
-              <w:rPr>
-                <w:rFonts w:ascii="Times New Roman" w:eastAsia="Aptos" w:hAnsi="Times New Roman" w:cs="Times New Roman"/>
-              </w:rPr>
-              <w:t>Sai thông tin đơn hàng, sai mã vận đơn hoặc xác minh chưa chính xác dẫn đến phải xử lý lại.</w:t>
+            <w:tcW w:type="dxa" w:w="1872"/>
+            <w:shd w:fill="FFFFFF"/>
+          </w:tcPr>
+          <w:p>
+            <w:pPr>
+              <w:spacing w:before="40" w:after="40"/>
+            </w:pPr>
+            <w:r>
+              <w:rPr>
+                <w:rFonts w:ascii="Calibri" w:hAnsi="Calibri"/>
+                <w:sz w:val="19"/>
+              </w:rPr>
+              <w:t>Why 4 (Tại sao?)</w:t>
+            </w:r>
+          </w:p>
+        </w:tc>
+        <w:tc>
+          <w:tcPr>
+            <w:tcW w:type="dxa" w:w="2448"/>
+            <w:shd w:fill="FFFFFF"/>
+          </w:tcPr>
+          <w:p>
+            <w:pPr>
+              <w:spacing w:before="40" w:after="40"/>
+            </w:pPr>
+            <w:r>
+              <w:rPr>
+                <w:rFonts w:ascii="Calibri" w:hAnsi="Calibri"/>
+                <w:sz w:val="19"/>
+              </w:rPr>
+              <w:t>Chưa xây dựng API kết nối đồng bộ dữ liệu thời gian thực.</w:t>
+            </w:r>
+          </w:p>
+        </w:tc>
+        <w:tc>
+          <w:tcPr>
+            <w:tcW w:type="dxa" w:w="2448"/>
+            <w:shd w:fill="FFFFFF"/>
+          </w:tcPr>
+          <w:p>
+            <w:pPr>
+              <w:spacing w:before="40" w:after="40"/>
+              <w:jc w:val="center"/>
+            </w:pPr>
+            <w:r>
+              <w:rPr>
+                <w:rFonts w:ascii="Calibri" w:hAnsi="Calibri"/>
+                <w:sz w:val="19"/>
+              </w:rPr>
+              <w:t>Thiếu hướng dẫn chi tiết và minh họa mẫu chứng từ trên App.</w:t>
+            </w:r>
+          </w:p>
+        </w:tc>
+        <w:tc>
+          <w:tcPr>
+            <w:tcW w:type="dxa" w:w="2592"/>
+            <w:shd w:fill="FFFFFF"/>
+          </w:tcPr>
+          <w:p>
+            <w:pPr>
+              <w:spacing w:before="40" w:after="40"/>
+            </w:pPr>
+            <w:r>
+              <w:rPr>
+                <w:rFonts w:ascii="Calibri" w:hAnsi="Calibri"/>
+                <w:sz w:val="19"/>
+              </w:rPr>
+              <w:t>Quy trình nghiệp vụ cũ chưa được rà soát và tái thiết kế (BPR).</w:t>
             </w:r>
           </w:p>
         </w:tc>
@@ -2603,50 +4119,74 @@
       <w:tr>
         <w:tc>
           <w:tcPr>
-            <w:tcW w:w="2333" w:type="dxa"/>
-            <w:vAlign w:val="center"/>
-          </w:tcPr>
-          <w:p>
-            <w:pPr>
-              <w:spacing w:after="0" w:line="240" w:lineRule="auto"/>
-              <w:rPr>
-                <w:rFonts w:ascii="Times New Roman" w:hAnsi="Times New Roman" w:cs="Times New Roman"/>
-                <w:b/>
-                <w:bCs/>
-                <w:sz w:val="26"/>
-                <w:szCs w:val="26"/>
-              </w:rPr>
-            </w:pPr>
-            <w:r>
-              <w:rPr>
-                <w:rStyle w:val="Strong"/>
-                <w:rFonts w:ascii="Times New Roman" w:eastAsia="Aptos" w:hAnsi="Times New Roman" w:cs="Times New Roman"/>
-              </w:rPr>
-              <w:t>Inventory</w:t>
-            </w:r>
-          </w:p>
-        </w:tc>
-        <w:tc>
-          <w:tcPr>
-            <w:tcW w:w="7017" w:type="dxa"/>
-            <w:vAlign w:val="center"/>
-          </w:tcPr>
-          <w:p>
-            <w:pPr>
-              <w:spacing w:after="0" w:line="240" w:lineRule="auto"/>
-              <w:rPr>
-                <w:rFonts w:ascii="Times New Roman" w:hAnsi="Times New Roman" w:cs="Times New Roman"/>
-                <w:b/>
-                <w:bCs/>
-                <w:sz w:val="26"/>
-                <w:szCs w:val="26"/>
-              </w:rPr>
-            </w:pPr>
-            <w:r>
-              <w:rPr>
-                <w:rFonts w:ascii="Times New Roman" w:eastAsia="Aptos" w:hAnsi="Times New Roman" w:cs="Times New Roman"/>
-              </w:rPr>
-              <w:t>Hàng hoàn hoặc hồ sơ khiếu nại tồn đọng do chờ xác minh, phê duyệt hoặc xử lý.</w:t>
+            <w:tcW w:type="dxa" w:w="1872"/>
+            <w:shd w:fill="F0F4F8"/>
+          </w:tcPr>
+          <w:p>
+            <w:pPr>
+              <w:spacing w:before="40" w:after="40"/>
+            </w:pPr>
+            <w:r>
+              <w:rPr>
+                <w:rFonts w:ascii="Calibri" w:hAnsi="Calibri"/>
+                <w:sz w:val="19"/>
+              </w:rPr>
+              <w:t>Why 5 (Root Cause - Nguyên nhân gốc rễ)</w:t>
+            </w:r>
+          </w:p>
+        </w:tc>
+        <w:tc>
+          <w:tcPr>
+            <w:tcW w:type="dxa" w:w="2448"/>
+            <w:shd w:fill="F0F4F8"/>
+          </w:tcPr>
+          <w:p>
+            <w:pPr>
+              <w:spacing w:before="40" w:after="40"/>
+            </w:pPr>
+            <w:r>
+              <w:rPr>
+                <w:rFonts w:ascii="Calibri" w:hAnsi="Calibri"/>
+                <w:sz w:val="19"/>
+              </w:rPr>
+              <w:t>Ưu tiên ngân sách CNTT cho mảng giao hàng mà chưa đầu tư cho mảng CSKH &amp; Hoàn trả.</w:t>
+            </w:r>
+          </w:p>
+        </w:tc>
+        <w:tc>
+          <w:tcPr>
+            <w:tcW w:type="dxa" w:w="2448"/>
+            <w:shd w:fill="F0F4F8"/>
+          </w:tcPr>
+          <w:p>
+            <w:pPr>
+              <w:spacing w:before="40" w:after="40"/>
+              <w:jc w:val="center"/>
+            </w:pPr>
+            <w:r>
+              <w:rPr>
+                <w:rFonts w:ascii="Calibri" w:hAnsi="Calibri"/>
+                <w:sz w:val="19"/>
+              </w:rPr>
+              <w:t>Thiếu tính năng kiểm tra chứng từ tự động bằng AI OCR khi khách nộp.</w:t>
+            </w:r>
+          </w:p>
+        </w:tc>
+        <w:tc>
+          <w:tcPr>
+            <w:tcW w:type="dxa" w:w="2592"/>
+            <w:shd w:fill="F0F4F8"/>
+          </w:tcPr>
+          <w:p>
+            <w:pPr>
+              <w:spacing w:before="40" w:after="40"/>
+            </w:pPr>
+            <w:r>
+              <w:rPr>
+                <w:rFonts w:ascii="Calibri" w:hAnsi="Calibri"/>
+                <w:sz w:val="19"/>
+              </w:rPr>
+              <w:t>Thiếu sự phối hợp đồng bộ giữa Bộ phận Vận hành Kho và Bộ phận Quy trình.</w:t>
             </w:r>
           </w:p>
         </w:tc>
@@ -2654,14 +4194,17 @@
     </w:tbl>
     <w:p>
       <w:pPr>
-        <w:rPr>
-          <w:rFonts w:ascii="Times New Roman" w:hAnsi="Times New Roman" w:cs="Times New Roman"/>
-          <w:b/>
-          <w:bCs/>
-          <w:sz w:val="26"/>
-          <w:szCs w:val="26"/>
-        </w:rPr>
-      </w:pPr>
+        <w:spacing w:before="0" w:after="120"/>
+        <w:jc w:val="left"/>
+      </w:pPr>
+      <w:r>
+        <w:rPr>
+          <w:rFonts w:ascii="Calibri" w:hAnsi="Calibri"/>
+          <w:b w:val="0"/>
+          <w:i w:val="0"/>
+          <w:sz w:val="22"/>
+        </w:rPr>
+      </w:r>
     </w:p>
     <w:p>
       <w:pPr>

</xml_diff>

<commit_message>
Remove meta slide references
</commit_message>
<xml_diff>
--- a/01.WORKING_SPACE/3.DangVanHau-25410203/quytrinhquanlitrahang.docx
+++ b/01.WORKING_SPACE/3.DangVanHau-25410203/quytrinhquanlitrahang.docx
@@ -1153,13 +1153,7 @@
         </w:rPr>
       </w:pPr>
       <w:r>
-        <w:rPr>
-          <w:rFonts w:ascii="Times New Roman" w:hAnsi="Times New Roman" w:cs="Times New Roman"/>
-          <w:b/>
-          <w:i/>
-          <w:sz w:val="26"/>
-        </w:rPr>
-        <w:t>a. Nguyên lý và tiêu chí phân loại (Dựa theo Chap 05 - Process Analysis)</w:t>
+        <w:t>a. Nguyên lý và tiêu chí phân loại</w:t>
       </w:r>
     </w:p>
     <w:p>
@@ -1170,11 +1164,7 @@
         </w:rPr>
       </w:pPr>
       <w:r>
-        <w:rPr>
-          <w:rFonts w:ascii="Times New Roman" w:hAnsi="Times New Roman" w:cs="Times New Roman"/>
-          <w:sz w:val="26"/>
-        </w:rPr>
-        <w:t>Phân tích giá trị gia tăng (Value-Added Analysis) là phương pháp phân rã quy trình nghiệp vụ thành các bước hoạt động nhỏ và phân loại dựa trên mức độ đóng góp giá trị thực tế cho khách hàng và tổ chức. Dựa trên tài liệu giảng dạy Chương 5 - Phân tích quy trình (ThS. Hà Lê Hoài Trung), các bước trong quy trình được phân loại thành 3 nhóm:</w:t>
+        <w:t>Phân tích giá trị gia tăng (Value-Added Analysis) là phương pháp phân rã quy trình nghiệp vụ thành các bước hoạt động nhỏ và phân loại dựa trên mức độ đóng góp giá trị thực tế cho khách hàng và tổ chức. các bước trong quy trình được phân loại thành 3 nhóm:</w:t>
       </w:r>
     </w:p>
     <w:p>

</xml_diff>

<commit_message>
Remove technical file name references
</commit_message>
<xml_diff>
--- a/01.WORKING_SPACE/3.DangVanHau-25410203/quytrinhquanlitrahang.docx
+++ b/01.WORKING_SPACE/3.DangVanHau-25410203/quytrinhquanlitrahang.docx
@@ -1336,11 +1336,7 @@
         </w:rPr>
       </w:pPr>
       <w:r>
-        <w:rPr>
-          <w:rFonts w:ascii="Times New Roman" w:hAnsi="Times New Roman" w:cs="Times New Roman"/>
-          <w:sz w:val="26"/>
-        </w:rPr>
-        <w:t>Trên mô hình sơ đồ quy trình BPMN (file QuyTrinhHoanTraCSKH.bpmn), từng nút hoạt động (Tasks) được gắn mã ký hiệu phân loại và màu sắc nhận diện:</w:t>
+        <w:t>Trên mô hình sơ đồ quy trình BPMN, từng nút hoạt động (Tasks) được gắn mã ký hiệu phân loại và màu sắc nhận diện:</w:t>
       </w:r>
     </w:p>
     <w:p>

</xml_diff>

<commit_message>
Update 3-column VA table and BPMN waste tags
</commit_message>
<xml_diff>
--- a/01.WORKING_SPACE/3.DangVanHau-25410203/quytrinhquanlitrahang.docx
+++ b/01.WORKING_SPACE/3.DangVanHau-25410203/quytrinhquanlitrahang.docx
@@ -6,15 +6,6 @@
       <w:pPr>
         <w:spacing w:before="240" w:after="120"/>
       </w:pPr>
-      <w:r>
-        <w:rPr>
-          <w:rFonts w:ascii="Times New Roman" w:hAnsi="Times New Roman"/>
-          <w:b/>
-          <w:color w:val="000000"/>
-          <w:sz w:val="28"/>
-        </w:rPr>
-        <w:t>â</w:t>
-      </w:r>
       <w:r>
         <w:rPr>
           <w:rFonts w:ascii="Times New Roman" w:hAnsi="Times New Roman"/>
@@ -120,7 +111,7 @@
     </w:p>
     <w:p>
       <w:pPr>
-        <w:spacing w:before="120" w:after="60"/>
+        <w:spacing w:before="200" w:after="80"/>
       </w:pPr>
       <w:r>
         <w:rPr>
@@ -199,7 +190,7 @@
     </w:p>
     <w:p>
       <w:pPr>
-        <w:spacing w:before="120" w:after="60"/>
+        <w:spacing w:before="200" w:after="80"/>
       </w:pPr>
       <w:r>
         <w:rPr>
@@ -310,7 +301,7 @@
     </w:p>
     <w:p>
       <w:pPr>
-        <w:spacing w:before="120" w:after="60"/>
+        <w:spacing w:before="200" w:after="80"/>
       </w:pPr>
       <w:r>
         <w:rPr>
@@ -376,27 +367,24 @@
     </w:p>
     <w:tbl>
       <w:tblPr>
-        <w:tblW w:w="0" w:type="auto"/>
+        <w:tblW w:type="auto" w:w="0"/>
         <w:jc w:val="center"/>
-        <w:tblLook w:val="04A0" w:firstRow="1" w:lastRow="0" w:firstColumn="1" w:lastColumn="0" w:noHBand="0" w:noVBand="1"/>
+        <w:tblLook w:firstColumn="1" w:firstRow="1" w:lastColumn="0" w:lastRow="0" w:noHBand="0" w:noVBand="1" w:val="04A0"/>
       </w:tblPr>
       <w:tblGrid>
-        <w:gridCol w:w="2880"/>
-        <w:gridCol w:w="1584"/>
-        <w:gridCol w:w="1152"/>
-        <w:gridCol w:w="3744"/>
+        <w:gridCol w:w="3120"/>
+        <w:gridCol w:w="3120"/>
+        <w:gridCol w:w="3120"/>
       </w:tblGrid>
       <w:tr>
-        <w:trPr>
-          <w:jc w:val="center"/>
-        </w:trPr>
-        <w:tc>
-          <w:tcPr>
-            <w:tcW w:w="2880" w:type="dxa"/>
-            <w:shd w:val="clear" w:color="auto" w:fill="333333"/>
-          </w:tcPr>
-          <w:p>
-            <w:pPr>
+        <w:tc>
+          <w:tcPr>
+            <w:tcW w:type="dxa" w:w="4608"/>
+            <w:shd w:fill="333333"/>
+          </w:tcPr>
+          <w:p>
+            <w:pPr>
+              <w:spacing w:before="40" w:after="40"/>
               <w:jc w:val="center"/>
             </w:pPr>
             <w:r>
@@ -406,17 +394,18 @@
                 <w:color w:val="FFFFFF"/>
                 <w:sz w:val="22"/>
               </w:rPr>
-              <w:t>Bước quy trình</w:t>
-            </w:r>
-          </w:p>
-        </w:tc>
-        <w:tc>
-          <w:tcPr>
-            <w:tcW w:w="1584" w:type="dxa"/>
-            <w:shd w:val="clear" w:color="auto" w:fill="333333"/>
-          </w:tcPr>
-          <w:p>
-            <w:pPr>
+              <w:t>Step</w:t>
+            </w:r>
+          </w:p>
+        </w:tc>
+        <w:tc>
+          <w:tcPr>
+            <w:tcW w:type="dxa" w:w="2592"/>
+            <w:shd w:fill="333333"/>
+          </w:tcPr>
+          <w:p>
+            <w:pPr>
+              <w:spacing w:before="40" w:after="40"/>
               <w:jc w:val="center"/>
             </w:pPr>
             <w:r>
@@ -426,17 +415,18 @@
                 <w:color w:val="FFFFFF"/>
                 <w:sz w:val="22"/>
               </w:rPr>
-              <w:t>Bộ phận thực hiện</w:t>
-            </w:r>
-          </w:p>
-        </w:tc>
-        <w:tc>
-          <w:tcPr>
-            <w:tcW w:w="1152" w:type="dxa"/>
-            <w:shd w:val="clear" w:color="auto" w:fill="333333"/>
-          </w:tcPr>
-          <w:p>
-            <w:pPr>
+              <w:t>Performer</w:t>
+            </w:r>
+          </w:p>
+        </w:tc>
+        <w:tc>
+          <w:tcPr>
+            <w:tcW w:type="dxa" w:w="2160"/>
+            <w:shd w:fill="333333"/>
+          </w:tcPr>
+          <w:p>
+            <w:pPr>
+              <w:spacing w:before="40" w:after="40"/>
               <w:jc w:val="center"/>
             </w:pPr>
             <w:r>
@@ -446,43 +436,20 @@
                 <w:color w:val="FFFFFF"/>
                 <w:sz w:val="22"/>
               </w:rPr>
-              <w:t>Phân loại</w:t>
-            </w:r>
-          </w:p>
-        </w:tc>
-        <w:tc>
-          <w:tcPr>
-            <w:tcW w:w="3744" w:type="dxa"/>
-            <w:shd w:val="clear" w:color="auto" w:fill="333333"/>
-          </w:tcPr>
-          <w:p>
-            <w:pPr>
-              <w:jc w:val="center"/>
-            </w:pPr>
-            <w:r>
-              <w:rPr>
-                <w:rFonts w:ascii="Times New Roman" w:hAnsi="Times New Roman"/>
-                <w:b/>
-                <w:color w:val="FFFFFF"/>
-                <w:sz w:val="22"/>
-              </w:rPr>
-              <w:t>Lý do</w:t>
+              <w:t>Classification</w:t>
             </w:r>
           </w:p>
         </w:tc>
       </w:tr>
       <w:tr>
-        <w:trPr>
-          <w:jc w:val="center"/>
-        </w:trPr>
-        <w:tc>
-          <w:tcPr>
-            <w:tcW w:w="2880" w:type="dxa"/>
-            <w:shd w:val="clear" w:color="auto" w:fill="FFFFFF"/>
-          </w:tcPr>
-          <w:p>
-            <w:pPr>
-              <w:spacing w:before="20" w:after="20"/>
+        <w:tc>
+          <w:tcPr>
+            <w:tcW w:type="dxa" w:w="4608"/>
+            <w:shd w:fill="FFFFFF"/>
+          </w:tcPr>
+          <w:p>
+            <w:pPr>
+              <w:spacing w:before="40" w:after="40"/>
             </w:pPr>
             <w:r>
               <w:rPr>
@@ -496,12 +463,12 @@
         </w:tc>
         <w:tc>
           <w:tcPr>
-            <w:tcW w:w="1584" w:type="dxa"/>
-            <w:shd w:val="clear" w:color="auto" w:fill="FFFFFF"/>
-          </w:tcPr>
-          <w:p>
-            <w:pPr>
-              <w:spacing w:before="20" w:after="20"/>
+            <w:tcW w:type="dxa" w:w="2592"/>
+            <w:shd w:fill="FFFFFF"/>
+          </w:tcPr>
+          <w:p>
+            <w:pPr>
+              <w:spacing w:before="40" w:after="40"/>
             </w:pPr>
             <w:r>
               <w:rPr>
@@ -515,55 +482,35 @@
         </w:tc>
         <w:tc>
           <w:tcPr>
-            <w:tcW w:w="1152" w:type="dxa"/>
-            <w:shd w:val="clear" w:color="auto" w:fill="FFFFFF"/>
-          </w:tcPr>
-          <w:p>
-            <w:pPr>
-              <w:spacing w:before="20" w:after="20"/>
-            </w:pPr>
-            <w:r>
-              <w:rPr>
-                <w:rFonts w:ascii="Times New Roman" w:hAnsi="Times New Roman"/>
+            <w:tcW w:type="dxa" w:w="2160"/>
+            <w:shd w:fill="FFFFFF"/>
+          </w:tcPr>
+          <w:p>
+            <w:pPr>
+              <w:spacing w:before="40" w:after="40"/>
+              <w:jc w:val="center"/>
+            </w:pPr>
+            <w:r>
+              <w:rPr>
+                <w:rFonts w:ascii="Times New Roman" w:hAnsi="Times New Roman"/>
+                <w:b/>
                 <w:color w:val="000000"/>
                 <w:sz w:val="22"/>
               </w:rPr>
               <w:t>VA</w:t>
-            </w:r>
-          </w:p>
-        </w:tc>
-        <w:tc>
-          <w:tcPr>
-            <w:tcW w:w="3744" w:type="dxa"/>
-            <w:shd w:val="clear" w:color="auto" w:fill="FFFFFF"/>
-          </w:tcPr>
-          <w:p>
-            <w:pPr>
-              <w:spacing w:before="20" w:after="20"/>
-            </w:pPr>
-            <w:r>
-              <w:rPr>
-                <w:rFonts w:ascii="Times New Roman" w:hAnsi="Times New Roman"/>
-                <w:color w:val="000000"/>
-                <w:sz w:val="22"/>
-              </w:rPr>
-              <w:t>Khởi tạo nhu cầu đổi trả hoặc bồi thường.</w:t>
             </w:r>
           </w:p>
         </w:tc>
       </w:tr>
       <w:tr>
-        <w:trPr>
-          <w:jc w:val="center"/>
-        </w:trPr>
-        <w:tc>
-          <w:tcPr>
-            <w:tcW w:w="2880" w:type="dxa"/>
-            <w:shd w:val="clear" w:color="auto" w:fill="F5F5F5"/>
-          </w:tcPr>
-          <w:p>
-            <w:pPr>
-              <w:spacing w:before="20" w:after="20"/>
+        <w:tc>
+          <w:tcPr>
+            <w:tcW w:type="dxa" w:w="4608"/>
+            <w:shd w:fill="F5F5F5"/>
+          </w:tcPr>
+          <w:p>
+            <w:pPr>
+              <w:spacing w:before="40" w:after="40"/>
             </w:pPr>
             <w:r>
               <w:rPr>
@@ -577,12 +524,12 @@
         </w:tc>
         <w:tc>
           <w:tcPr>
-            <w:tcW w:w="1584" w:type="dxa"/>
-            <w:shd w:val="clear" w:color="auto" w:fill="F5F5F5"/>
-          </w:tcPr>
-          <w:p>
-            <w:pPr>
-              <w:spacing w:before="20" w:after="20"/>
+            <w:tcW w:type="dxa" w:w="2592"/>
+            <w:shd w:fill="F5F5F5"/>
+          </w:tcPr>
+          <w:p>
+            <w:pPr>
+              <w:spacing w:before="40" w:after="40"/>
             </w:pPr>
             <w:r>
               <w:rPr>
@@ -596,55 +543,35 @@
         </w:tc>
         <w:tc>
           <w:tcPr>
-            <w:tcW w:w="1152" w:type="dxa"/>
-            <w:shd w:val="clear" w:color="auto" w:fill="F5F5F5"/>
-          </w:tcPr>
-          <w:p>
-            <w:pPr>
-              <w:spacing w:before="20" w:after="20"/>
-            </w:pPr>
-            <w:r>
-              <w:rPr>
-                <w:rFonts w:ascii="Times New Roman" w:hAnsi="Times New Roman"/>
+            <w:tcW w:type="dxa" w:w="2160"/>
+            <w:shd w:fill="F5F5F5"/>
+          </w:tcPr>
+          <w:p>
+            <w:pPr>
+              <w:spacing w:before="40" w:after="40"/>
+              <w:jc w:val="center"/>
+            </w:pPr>
+            <w:r>
+              <w:rPr>
+                <w:rFonts w:ascii="Times New Roman" w:hAnsi="Times New Roman"/>
+                <w:b/>
                 <w:color w:val="000000"/>
                 <w:sz w:val="22"/>
               </w:rPr>
               <w:t>NVA</w:t>
-            </w:r>
-          </w:p>
-        </w:tc>
-        <w:tc>
-          <w:tcPr>
-            <w:tcW w:w="3744" w:type="dxa"/>
-            <w:shd w:val="clear" w:color="auto" w:fill="F5F5F5"/>
-          </w:tcPr>
-          <w:p>
-            <w:pPr>
-              <w:spacing w:before="20" w:after="20"/>
-            </w:pPr>
-            <w:r>
-              <w:rPr>
-                <w:rFonts w:ascii="Times New Roman" w:hAnsi="Times New Roman"/>
-                <w:color w:val="000000"/>
-                <w:sz w:val="22"/>
-              </w:rPr>
-              <w:t>Phát sinh do lần đầu thiếu thông tin, phải làm lại.</w:t>
             </w:r>
           </w:p>
         </w:tc>
       </w:tr>
       <w:tr>
-        <w:trPr>
-          <w:jc w:val="center"/>
-        </w:trPr>
-        <w:tc>
-          <w:tcPr>
-            <w:tcW w:w="2880" w:type="dxa"/>
-            <w:shd w:val="clear" w:color="auto" w:fill="FFFFFF"/>
-          </w:tcPr>
-          <w:p>
-            <w:pPr>
-              <w:spacing w:before="20" w:after="20"/>
+        <w:tc>
+          <w:tcPr>
+            <w:tcW w:type="dxa" w:w="4608"/>
+            <w:shd w:fill="FFFFFF"/>
+          </w:tcPr>
+          <w:p>
+            <w:pPr>
+              <w:spacing w:before="40" w:after="40"/>
             </w:pPr>
             <w:r>
               <w:rPr>
@@ -658,12 +585,12 @@
         </w:tc>
         <w:tc>
           <w:tcPr>
-            <w:tcW w:w="1584" w:type="dxa"/>
-            <w:shd w:val="clear" w:color="auto" w:fill="FFFFFF"/>
-          </w:tcPr>
-          <w:p>
-            <w:pPr>
-              <w:spacing w:before="20" w:after="20"/>
+            <w:tcW w:type="dxa" w:w="2592"/>
+            <w:shd w:fill="FFFFFF"/>
+          </w:tcPr>
+          <w:p>
+            <w:pPr>
+              <w:spacing w:before="40" w:after="40"/>
             </w:pPr>
             <w:r>
               <w:rPr>
@@ -677,55 +604,35 @@
         </w:tc>
         <w:tc>
           <w:tcPr>
-            <w:tcW w:w="1152" w:type="dxa"/>
-            <w:shd w:val="clear" w:color="auto" w:fill="FFFFFF"/>
-          </w:tcPr>
-          <w:p>
-            <w:pPr>
-              <w:spacing w:before="20" w:after="20"/>
-            </w:pPr>
-            <w:r>
-              <w:rPr>
-                <w:rFonts w:ascii="Times New Roman" w:hAnsi="Times New Roman"/>
+            <w:tcW w:type="dxa" w:w="2160"/>
+            <w:shd w:fill="FFFFFF"/>
+          </w:tcPr>
+          <w:p>
+            <w:pPr>
+              <w:spacing w:before="40" w:after="40"/>
+              <w:jc w:val="center"/>
+            </w:pPr>
+            <w:r>
+              <w:rPr>
+                <w:rFonts w:ascii="Times New Roman" w:hAnsi="Times New Roman"/>
+                <w:b/>
                 <w:color w:val="000000"/>
                 <w:sz w:val="22"/>
               </w:rPr>
               <w:t>BVA</w:t>
-            </w:r>
-          </w:p>
-        </w:tc>
-        <w:tc>
-          <w:tcPr>
-            <w:tcW w:w="3744" w:type="dxa"/>
-            <w:shd w:val="clear" w:color="auto" w:fill="FFFFFF"/>
-          </w:tcPr>
-          <w:p>
-            <w:pPr>
-              <w:spacing w:before="20" w:after="20"/>
-            </w:pPr>
-            <w:r>
-              <w:rPr>
-                <w:rFonts w:ascii="Times New Roman" w:hAnsi="Times New Roman"/>
-                <w:color w:val="000000"/>
-                <w:sz w:val="22"/>
-              </w:rPr>
-              <w:t>Ghi nhận vé xử lý vào hệ thống ticket.</w:t>
             </w:r>
           </w:p>
         </w:tc>
       </w:tr>
       <w:tr>
-        <w:trPr>
-          <w:jc w:val="center"/>
-        </w:trPr>
-        <w:tc>
-          <w:tcPr>
-            <w:tcW w:w="2880" w:type="dxa"/>
-            <w:shd w:val="clear" w:color="auto" w:fill="F5F5F5"/>
-          </w:tcPr>
-          <w:p>
-            <w:pPr>
-              <w:spacing w:before="20" w:after="20"/>
+        <w:tc>
+          <w:tcPr>
+            <w:tcW w:type="dxa" w:w="4608"/>
+            <w:shd w:fill="F5F5F5"/>
+          </w:tcPr>
+          <w:p>
+            <w:pPr>
+              <w:spacing w:before="40" w:after="40"/>
             </w:pPr>
             <w:r>
               <w:rPr>
@@ -739,12 +646,12 @@
         </w:tc>
         <w:tc>
           <w:tcPr>
-            <w:tcW w:w="1584" w:type="dxa"/>
-            <w:shd w:val="clear" w:color="auto" w:fill="F5F5F5"/>
-          </w:tcPr>
-          <w:p>
-            <w:pPr>
-              <w:spacing w:before="20" w:after="20"/>
+            <w:tcW w:type="dxa" w:w="2592"/>
+            <w:shd w:fill="F5F5F5"/>
+          </w:tcPr>
+          <w:p>
+            <w:pPr>
+              <w:spacing w:before="40" w:after="40"/>
             </w:pPr>
             <w:r>
               <w:rPr>
@@ -758,55 +665,35 @@
         </w:tc>
         <w:tc>
           <w:tcPr>
-            <w:tcW w:w="1152" w:type="dxa"/>
-            <w:shd w:val="clear" w:color="auto" w:fill="F5F5F5"/>
-          </w:tcPr>
-          <w:p>
-            <w:pPr>
-              <w:spacing w:before="20" w:after="20"/>
-            </w:pPr>
-            <w:r>
-              <w:rPr>
-                <w:rFonts w:ascii="Times New Roman" w:hAnsi="Times New Roman"/>
+            <w:tcW w:type="dxa" w:w="2160"/>
+            <w:shd w:fill="F5F5F5"/>
+          </w:tcPr>
+          <w:p>
+            <w:pPr>
+              <w:spacing w:before="40" w:after="40"/>
+              <w:jc w:val="center"/>
+            </w:pPr>
+            <w:r>
+              <w:rPr>
+                <w:rFonts w:ascii="Times New Roman" w:hAnsi="Times New Roman"/>
+                <w:b/>
                 <w:color w:val="000000"/>
                 <w:sz w:val="22"/>
               </w:rPr>
               <w:t>BVA</w:t>
-            </w:r>
-          </w:p>
-        </w:tc>
-        <w:tc>
-          <w:tcPr>
-            <w:tcW w:w="3744" w:type="dxa"/>
-            <w:shd w:val="clear" w:color="auto" w:fill="F5F5F5"/>
-          </w:tcPr>
-          <w:p>
-            <w:pPr>
-              <w:spacing w:before="20" w:after="20"/>
-            </w:pPr>
-            <w:r>
-              <w:rPr>
-                <w:rFonts w:ascii="Times New Roman" w:hAnsi="Times New Roman"/>
-                <w:color w:val="000000"/>
-                <w:sz w:val="22"/>
-              </w:rPr>
-              <w:t>Xác minh chính chủ, kiểm tra điều kiện pháp lý.</w:t>
             </w:r>
           </w:p>
         </w:tc>
       </w:tr>
       <w:tr>
-        <w:trPr>
-          <w:jc w:val="center"/>
-        </w:trPr>
-        <w:tc>
-          <w:tcPr>
-            <w:tcW w:w="2880" w:type="dxa"/>
-            <w:shd w:val="clear" w:color="auto" w:fill="FFFFFF"/>
-          </w:tcPr>
-          <w:p>
-            <w:pPr>
-              <w:spacing w:before="20" w:after="20"/>
+        <w:tc>
+          <w:tcPr>
+            <w:tcW w:type="dxa" w:w="4608"/>
+            <w:shd w:fill="FFFFFF"/>
+          </w:tcPr>
+          <w:p>
+            <w:pPr>
+              <w:spacing w:before="40" w:after="40"/>
             </w:pPr>
             <w:r>
               <w:rPr>
@@ -820,12 +707,12 @@
         </w:tc>
         <w:tc>
           <w:tcPr>
-            <w:tcW w:w="1584" w:type="dxa"/>
-            <w:shd w:val="clear" w:color="auto" w:fill="FFFFFF"/>
-          </w:tcPr>
-          <w:p>
-            <w:pPr>
-              <w:spacing w:before="20" w:after="20"/>
+            <w:tcW w:type="dxa" w:w="2592"/>
+            <w:shd w:fill="FFFFFF"/>
+          </w:tcPr>
+          <w:p>
+            <w:pPr>
+              <w:spacing w:before="40" w:after="40"/>
             </w:pPr>
             <w:r>
               <w:rPr>
@@ -839,55 +726,35 @@
         </w:tc>
         <w:tc>
           <w:tcPr>
-            <w:tcW w:w="1152" w:type="dxa"/>
-            <w:shd w:val="clear" w:color="auto" w:fill="FFFFFF"/>
-          </w:tcPr>
-          <w:p>
-            <w:pPr>
-              <w:spacing w:before="20" w:after="20"/>
-            </w:pPr>
-            <w:r>
-              <w:rPr>
-                <w:rFonts w:ascii="Times New Roman" w:hAnsi="Times New Roman"/>
+            <w:tcW w:type="dxa" w:w="2160"/>
+            <w:shd w:fill="FFFFFF"/>
+          </w:tcPr>
+          <w:p>
+            <w:pPr>
+              <w:spacing w:before="40" w:after="40"/>
+              <w:jc w:val="center"/>
+            </w:pPr>
+            <w:r>
+              <w:rPr>
+                <w:rFonts w:ascii="Times New Roman" w:hAnsi="Times New Roman"/>
+                <w:b/>
                 <w:color w:val="000000"/>
                 <w:sz w:val="22"/>
               </w:rPr>
               <w:t>BVA</w:t>
-            </w:r>
-          </w:p>
-        </w:tc>
-        <w:tc>
-          <w:tcPr>
-            <w:tcW w:w="3744" w:type="dxa"/>
-            <w:shd w:val="clear" w:color="auto" w:fill="FFFFFF"/>
-          </w:tcPr>
-          <w:p>
-            <w:pPr>
-              <w:spacing w:before="20" w:after="20"/>
-            </w:pPr>
-            <w:r>
-              <w:rPr>
-                <w:rFonts w:ascii="Times New Roman" w:hAnsi="Times New Roman"/>
-                <w:color w:val="000000"/>
-                <w:sz w:val="22"/>
-              </w:rPr>
-              <w:t>Đối soát với kho/shipper xác định trách nhiệm.</w:t>
             </w:r>
           </w:p>
         </w:tc>
       </w:tr>
       <w:tr>
-        <w:trPr>
-          <w:jc w:val="center"/>
-        </w:trPr>
-        <w:tc>
-          <w:tcPr>
-            <w:tcW w:w="2880" w:type="dxa"/>
-            <w:shd w:val="clear" w:color="auto" w:fill="F5F5F5"/>
-          </w:tcPr>
-          <w:p>
-            <w:pPr>
-              <w:spacing w:before="20" w:after="20"/>
+        <w:tc>
+          <w:tcPr>
+            <w:tcW w:type="dxa" w:w="4608"/>
+            <w:shd w:fill="F5F5F5"/>
+          </w:tcPr>
+          <w:p>
+            <w:pPr>
+              <w:spacing w:before="40" w:after="40"/>
             </w:pPr>
             <w:r>
               <w:rPr>
@@ -901,12 +768,12 @@
         </w:tc>
         <w:tc>
           <w:tcPr>
-            <w:tcW w:w="1584" w:type="dxa"/>
-            <w:shd w:val="clear" w:color="auto" w:fill="F5F5F5"/>
-          </w:tcPr>
-          <w:p>
-            <w:pPr>
-              <w:spacing w:before="20" w:after="20"/>
+            <w:tcW w:type="dxa" w:w="2592"/>
+            <w:shd w:fill="F5F5F5"/>
+          </w:tcPr>
+          <w:p>
+            <w:pPr>
+              <w:spacing w:before="40" w:after="40"/>
             </w:pPr>
             <w:r>
               <w:rPr>
@@ -920,55 +787,35 @@
         </w:tc>
         <w:tc>
           <w:tcPr>
-            <w:tcW w:w="1152" w:type="dxa"/>
-            <w:shd w:val="clear" w:color="auto" w:fill="F5F5F5"/>
-          </w:tcPr>
-          <w:p>
-            <w:pPr>
-              <w:spacing w:before="20" w:after="20"/>
-            </w:pPr>
-            <w:r>
-              <w:rPr>
-                <w:rFonts w:ascii="Times New Roman" w:hAnsi="Times New Roman"/>
+            <w:tcW w:type="dxa" w:w="2160"/>
+            <w:shd w:fill="F5F5F5"/>
+          </w:tcPr>
+          <w:p>
+            <w:pPr>
+              <w:spacing w:before="40" w:after="40"/>
+              <w:jc w:val="center"/>
+            </w:pPr>
+            <w:r>
+              <w:rPr>
+                <w:rFonts w:ascii="Times New Roman" w:hAnsi="Times New Roman"/>
+                <w:b/>
                 <w:color w:val="000000"/>
                 <w:sz w:val="22"/>
               </w:rPr>
               <w:t>BVA</w:t>
-            </w:r>
-          </w:p>
-        </w:tc>
-        <w:tc>
-          <w:tcPr>
-            <w:tcW w:w="3744" w:type="dxa"/>
-            <w:shd w:val="clear" w:color="auto" w:fill="F5F5F5"/>
-          </w:tcPr>
-          <w:p>
-            <w:pPr>
-              <w:spacing w:before="20" w:after="20"/>
-            </w:pPr>
-            <w:r>
-              <w:rPr>
-                <w:rFonts w:ascii="Times New Roman" w:hAnsi="Times New Roman"/>
-                <w:color w:val="000000"/>
-                <w:sz w:val="22"/>
-              </w:rPr>
-              <w:t>Điều hướng đến đúng luồng xử lý.</w:t>
             </w:r>
           </w:p>
         </w:tc>
       </w:tr>
       <w:tr>
-        <w:trPr>
-          <w:jc w:val="center"/>
-        </w:trPr>
-        <w:tc>
-          <w:tcPr>
-            <w:tcW w:w="2880" w:type="dxa"/>
-            <w:shd w:val="clear" w:color="auto" w:fill="FFFFFF"/>
-          </w:tcPr>
-          <w:p>
-            <w:pPr>
-              <w:spacing w:before="20" w:after="20"/>
+        <w:tc>
+          <w:tcPr>
+            <w:tcW w:type="dxa" w:w="4608"/>
+            <w:shd w:fill="FFFFFF"/>
+          </w:tcPr>
+          <w:p>
+            <w:pPr>
+              <w:spacing w:before="40" w:after="40"/>
             </w:pPr>
             <w:r>
               <w:rPr>
@@ -982,12 +829,12 @@
         </w:tc>
         <w:tc>
           <w:tcPr>
-            <w:tcW w:w="1584" w:type="dxa"/>
-            <w:shd w:val="clear" w:color="auto" w:fill="FFFFFF"/>
-          </w:tcPr>
-          <w:p>
-            <w:pPr>
-              <w:spacing w:before="20" w:after="20"/>
+            <w:tcW w:type="dxa" w:w="2592"/>
+            <w:shd w:fill="FFFFFF"/>
+          </w:tcPr>
+          <w:p>
+            <w:pPr>
+              <w:spacing w:before="40" w:after="40"/>
             </w:pPr>
             <w:r>
               <w:rPr>
@@ -1001,55 +848,35 @@
         </w:tc>
         <w:tc>
           <w:tcPr>
-            <w:tcW w:w="1152" w:type="dxa"/>
-            <w:shd w:val="clear" w:color="auto" w:fill="FFFFFF"/>
-          </w:tcPr>
-          <w:p>
-            <w:pPr>
-              <w:spacing w:before="20" w:after="20"/>
-            </w:pPr>
-            <w:r>
-              <w:rPr>
-                <w:rFonts w:ascii="Times New Roman" w:hAnsi="Times New Roman"/>
+            <w:tcW w:type="dxa" w:w="2160"/>
+            <w:shd w:fill="FFFFFF"/>
+          </w:tcPr>
+          <w:p>
+            <w:pPr>
+              <w:spacing w:before="40" w:after="40"/>
+              <w:jc w:val="center"/>
+            </w:pPr>
+            <w:r>
+              <w:rPr>
+                <w:rFonts w:ascii="Times New Roman" w:hAnsi="Times New Roman"/>
+                <w:b/>
                 <w:color w:val="000000"/>
                 <w:sz w:val="22"/>
               </w:rPr>
               <w:t>BVA</w:t>
-            </w:r>
-          </w:p>
-        </w:tc>
-        <w:tc>
-          <w:tcPr>
-            <w:tcW w:w="3744" w:type="dxa"/>
-            <w:shd w:val="clear" w:color="auto" w:fill="FFFFFF"/>
-          </w:tcPr>
-          <w:p>
-            <w:pPr>
-              <w:spacing w:before="20" w:after="20"/>
-            </w:pPr>
-            <w:r>
-              <w:rPr>
-                <w:rFonts w:ascii="Times New Roman" w:hAnsi="Times New Roman"/>
-                <w:color w:val="000000"/>
-                <w:sz w:val="22"/>
-              </w:rPr>
-              <w:t>Nhận nhiệm vụ trên App, xếp lịch lấy hàng.</w:t>
             </w:r>
           </w:p>
         </w:tc>
       </w:tr>
       <w:tr>
-        <w:trPr>
-          <w:jc w:val="center"/>
-        </w:trPr>
-        <w:tc>
-          <w:tcPr>
-            <w:tcW w:w="2880" w:type="dxa"/>
-            <w:shd w:val="clear" w:color="auto" w:fill="F5F5F5"/>
-          </w:tcPr>
-          <w:p>
-            <w:pPr>
-              <w:spacing w:before="20" w:after="20"/>
+        <w:tc>
+          <w:tcPr>
+            <w:tcW w:type="dxa" w:w="4608"/>
+            <w:shd w:fill="F5F5F5"/>
+          </w:tcPr>
+          <w:p>
+            <w:pPr>
+              <w:spacing w:before="40" w:after="40"/>
             </w:pPr>
             <w:r>
               <w:rPr>
@@ -1063,12 +890,12 @@
         </w:tc>
         <w:tc>
           <w:tcPr>
-            <w:tcW w:w="1584" w:type="dxa"/>
-            <w:shd w:val="clear" w:color="auto" w:fill="F5F5F5"/>
-          </w:tcPr>
-          <w:p>
-            <w:pPr>
-              <w:spacing w:before="20" w:after="20"/>
+            <w:tcW w:type="dxa" w:w="2592"/>
+            <w:shd w:fill="F5F5F5"/>
+          </w:tcPr>
+          <w:p>
+            <w:pPr>
+              <w:spacing w:before="40" w:after="40"/>
             </w:pPr>
             <w:r>
               <w:rPr>
@@ -1082,55 +909,35 @@
         </w:tc>
         <w:tc>
           <w:tcPr>
-            <w:tcW w:w="1152" w:type="dxa"/>
-            <w:shd w:val="clear" w:color="auto" w:fill="F5F5F5"/>
-          </w:tcPr>
-          <w:p>
-            <w:pPr>
-              <w:spacing w:before="20" w:after="20"/>
-            </w:pPr>
-            <w:r>
-              <w:rPr>
-                <w:rFonts w:ascii="Times New Roman" w:hAnsi="Times New Roman"/>
+            <w:tcW w:type="dxa" w:w="2160"/>
+            <w:shd w:fill="F5F5F5"/>
+          </w:tcPr>
+          <w:p>
+            <w:pPr>
+              <w:spacing w:before="40" w:after="40"/>
+              <w:jc w:val="center"/>
+            </w:pPr>
+            <w:r>
+              <w:rPr>
+                <w:rFonts w:ascii="Times New Roman" w:hAnsi="Times New Roman"/>
+                <w:b/>
                 <w:color w:val="000000"/>
                 <w:sz w:val="22"/>
               </w:rPr>
               <w:t>VA</w:t>
-            </w:r>
-          </w:p>
-        </w:tc>
-        <w:tc>
-          <w:tcPr>
-            <w:tcW w:w="3744" w:type="dxa"/>
-            <w:shd w:val="clear" w:color="auto" w:fill="F5F5F5"/>
-          </w:tcPr>
-          <w:p>
-            <w:pPr>
-              <w:spacing w:before="20" w:after="20"/>
-            </w:pPr>
-            <w:r>
-              <w:rPr>
-                <w:rFonts w:ascii="Times New Roman" w:hAnsi="Times New Roman"/>
-                <w:color w:val="000000"/>
-                <w:sz w:val="22"/>
-              </w:rPr>
-              <w:t>Thu hồi hàng hoàn tận nơi cho khách.</w:t>
             </w:r>
           </w:p>
         </w:tc>
       </w:tr>
       <w:tr>
-        <w:trPr>
-          <w:jc w:val="center"/>
-        </w:trPr>
-        <w:tc>
-          <w:tcPr>
-            <w:tcW w:w="2880" w:type="dxa"/>
-            <w:shd w:val="clear" w:color="auto" w:fill="FFFFFF"/>
-          </w:tcPr>
-          <w:p>
-            <w:pPr>
-              <w:spacing w:before="20" w:after="20"/>
+        <w:tc>
+          <w:tcPr>
+            <w:tcW w:type="dxa" w:w="4608"/>
+            <w:shd w:fill="FFFFFF"/>
+          </w:tcPr>
+          <w:p>
+            <w:pPr>
+              <w:spacing w:before="40" w:after="40"/>
             </w:pPr>
             <w:r>
               <w:rPr>
@@ -1144,12 +951,12 @@
         </w:tc>
         <w:tc>
           <w:tcPr>
-            <w:tcW w:w="1584" w:type="dxa"/>
-            <w:shd w:val="clear" w:color="auto" w:fill="FFFFFF"/>
-          </w:tcPr>
-          <w:p>
-            <w:pPr>
-              <w:spacing w:before="20" w:after="20"/>
+            <w:tcW w:type="dxa" w:w="2592"/>
+            <w:shd w:fill="FFFFFF"/>
+          </w:tcPr>
+          <w:p>
+            <w:pPr>
+              <w:spacing w:before="40" w:after="40"/>
             </w:pPr>
             <w:r>
               <w:rPr>
@@ -1163,75 +970,54 @@
         </w:tc>
         <w:tc>
           <w:tcPr>
-            <w:tcW w:w="1152" w:type="dxa"/>
-            <w:shd w:val="clear" w:color="auto" w:fill="FFFFFF"/>
-          </w:tcPr>
-          <w:p>
-            <w:pPr>
-              <w:spacing w:before="20" w:after="20"/>
-            </w:pPr>
-            <w:r>
-              <w:rPr>
-                <w:rFonts w:ascii="Times New Roman" w:hAnsi="Times New Roman"/>
+            <w:tcW w:type="dxa" w:w="2160"/>
+            <w:shd w:fill="FFFFFF"/>
+          </w:tcPr>
+          <w:p>
+            <w:pPr>
+              <w:spacing w:before="40" w:after="40"/>
+              <w:jc w:val="center"/>
+            </w:pPr>
+            <w:r>
+              <w:rPr>
+                <w:rFonts w:ascii="Times New Roman" w:hAnsi="Times New Roman"/>
+                <w:b/>
                 <w:color w:val="000000"/>
                 <w:sz w:val="22"/>
               </w:rPr>
               <w:t>NVA</w:t>
-            </w:r>
-          </w:p>
-        </w:tc>
-        <w:tc>
-          <w:tcPr>
-            <w:tcW w:w="3744" w:type="dxa"/>
-            <w:shd w:val="clear" w:color="auto" w:fill="FFFFFF"/>
-          </w:tcPr>
-          <w:p>
-            <w:pPr>
-              <w:spacing w:before="20" w:after="20"/>
-            </w:pPr>
-            <w:r>
-              <w:rPr>
-                <w:rFonts w:ascii="Times New Roman" w:hAnsi="Times New Roman"/>
-                <w:color w:val="000000"/>
-                <w:sz w:val="22"/>
-              </w:rPr>
-              <w:t>Di chuyển cơ học, bắt buộc do khoảng cách địa lý.</w:t>
             </w:r>
           </w:p>
         </w:tc>
       </w:tr>
       <w:tr>
-        <w:trPr>
-          <w:jc w:val="center"/>
-        </w:trPr>
-        <w:tc>
-          <w:tcPr>
-            <w:tcW w:w="2880" w:type="dxa"/>
-            <w:shd w:val="clear" w:color="auto" w:fill="F5F5F5"/>
-          </w:tcPr>
-          <w:p>
-            <w:pPr>
-              <w:spacing w:before="20" w:after="20"/>
-            </w:pPr>
-            <w:r>
-              <w:rPr>
-                <w:rFonts w:ascii="Times New Roman" w:hAnsi="Times New Roman"/>
-                <w:color w:val="000000"/>
-                <w:sz w:val="22"/>
-              </w:rPr>
-              <w:lastRenderedPageBreak/>
+        <w:tc>
+          <w:tcPr>
+            <w:tcW w:type="dxa" w:w="4608"/>
+            <w:shd w:fill="F5F5F5"/>
+          </w:tcPr>
+          <w:p>
+            <w:pPr>
+              <w:spacing w:before="40" w:after="40"/>
+            </w:pPr>
+            <w:r>
+              <w:rPr>
+                <w:rFonts w:ascii="Times New Roman" w:hAnsi="Times New Roman"/>
+                <w:color w:val="000000"/>
+                <w:sz w:val="22"/>
+              </w:rPr>
               <w:t>10. Kiểm tra hàng hoàn tại kho</w:t>
             </w:r>
           </w:p>
         </w:tc>
         <w:tc>
           <w:tcPr>
-            <w:tcW w:w="1584" w:type="dxa"/>
-            <w:shd w:val="clear" w:color="auto" w:fill="F5F5F5"/>
-          </w:tcPr>
-          <w:p>
-            <w:pPr>
-              <w:spacing w:before="20" w:after="20"/>
+            <w:tcW w:type="dxa" w:w="2592"/>
+            <w:shd w:fill="F5F5F5"/>
+          </w:tcPr>
+          <w:p>
+            <w:pPr>
+              <w:spacing w:before="40" w:after="40"/>
             </w:pPr>
             <w:r>
               <w:rPr>
@@ -1245,55 +1031,35 @@
         </w:tc>
         <w:tc>
           <w:tcPr>
-            <w:tcW w:w="1152" w:type="dxa"/>
-            <w:shd w:val="clear" w:color="auto" w:fill="F5F5F5"/>
-          </w:tcPr>
-          <w:p>
-            <w:pPr>
-              <w:spacing w:before="20" w:after="20"/>
-            </w:pPr>
-            <w:r>
-              <w:rPr>
-                <w:rFonts w:ascii="Times New Roman" w:hAnsi="Times New Roman"/>
+            <w:tcW w:type="dxa" w:w="2160"/>
+            <w:shd w:fill="F5F5F5"/>
+          </w:tcPr>
+          <w:p>
+            <w:pPr>
+              <w:spacing w:before="40" w:after="40"/>
+              <w:jc w:val="center"/>
+            </w:pPr>
+            <w:r>
+              <w:rPr>
+                <w:rFonts w:ascii="Times New Roman" w:hAnsi="Times New Roman"/>
+                <w:b/>
                 <w:color w:val="000000"/>
                 <w:sz w:val="22"/>
               </w:rPr>
               <w:t>BVA</w:t>
-            </w:r>
-          </w:p>
-        </w:tc>
-        <w:tc>
-          <w:tcPr>
-            <w:tcW w:w="3744" w:type="dxa"/>
-            <w:shd w:val="clear" w:color="auto" w:fill="F5F5F5"/>
-          </w:tcPr>
-          <w:p>
-            <w:pPr>
-              <w:spacing w:before="20" w:after="20"/>
-            </w:pPr>
-            <w:r>
-              <w:rPr>
-                <w:rFonts w:ascii="Times New Roman" w:hAnsi="Times New Roman"/>
-                <w:color w:val="000000"/>
-                <w:sz w:val="22"/>
-              </w:rPr>
-              <w:t>Kiểm tra ngoại quan, niêm phong chống tráo hàng.</w:t>
             </w:r>
           </w:p>
         </w:tc>
       </w:tr>
       <w:tr>
-        <w:trPr>
-          <w:jc w:val="center"/>
-        </w:trPr>
-        <w:tc>
-          <w:tcPr>
-            <w:tcW w:w="2880" w:type="dxa"/>
-            <w:shd w:val="clear" w:color="auto" w:fill="FFFFFF"/>
-          </w:tcPr>
-          <w:p>
-            <w:pPr>
-              <w:spacing w:before="20" w:after="20"/>
+        <w:tc>
+          <w:tcPr>
+            <w:tcW w:type="dxa" w:w="4608"/>
+            <w:shd w:fill="FFFFFF"/>
+          </w:tcPr>
+          <w:p>
+            <w:pPr>
+              <w:spacing w:before="40" w:after="40"/>
             </w:pPr>
             <w:r>
               <w:rPr>
@@ -1307,12 +1073,12 @@
         </w:tc>
         <w:tc>
           <w:tcPr>
-            <w:tcW w:w="1584" w:type="dxa"/>
-            <w:shd w:val="clear" w:color="auto" w:fill="FFFFFF"/>
-          </w:tcPr>
-          <w:p>
-            <w:pPr>
-              <w:spacing w:before="20" w:after="20"/>
+            <w:tcW w:type="dxa" w:w="2592"/>
+            <w:shd w:fill="FFFFFF"/>
+          </w:tcPr>
+          <w:p>
+            <w:pPr>
+              <w:spacing w:before="40" w:after="40"/>
             </w:pPr>
             <w:r>
               <w:rPr>
@@ -1326,55 +1092,35 @@
         </w:tc>
         <w:tc>
           <w:tcPr>
-            <w:tcW w:w="1152" w:type="dxa"/>
-            <w:shd w:val="clear" w:color="auto" w:fill="FFFFFF"/>
-          </w:tcPr>
-          <w:p>
-            <w:pPr>
-              <w:spacing w:before="20" w:after="20"/>
-            </w:pPr>
-            <w:r>
-              <w:rPr>
-                <w:rFonts w:ascii="Times New Roman" w:hAnsi="Times New Roman"/>
+            <w:tcW w:type="dxa" w:w="2160"/>
+            <w:shd w:fill="FFFFFF"/>
+          </w:tcPr>
+          <w:p>
+            <w:pPr>
+              <w:spacing w:before="40" w:after="40"/>
+              <w:jc w:val="center"/>
+            </w:pPr>
+            <w:r>
+              <w:rPr>
+                <w:rFonts w:ascii="Times New Roman" w:hAnsi="Times New Roman"/>
+                <w:b/>
                 <w:color w:val="000000"/>
                 <w:sz w:val="22"/>
               </w:rPr>
               <w:t>BVA</w:t>
-            </w:r>
-          </w:p>
-        </w:tc>
-        <w:tc>
-          <w:tcPr>
-            <w:tcW w:w="3744" w:type="dxa"/>
-            <w:shd w:val="clear" w:color="auto" w:fill="FFFFFF"/>
-          </w:tcPr>
-          <w:p>
-            <w:pPr>
-              <w:spacing w:before="20" w:after="20"/>
-            </w:pPr>
-            <w:r>
-              <w:rPr>
-                <w:rFonts w:ascii="Times New Roman" w:hAnsi="Times New Roman"/>
-                <w:color w:val="000000"/>
-                <w:sz w:val="22"/>
-              </w:rPr>
-              <w:t>Lập chứng cứ khi hàng lỗi hoặc từ chối hoàn.</w:t>
             </w:r>
           </w:p>
         </w:tc>
       </w:tr>
       <w:tr>
-        <w:trPr>
-          <w:jc w:val="center"/>
-        </w:trPr>
-        <w:tc>
-          <w:tcPr>
-            <w:tcW w:w="2880" w:type="dxa"/>
-            <w:shd w:val="clear" w:color="auto" w:fill="F5F5F5"/>
-          </w:tcPr>
-          <w:p>
-            <w:pPr>
-              <w:spacing w:before="20" w:after="20"/>
+        <w:tc>
+          <w:tcPr>
+            <w:tcW w:type="dxa" w:w="4608"/>
+            <w:shd w:fill="F5F5F5"/>
+          </w:tcPr>
+          <w:p>
+            <w:pPr>
+              <w:spacing w:before="40" w:after="40"/>
             </w:pPr>
             <w:r>
               <w:rPr>
@@ -1388,12 +1134,12 @@
         </w:tc>
         <w:tc>
           <w:tcPr>
-            <w:tcW w:w="1584" w:type="dxa"/>
-            <w:shd w:val="clear" w:color="auto" w:fill="F5F5F5"/>
-          </w:tcPr>
-          <w:p>
-            <w:pPr>
-              <w:spacing w:before="20" w:after="20"/>
+            <w:tcW w:type="dxa" w:w="2592"/>
+            <w:shd w:fill="F5F5F5"/>
+          </w:tcPr>
+          <w:p>
+            <w:pPr>
+              <w:spacing w:before="40" w:after="40"/>
             </w:pPr>
             <w:r>
               <w:rPr>
@@ -1407,55 +1153,35 @@
         </w:tc>
         <w:tc>
           <w:tcPr>
-            <w:tcW w:w="1152" w:type="dxa"/>
-            <w:shd w:val="clear" w:color="auto" w:fill="F5F5F5"/>
-          </w:tcPr>
-          <w:p>
-            <w:pPr>
-              <w:spacing w:before="20" w:after="20"/>
-            </w:pPr>
-            <w:r>
-              <w:rPr>
-                <w:rFonts w:ascii="Times New Roman" w:hAnsi="Times New Roman"/>
+            <w:tcW w:type="dxa" w:w="2160"/>
+            <w:shd w:fill="F5F5F5"/>
+          </w:tcPr>
+          <w:p>
+            <w:pPr>
+              <w:spacing w:before="40" w:after="40"/>
+              <w:jc w:val="center"/>
+            </w:pPr>
+            <w:r>
+              <w:rPr>
+                <w:rFonts w:ascii="Times New Roman" w:hAnsi="Times New Roman"/>
+                <w:b/>
                 <w:color w:val="000000"/>
                 <w:sz w:val="22"/>
               </w:rPr>
               <w:t>VA</w:t>
-            </w:r>
-          </w:p>
-        </w:tc>
-        <w:tc>
-          <w:tcPr>
-            <w:tcW w:w="3744" w:type="dxa"/>
-            <w:shd w:val="clear" w:color="auto" w:fill="F5F5F5"/>
-          </w:tcPr>
-          <w:p>
-            <w:pPr>
-              <w:spacing w:before="20" w:after="20"/>
-            </w:pPr>
-            <w:r>
-              <w:rPr>
-                <w:rFonts w:ascii="Times New Roman" w:hAnsi="Times New Roman"/>
-                <w:color w:val="000000"/>
-                <w:sz w:val="22"/>
-              </w:rPr>
-              <w:t>Giao trả hàng về cho shop/người gửi.</w:t>
             </w:r>
           </w:p>
         </w:tc>
       </w:tr>
       <w:tr>
-        <w:trPr>
-          <w:jc w:val="center"/>
-        </w:trPr>
-        <w:tc>
-          <w:tcPr>
-            <w:tcW w:w="2880" w:type="dxa"/>
-            <w:shd w:val="clear" w:color="auto" w:fill="FFFFFF"/>
-          </w:tcPr>
-          <w:p>
-            <w:pPr>
-              <w:spacing w:before="20" w:after="20"/>
+        <w:tc>
+          <w:tcPr>
+            <w:tcW w:type="dxa" w:w="4608"/>
+            <w:shd w:fill="FFFFFF"/>
+          </w:tcPr>
+          <w:p>
+            <w:pPr>
+              <w:spacing w:before="40" w:after="40"/>
             </w:pPr>
             <w:r>
               <w:rPr>
@@ -1469,12 +1195,12 @@
         </w:tc>
         <w:tc>
           <w:tcPr>
-            <w:tcW w:w="1584" w:type="dxa"/>
-            <w:shd w:val="clear" w:color="auto" w:fill="FFFFFF"/>
-          </w:tcPr>
-          <w:p>
-            <w:pPr>
-              <w:spacing w:before="20" w:after="20"/>
+            <w:tcW w:type="dxa" w:w="2592"/>
+            <w:shd w:fill="FFFFFF"/>
+          </w:tcPr>
+          <w:p>
+            <w:pPr>
+              <w:spacing w:before="40" w:after="40"/>
             </w:pPr>
             <w:r>
               <w:rPr>
@@ -1488,55 +1214,35 @@
         </w:tc>
         <w:tc>
           <w:tcPr>
-            <w:tcW w:w="1152" w:type="dxa"/>
-            <w:shd w:val="clear" w:color="auto" w:fill="FFFFFF"/>
-          </w:tcPr>
-          <w:p>
-            <w:pPr>
-              <w:spacing w:before="20" w:after="20"/>
-            </w:pPr>
-            <w:r>
-              <w:rPr>
-                <w:rFonts w:ascii="Times New Roman" w:hAnsi="Times New Roman"/>
+            <w:tcW w:type="dxa" w:w="2160"/>
+            <w:shd w:fill="FFFFFF"/>
+          </w:tcPr>
+          <w:p>
+            <w:pPr>
+              <w:spacing w:before="40" w:after="40"/>
+              <w:jc w:val="center"/>
+            </w:pPr>
+            <w:r>
+              <w:rPr>
+                <w:rFonts w:ascii="Times New Roman" w:hAnsi="Times New Roman"/>
+                <w:b/>
                 <w:color w:val="000000"/>
                 <w:sz w:val="22"/>
               </w:rPr>
               <w:t>BVA</w:t>
-            </w:r>
-          </w:p>
-        </w:tc>
-        <w:tc>
-          <w:tcPr>
-            <w:tcW w:w="3744" w:type="dxa"/>
-            <w:shd w:val="clear" w:color="auto" w:fill="FFFFFF"/>
-          </w:tcPr>
-          <w:p>
-            <w:pPr>
-              <w:spacing w:before="20" w:after="20"/>
-            </w:pPr>
-            <w:r>
-              <w:rPr>
-                <w:rFonts w:ascii="Times New Roman" w:hAnsi="Times New Roman"/>
-                <w:color w:val="000000"/>
-                <w:sz w:val="22"/>
-              </w:rPr>
-              <w:t>Cập nhật WMS đóng luồng hàng vật lý.</w:t>
             </w:r>
           </w:p>
         </w:tc>
       </w:tr>
       <w:tr>
-        <w:trPr>
-          <w:jc w:val="center"/>
-        </w:trPr>
-        <w:tc>
-          <w:tcPr>
-            <w:tcW w:w="2880" w:type="dxa"/>
-            <w:shd w:val="clear" w:color="auto" w:fill="F5F5F5"/>
-          </w:tcPr>
-          <w:p>
-            <w:pPr>
-              <w:spacing w:before="20" w:after="20"/>
+        <w:tc>
+          <w:tcPr>
+            <w:tcW w:type="dxa" w:w="4608"/>
+            <w:shd w:fill="F5F5F5"/>
+          </w:tcPr>
+          <w:p>
+            <w:pPr>
+              <w:spacing w:before="40" w:after="40"/>
             </w:pPr>
             <w:r>
               <w:rPr>
@@ -1550,12 +1256,12 @@
         </w:tc>
         <w:tc>
           <w:tcPr>
-            <w:tcW w:w="1584" w:type="dxa"/>
-            <w:shd w:val="clear" w:color="auto" w:fill="F5F5F5"/>
-          </w:tcPr>
-          <w:p>
-            <w:pPr>
-              <w:spacing w:before="20" w:after="20"/>
+            <w:tcW w:type="dxa" w:w="2592"/>
+            <w:shd w:fill="F5F5F5"/>
+          </w:tcPr>
+          <w:p>
+            <w:pPr>
+              <w:spacing w:before="40" w:after="40"/>
             </w:pPr>
             <w:r>
               <w:rPr>
@@ -1569,55 +1275,35 @@
         </w:tc>
         <w:tc>
           <w:tcPr>
-            <w:tcW w:w="1152" w:type="dxa"/>
-            <w:shd w:val="clear" w:color="auto" w:fill="F5F5F5"/>
-          </w:tcPr>
-          <w:p>
-            <w:pPr>
-              <w:spacing w:before="20" w:after="20"/>
-            </w:pPr>
-            <w:r>
-              <w:rPr>
-                <w:rFonts w:ascii="Times New Roman" w:hAnsi="Times New Roman"/>
+            <w:tcW w:type="dxa" w:w="2160"/>
+            <w:shd w:fill="F5F5F5"/>
+          </w:tcPr>
+          <w:p>
+            <w:pPr>
+              <w:spacing w:before="40" w:after="40"/>
+              <w:jc w:val="center"/>
+            </w:pPr>
+            <w:r>
+              <w:rPr>
+                <w:rFonts w:ascii="Times New Roman" w:hAnsi="Times New Roman"/>
+                <w:b/>
                 <w:color w:val="000000"/>
                 <w:sz w:val="22"/>
               </w:rPr>
               <w:t>VA</w:t>
-            </w:r>
-          </w:p>
-        </w:tc>
-        <w:tc>
-          <w:tcPr>
-            <w:tcW w:w="3744" w:type="dxa"/>
-            <w:shd w:val="clear" w:color="auto" w:fill="F5F5F5"/>
-          </w:tcPr>
-          <w:p>
-            <w:pPr>
-              <w:spacing w:before="20" w:after="20"/>
-            </w:pPr>
-            <w:r>
-              <w:rPr>
-                <w:rFonts w:ascii="Times New Roman" w:hAnsi="Times New Roman"/>
-                <w:color w:val="000000"/>
-                <w:sz w:val="22"/>
-              </w:rPr>
-              <w:t>Đưa phương án đền bù cho khách.</w:t>
             </w:r>
           </w:p>
         </w:tc>
       </w:tr>
       <w:tr>
-        <w:trPr>
-          <w:jc w:val="center"/>
-        </w:trPr>
-        <w:tc>
-          <w:tcPr>
-            <w:tcW w:w="2880" w:type="dxa"/>
-            <w:shd w:val="clear" w:color="auto" w:fill="FFFFFF"/>
-          </w:tcPr>
-          <w:p>
-            <w:pPr>
-              <w:spacing w:before="20" w:after="20"/>
+        <w:tc>
+          <w:tcPr>
+            <w:tcW w:type="dxa" w:w="4608"/>
+            <w:shd w:fill="FFFFFF"/>
+          </w:tcPr>
+          <w:p>
+            <w:pPr>
+              <w:spacing w:before="40" w:after="40"/>
             </w:pPr>
             <w:r>
               <w:rPr>
@@ -1631,12 +1317,12 @@
         </w:tc>
         <w:tc>
           <w:tcPr>
-            <w:tcW w:w="1584" w:type="dxa"/>
-            <w:shd w:val="clear" w:color="auto" w:fill="FFFFFF"/>
-          </w:tcPr>
-          <w:p>
-            <w:pPr>
-              <w:spacing w:before="20" w:after="20"/>
+            <w:tcW w:type="dxa" w:w="2592"/>
+            <w:shd w:fill="FFFFFF"/>
+          </w:tcPr>
+          <w:p>
+            <w:pPr>
+              <w:spacing w:before="40" w:after="40"/>
             </w:pPr>
             <w:r>
               <w:rPr>
@@ -1650,55 +1336,35 @@
         </w:tc>
         <w:tc>
           <w:tcPr>
-            <w:tcW w:w="1152" w:type="dxa"/>
-            <w:shd w:val="clear" w:color="auto" w:fill="FFFFFF"/>
-          </w:tcPr>
-          <w:p>
-            <w:pPr>
-              <w:spacing w:before="20" w:after="20"/>
-            </w:pPr>
-            <w:r>
-              <w:rPr>
-                <w:rFonts w:ascii="Times New Roman" w:hAnsi="Times New Roman"/>
+            <w:tcW w:type="dxa" w:w="2160"/>
+            <w:shd w:fill="FFFFFF"/>
+          </w:tcPr>
+          <w:p>
+            <w:pPr>
+              <w:spacing w:before="40" w:after="40"/>
+              <w:jc w:val="center"/>
+            </w:pPr>
+            <w:r>
+              <w:rPr>
+                <w:rFonts w:ascii="Times New Roman" w:hAnsi="Times New Roman"/>
+                <w:b/>
                 <w:color w:val="000000"/>
                 <w:sz w:val="22"/>
               </w:rPr>
               <w:t>VA</w:t>
-            </w:r>
-          </w:p>
-        </w:tc>
-        <w:tc>
-          <w:tcPr>
-            <w:tcW w:w="3744" w:type="dxa"/>
-            <w:shd w:val="clear" w:color="auto" w:fill="FFFFFF"/>
-          </w:tcPr>
-          <w:p>
-            <w:pPr>
-              <w:spacing w:before="20" w:after="20"/>
-            </w:pPr>
-            <w:r>
-              <w:rPr>
-                <w:rFonts w:ascii="Times New Roman" w:hAnsi="Times New Roman"/>
-                <w:color w:val="000000"/>
-                <w:sz w:val="22"/>
-              </w:rPr>
-              <w:t>Hướng dẫn chính sách cho khách.</w:t>
             </w:r>
           </w:p>
         </w:tc>
       </w:tr>
       <w:tr>
-        <w:trPr>
-          <w:jc w:val="center"/>
-        </w:trPr>
-        <w:tc>
-          <w:tcPr>
-            <w:tcW w:w="2880" w:type="dxa"/>
-            <w:shd w:val="clear" w:color="auto" w:fill="F5F5F5"/>
-          </w:tcPr>
-          <w:p>
-            <w:pPr>
-              <w:spacing w:before="20" w:after="20"/>
+        <w:tc>
+          <w:tcPr>
+            <w:tcW w:type="dxa" w:w="4608"/>
+            <w:shd w:fill="F5F5F5"/>
+          </w:tcPr>
+          <w:p>
+            <w:pPr>
+              <w:spacing w:before="40" w:after="40"/>
             </w:pPr>
             <w:r>
               <w:rPr>
@@ -1712,12 +1378,12 @@
         </w:tc>
         <w:tc>
           <w:tcPr>
-            <w:tcW w:w="1584" w:type="dxa"/>
-            <w:shd w:val="clear" w:color="auto" w:fill="F5F5F5"/>
-          </w:tcPr>
-          <w:p>
-            <w:pPr>
-              <w:spacing w:before="20" w:after="20"/>
+            <w:tcW w:type="dxa" w:w="2592"/>
+            <w:shd w:fill="F5F5F5"/>
+          </w:tcPr>
+          <w:p>
+            <w:pPr>
+              <w:spacing w:before="40" w:after="40"/>
             </w:pPr>
             <w:r>
               <w:rPr>
@@ -1731,55 +1397,35 @@
         </w:tc>
         <w:tc>
           <w:tcPr>
-            <w:tcW w:w="1152" w:type="dxa"/>
-            <w:shd w:val="clear" w:color="auto" w:fill="F5F5F5"/>
-          </w:tcPr>
-          <w:p>
-            <w:pPr>
-              <w:spacing w:before="20" w:after="20"/>
-            </w:pPr>
-            <w:r>
-              <w:rPr>
-                <w:rFonts w:ascii="Times New Roman" w:hAnsi="Times New Roman"/>
+            <w:tcW w:type="dxa" w:w="2160"/>
+            <w:shd w:fill="F5F5F5"/>
+          </w:tcPr>
+          <w:p>
+            <w:pPr>
+              <w:spacing w:before="40" w:after="40"/>
+              <w:jc w:val="center"/>
+            </w:pPr>
+            <w:r>
+              <w:rPr>
+                <w:rFonts w:ascii="Times New Roman" w:hAnsi="Times New Roman"/>
+                <w:b/>
                 <w:color w:val="000000"/>
                 <w:sz w:val="22"/>
               </w:rPr>
               <w:t>BVA</w:t>
-            </w:r>
-          </w:p>
-        </w:tc>
-        <w:tc>
-          <w:tcPr>
-            <w:tcW w:w="3744" w:type="dxa"/>
-            <w:shd w:val="clear" w:color="auto" w:fill="F5F5F5"/>
-          </w:tcPr>
-          <w:p>
-            <w:pPr>
-              <w:spacing w:before="20" w:after="20"/>
-            </w:pPr>
-            <w:r>
-              <w:rPr>
-                <w:rFonts w:ascii="Times New Roman" w:hAnsi="Times New Roman"/>
-                <w:color w:val="000000"/>
-                <w:sz w:val="22"/>
-              </w:rPr>
-              <w:t>Gửi thông báo qua App/SMS.</w:t>
             </w:r>
           </w:p>
         </w:tc>
       </w:tr>
       <w:tr>
-        <w:trPr>
-          <w:jc w:val="center"/>
-        </w:trPr>
-        <w:tc>
-          <w:tcPr>
-            <w:tcW w:w="2880" w:type="dxa"/>
-            <w:shd w:val="clear" w:color="auto" w:fill="FFFFFF"/>
-          </w:tcPr>
-          <w:p>
-            <w:pPr>
-              <w:spacing w:before="20" w:after="20"/>
+        <w:tc>
+          <w:tcPr>
+            <w:tcW w:type="dxa" w:w="4608"/>
+            <w:shd w:fill="FFFFFF"/>
+          </w:tcPr>
+          <w:p>
+            <w:pPr>
+              <w:spacing w:before="40" w:after="40"/>
             </w:pPr>
             <w:r>
               <w:rPr>
@@ -1793,12 +1439,12 @@
         </w:tc>
         <w:tc>
           <w:tcPr>
-            <w:tcW w:w="1584" w:type="dxa"/>
-            <w:shd w:val="clear" w:color="auto" w:fill="FFFFFF"/>
-          </w:tcPr>
-          <w:p>
-            <w:pPr>
-              <w:spacing w:before="20" w:after="20"/>
+            <w:tcW w:type="dxa" w:w="2592"/>
+            <w:shd w:fill="FFFFFF"/>
+          </w:tcPr>
+          <w:p>
+            <w:pPr>
+              <w:spacing w:before="40" w:after="40"/>
             </w:pPr>
             <w:r>
               <w:rPr>
@@ -1812,55 +1458,35 @@
         </w:tc>
         <w:tc>
           <w:tcPr>
-            <w:tcW w:w="1152" w:type="dxa"/>
-            <w:shd w:val="clear" w:color="auto" w:fill="FFFFFF"/>
-          </w:tcPr>
-          <w:p>
-            <w:pPr>
-              <w:spacing w:before="20" w:after="20"/>
-            </w:pPr>
-            <w:r>
-              <w:rPr>
-                <w:rFonts w:ascii="Times New Roman" w:hAnsi="Times New Roman"/>
+            <w:tcW w:type="dxa" w:w="2160"/>
+            <w:shd w:fill="FFFFFF"/>
+          </w:tcPr>
+          <w:p>
+            <w:pPr>
+              <w:spacing w:before="40" w:after="40"/>
+              <w:jc w:val="center"/>
+            </w:pPr>
+            <w:r>
+              <w:rPr>
+                <w:rFonts w:ascii="Times New Roman" w:hAnsi="Times New Roman"/>
+                <w:b/>
                 <w:color w:val="000000"/>
                 <w:sz w:val="22"/>
               </w:rPr>
               <w:t>VA</w:t>
-            </w:r>
-          </w:p>
-        </w:tc>
-        <w:tc>
-          <w:tcPr>
-            <w:tcW w:w="3744" w:type="dxa"/>
-            <w:shd w:val="clear" w:color="auto" w:fill="FFFFFF"/>
-          </w:tcPr>
-          <w:p>
-            <w:pPr>
-              <w:spacing w:before="20" w:after="20"/>
-            </w:pPr>
-            <w:r>
-              <w:rPr>
-                <w:rFonts w:ascii="Times New Roman" w:hAnsi="Times New Roman"/>
-                <w:color w:val="000000"/>
-                <w:sz w:val="22"/>
-              </w:rPr>
-              <w:t>Khách nghiệm thu kết quả xử lý.</w:t>
             </w:r>
           </w:p>
         </w:tc>
       </w:tr>
       <w:tr>
-        <w:trPr>
-          <w:jc w:val="center"/>
-        </w:trPr>
-        <w:tc>
-          <w:tcPr>
-            <w:tcW w:w="2880" w:type="dxa"/>
-            <w:shd w:val="clear" w:color="auto" w:fill="F5F5F5"/>
-          </w:tcPr>
-          <w:p>
-            <w:pPr>
-              <w:spacing w:before="20" w:after="20"/>
+        <w:tc>
+          <w:tcPr>
+            <w:tcW w:type="dxa" w:w="4608"/>
+            <w:shd w:fill="F5F5F5"/>
+          </w:tcPr>
+          <w:p>
+            <w:pPr>
+              <w:spacing w:before="40" w:after="40"/>
             </w:pPr>
             <w:r>
               <w:rPr>
@@ -1874,12 +1500,12 @@
         </w:tc>
         <w:tc>
           <w:tcPr>
-            <w:tcW w:w="1584" w:type="dxa"/>
-            <w:shd w:val="clear" w:color="auto" w:fill="F5F5F5"/>
-          </w:tcPr>
-          <w:p>
-            <w:pPr>
-              <w:spacing w:before="20" w:after="20"/>
+            <w:tcW w:type="dxa" w:w="2592"/>
+            <w:shd w:fill="F5F5F5"/>
+          </w:tcPr>
+          <w:p>
+            <w:pPr>
+              <w:spacing w:before="40" w:after="40"/>
             </w:pPr>
             <w:r>
               <w:rPr>
@@ -1893,39 +1519,22 @@
         </w:tc>
         <w:tc>
           <w:tcPr>
-            <w:tcW w:w="1152" w:type="dxa"/>
-            <w:shd w:val="clear" w:color="auto" w:fill="F5F5F5"/>
-          </w:tcPr>
-          <w:p>
-            <w:pPr>
-              <w:spacing w:before="20" w:after="20"/>
-            </w:pPr>
-            <w:r>
-              <w:rPr>
-                <w:rFonts w:ascii="Times New Roman" w:hAnsi="Times New Roman"/>
+            <w:tcW w:type="dxa" w:w="2160"/>
+            <w:shd w:fill="F5F5F5"/>
+          </w:tcPr>
+          <w:p>
+            <w:pPr>
+              <w:spacing w:before="40" w:after="40"/>
+              <w:jc w:val="center"/>
+            </w:pPr>
+            <w:r>
+              <w:rPr>
+                <w:rFonts w:ascii="Times New Roman" w:hAnsi="Times New Roman"/>
+                <w:b/>
                 <w:color w:val="000000"/>
                 <w:sz w:val="22"/>
               </w:rPr>
               <w:t>BVA</w:t>
-            </w:r>
-          </w:p>
-        </w:tc>
-        <w:tc>
-          <w:tcPr>
-            <w:tcW w:w="3744" w:type="dxa"/>
-            <w:shd w:val="clear" w:color="auto" w:fill="F5F5F5"/>
-          </w:tcPr>
-          <w:p>
-            <w:pPr>
-              <w:spacing w:before="20" w:after="20"/>
-            </w:pPr>
-            <w:r>
-              <w:rPr>
-                <w:rFonts w:ascii="Times New Roman" w:hAnsi="Times New Roman"/>
-                <w:color w:val="000000"/>
-                <w:sz w:val="22"/>
-              </w:rPr>
-              <w:t>Lưu hồ sơ phục vụ đối soát và báo cáo.</w:t>
             </w:r>
           </w:p>
         </w:tc>
@@ -1938,7 +1547,7 @@
     </w:p>
     <w:p>
       <w:pPr>
-        <w:spacing w:before="120" w:after="60"/>
+        <w:spacing w:before="200" w:after="80"/>
       </w:pPr>
       <w:r>
         <w:rPr>
@@ -1973,6 +1582,7 @@
           </w:tcPr>
           <w:p>
             <w:pPr>
+              <w:spacing w:before="40" w:after="40"/>
               <w:jc w:val="center"/>
             </w:pPr>
             <w:r>
@@ -1993,6 +1603,7 @@
           </w:tcPr>
           <w:p>
             <w:pPr>
+              <w:spacing w:before="40" w:after="40"/>
               <w:jc w:val="center"/>
             </w:pPr>
             <w:r>
@@ -2013,6 +1624,7 @@
           </w:tcPr>
           <w:p>
             <w:pPr>
+              <w:spacing w:before="40" w:after="40"/>
               <w:jc w:val="center"/>
             </w:pPr>
             <w:r>
@@ -2033,6 +1645,7 @@
           </w:tcPr>
           <w:p>
             <w:pPr>
+              <w:spacing w:before="40" w:after="40"/>
               <w:jc w:val="center"/>
             </w:pPr>
             <w:r>
@@ -2058,7 +1671,7 @@
           </w:tcPr>
           <w:p>
             <w:pPr>
-              <w:spacing w:before="20" w:after="20"/>
+              <w:spacing w:before="40" w:after="40"/>
             </w:pPr>
             <w:r>
               <w:rPr>
@@ -2077,7 +1690,7 @@
           </w:tcPr>
           <w:p>
             <w:pPr>
-              <w:spacing w:before="20" w:after="20"/>
+              <w:spacing w:before="40" w:after="40"/>
             </w:pPr>
             <w:r>
               <w:rPr>
@@ -2096,7 +1709,7 @@
           </w:tcPr>
           <w:p>
             <w:pPr>
-              <w:spacing w:before="20" w:after="20"/>
+              <w:spacing w:before="40" w:after="40"/>
             </w:pPr>
             <w:r>
               <w:rPr>
@@ -2115,7 +1728,7 @@
           </w:tcPr>
           <w:p>
             <w:pPr>
-              <w:spacing w:before="20" w:after="20"/>
+              <w:spacing w:before="40" w:after="40"/>
             </w:pPr>
             <w:r>
               <w:rPr>
@@ -2139,7 +1752,7 @@
           </w:tcPr>
           <w:p>
             <w:pPr>
-              <w:spacing w:before="20" w:after="20"/>
+              <w:spacing w:before="40" w:after="40"/>
             </w:pPr>
             <w:r>
               <w:rPr>
@@ -2158,7 +1771,7 @@
           </w:tcPr>
           <w:p>
             <w:pPr>
-              <w:spacing w:before="20" w:after="20"/>
+              <w:spacing w:before="40" w:after="40"/>
             </w:pPr>
             <w:r>
               <w:rPr>
@@ -2177,7 +1790,7 @@
           </w:tcPr>
           <w:p>
             <w:pPr>
-              <w:spacing w:before="20" w:after="20"/>
+              <w:spacing w:before="40" w:after="40"/>
             </w:pPr>
             <w:r>
               <w:rPr>
@@ -2196,7 +1809,7 @@
           </w:tcPr>
           <w:p>
             <w:pPr>
-              <w:spacing w:before="20" w:after="20"/>
+              <w:spacing w:before="40" w:after="40"/>
             </w:pPr>
             <w:r>
               <w:rPr>
@@ -2220,7 +1833,7 @@
           </w:tcPr>
           <w:p>
             <w:pPr>
-              <w:spacing w:before="20" w:after="20"/>
+              <w:spacing w:before="40" w:after="40"/>
             </w:pPr>
             <w:r>
               <w:rPr>
@@ -2239,7 +1852,7 @@
           </w:tcPr>
           <w:p>
             <w:pPr>
-              <w:spacing w:before="20" w:after="20"/>
+              <w:spacing w:before="40" w:after="40"/>
             </w:pPr>
             <w:r>
               <w:rPr>
@@ -2258,7 +1871,7 @@
           </w:tcPr>
           <w:p>
             <w:pPr>
-              <w:spacing w:before="20" w:after="20"/>
+              <w:spacing w:before="40" w:after="40"/>
             </w:pPr>
             <w:r>
               <w:rPr>
@@ -2277,7 +1890,7 @@
           </w:tcPr>
           <w:p>
             <w:pPr>
-              <w:spacing w:before="20" w:after="20"/>
+              <w:spacing w:before="40" w:after="40"/>
             </w:pPr>
             <w:r>
               <w:rPr>
@@ -2301,7 +1914,7 @@
           </w:tcPr>
           <w:p>
             <w:pPr>
-              <w:spacing w:before="20" w:after="20"/>
+              <w:spacing w:before="40" w:after="40"/>
             </w:pPr>
             <w:r>
               <w:rPr>
@@ -2320,7 +1933,7 @@
           </w:tcPr>
           <w:p>
             <w:pPr>
-              <w:spacing w:before="20" w:after="20"/>
+              <w:spacing w:before="40" w:after="40"/>
             </w:pPr>
             <w:r>
               <w:rPr>
@@ -2339,7 +1952,7 @@
           </w:tcPr>
           <w:p>
             <w:pPr>
-              <w:spacing w:before="20" w:after="20"/>
+              <w:spacing w:before="40" w:after="40"/>
             </w:pPr>
             <w:r>
               <w:rPr>
@@ -2358,7 +1971,7 @@
           </w:tcPr>
           <w:p>
             <w:pPr>
-              <w:spacing w:before="20" w:after="20"/>
+              <w:spacing w:before="40" w:after="40"/>
             </w:pPr>
             <w:r>
               <w:rPr>
@@ -2382,7 +1995,7 @@
           </w:tcPr>
           <w:p>
             <w:pPr>
-              <w:spacing w:before="20" w:after="20"/>
+              <w:spacing w:before="40" w:after="40"/>
             </w:pPr>
             <w:r>
               <w:rPr>
@@ -2401,7 +2014,7 @@
           </w:tcPr>
           <w:p>
             <w:pPr>
-              <w:spacing w:before="20" w:after="20"/>
+              <w:spacing w:before="40" w:after="40"/>
             </w:pPr>
             <w:r>
               <w:rPr>
@@ -2420,7 +2033,7 @@
           </w:tcPr>
           <w:p>
             <w:pPr>
-              <w:spacing w:before="20" w:after="20"/>
+              <w:spacing w:before="40" w:after="40"/>
             </w:pPr>
             <w:r>
               <w:rPr>
@@ -2439,7 +2052,7 @@
           </w:tcPr>
           <w:p>
             <w:pPr>
-              <w:spacing w:before="20" w:after="20"/>
+              <w:spacing w:before="40" w:after="40"/>
             </w:pPr>
             <w:r>
               <w:rPr>
@@ -2463,7 +2076,7 @@
           </w:tcPr>
           <w:p>
             <w:pPr>
-              <w:spacing w:before="20" w:after="20"/>
+              <w:spacing w:before="40" w:after="40"/>
             </w:pPr>
             <w:r>
               <w:rPr>
@@ -2482,7 +2095,7 @@
           </w:tcPr>
           <w:p>
             <w:pPr>
-              <w:spacing w:before="20" w:after="20"/>
+              <w:spacing w:before="40" w:after="40"/>
             </w:pPr>
             <w:r>
               <w:rPr>
@@ -2501,7 +2114,7 @@
           </w:tcPr>
           <w:p>
             <w:pPr>
-              <w:spacing w:before="20" w:after="20"/>
+              <w:spacing w:before="40" w:after="40"/>
             </w:pPr>
             <w:r>
               <w:rPr>
@@ -2520,7 +2133,7 @@
           </w:tcPr>
           <w:p>
             <w:pPr>
-              <w:spacing w:before="20" w:after="20"/>
+              <w:spacing w:before="40" w:after="40"/>
             </w:pPr>
             <w:r>
               <w:rPr>
@@ -2544,7 +2157,7 @@
           </w:tcPr>
           <w:p>
             <w:pPr>
-              <w:spacing w:before="20" w:after="20"/>
+              <w:spacing w:before="40" w:after="40"/>
             </w:pPr>
             <w:r>
               <w:rPr>
@@ -2563,7 +2176,7 @@
           </w:tcPr>
           <w:p>
             <w:pPr>
-              <w:spacing w:before="20" w:after="20"/>
+              <w:spacing w:before="40" w:after="40"/>
             </w:pPr>
             <w:r>
               <w:rPr>
@@ -2582,7 +2195,7 @@
           </w:tcPr>
           <w:p>
             <w:pPr>
-              <w:spacing w:before="20" w:after="20"/>
+              <w:spacing w:before="40" w:after="40"/>
             </w:pPr>
             <w:r>
               <w:rPr>
@@ -2601,7 +2214,7 @@
           </w:tcPr>
           <w:p>
             <w:pPr>
-              <w:spacing w:before="20" w:after="20"/>
+              <w:spacing w:before="40" w:after="40"/>
             </w:pPr>
             <w:r>
               <w:rPr>
@@ -2622,7 +2235,7 @@
     </w:p>
     <w:p>
       <w:pPr>
-        <w:spacing w:before="120" w:after="60"/>
+        <w:spacing w:before="40" w:after="80"/>
       </w:pPr>
       <w:r>
         <w:rPr>
@@ -2729,7 +2342,7 @@
     </w:p>
     <w:p>
       <w:pPr>
-        <w:spacing w:before="120" w:after="60"/>
+        <w:spacing w:before="200" w:after="80"/>
       </w:pPr>
       <w:r>
         <w:rPr>
@@ -2780,6 +2393,7 @@
           </w:tcPr>
           <w:p>
             <w:pPr>
+              <w:spacing w:before="40" w:after="40"/>
               <w:jc w:val="center"/>
             </w:pPr>
             <w:r>
@@ -2800,6 +2414,7 @@
           </w:tcPr>
           <w:p>
             <w:pPr>
+              <w:spacing w:before="40" w:after="40"/>
               <w:jc w:val="center"/>
             </w:pPr>
             <w:r>
@@ -2820,6 +2435,7 @@
           </w:tcPr>
           <w:p>
             <w:pPr>
+              <w:spacing w:before="40" w:after="40"/>
               <w:jc w:val="center"/>
             </w:pPr>
             <w:r>
@@ -2840,6 +2456,7 @@
           </w:tcPr>
           <w:p>
             <w:pPr>
+              <w:spacing w:before="40" w:after="40"/>
               <w:jc w:val="center"/>
             </w:pPr>
             <w:r>
@@ -2860,6 +2477,7 @@
           </w:tcPr>
           <w:p>
             <w:pPr>
+              <w:spacing w:before="40" w:after="40"/>
               <w:jc w:val="center"/>
             </w:pPr>
             <w:r>
@@ -2880,6 +2498,7 @@
           </w:tcPr>
           <w:p>
             <w:pPr>
+              <w:spacing w:before="40" w:after="40"/>
               <w:jc w:val="center"/>
             </w:pPr>
             <w:r>
@@ -2900,6 +2519,7 @@
           </w:tcPr>
           <w:p>
             <w:pPr>
+              <w:spacing w:before="40" w:after="40"/>
               <w:jc w:val="center"/>
             </w:pPr>
             <w:r>
@@ -2925,7 +2545,7 @@
           </w:tcPr>
           <w:p>
             <w:pPr>
-              <w:spacing w:before="20" w:after="20"/>
+              <w:spacing w:before="40" w:after="40"/>
             </w:pPr>
             <w:r>
               <w:rPr>
@@ -2944,7 +2564,7 @@
           </w:tcPr>
           <w:p>
             <w:pPr>
-              <w:spacing w:before="20" w:after="20"/>
+              <w:spacing w:before="40" w:after="40"/>
             </w:pPr>
             <w:r>
               <w:rPr>
@@ -2963,7 +2583,7 @@
           </w:tcPr>
           <w:p>
             <w:pPr>
-              <w:spacing w:before="20" w:after="20"/>
+              <w:spacing w:before="40" w:after="40"/>
             </w:pPr>
             <w:r>
               <w:rPr>
@@ -2982,7 +2602,7 @@
           </w:tcPr>
           <w:p>
             <w:pPr>
-              <w:spacing w:before="20" w:after="20"/>
+              <w:spacing w:before="40" w:after="40"/>
             </w:pPr>
             <w:r>
               <w:rPr>
@@ -3001,7 +2621,7 @@
           </w:tcPr>
           <w:p>
             <w:pPr>
-              <w:spacing w:before="20" w:after="20"/>
+              <w:spacing w:before="40" w:after="40"/>
             </w:pPr>
             <w:r>
               <w:rPr>
@@ -3020,7 +2640,7 @@
           </w:tcPr>
           <w:p>
             <w:pPr>
-              <w:spacing w:before="20" w:after="20"/>
+              <w:spacing w:before="40" w:after="40"/>
             </w:pPr>
             <w:r>
               <w:rPr>
@@ -3039,7 +2659,7 @@
           </w:tcPr>
           <w:p>
             <w:pPr>
-              <w:spacing w:before="20" w:after="20"/>
+              <w:spacing w:before="40" w:after="40"/>
             </w:pPr>
             <w:r>
               <w:rPr>
@@ -3063,7 +2683,7 @@
           </w:tcPr>
           <w:p>
             <w:pPr>
-              <w:spacing w:before="20" w:after="20"/>
+              <w:spacing w:before="40" w:after="40"/>
             </w:pPr>
             <w:r>
               <w:rPr>
@@ -3082,7 +2702,7 @@
           </w:tcPr>
           <w:p>
             <w:pPr>
-              <w:spacing w:before="20" w:after="20"/>
+              <w:spacing w:before="40" w:after="40"/>
             </w:pPr>
             <w:r>
               <w:rPr>
@@ -3101,7 +2721,7 @@
           </w:tcPr>
           <w:p>
             <w:pPr>
-              <w:spacing w:before="20" w:after="20"/>
+              <w:spacing w:before="40" w:after="40"/>
             </w:pPr>
             <w:r>
               <w:rPr>
@@ -3120,7 +2740,7 @@
           </w:tcPr>
           <w:p>
             <w:pPr>
-              <w:spacing w:before="20" w:after="20"/>
+              <w:spacing w:before="40" w:after="40"/>
             </w:pPr>
             <w:r>
               <w:rPr>
@@ -3139,7 +2759,7 @@
           </w:tcPr>
           <w:p>
             <w:pPr>
-              <w:spacing w:before="20" w:after="20"/>
+              <w:spacing w:before="40" w:after="40"/>
             </w:pPr>
             <w:r>
               <w:rPr>
@@ -3158,7 +2778,7 @@
           </w:tcPr>
           <w:p>
             <w:pPr>
-              <w:spacing w:before="20" w:after="20"/>
+              <w:spacing w:before="40" w:after="40"/>
             </w:pPr>
             <w:r>
               <w:rPr>
@@ -3177,7 +2797,7 @@
           </w:tcPr>
           <w:p>
             <w:pPr>
-              <w:spacing w:before="20" w:after="20"/>
+              <w:spacing w:before="40" w:after="40"/>
             </w:pPr>
             <w:r>
               <w:rPr>
@@ -3201,7 +2821,7 @@
           </w:tcPr>
           <w:p>
             <w:pPr>
-              <w:spacing w:before="20" w:after="20"/>
+              <w:spacing w:before="40" w:after="40"/>
             </w:pPr>
             <w:r>
               <w:rPr>
@@ -3220,7 +2840,7 @@
           </w:tcPr>
           <w:p>
             <w:pPr>
-              <w:spacing w:before="20" w:after="20"/>
+              <w:spacing w:before="40" w:after="40"/>
             </w:pPr>
             <w:r>
               <w:rPr>
@@ -3239,7 +2859,7 @@
           </w:tcPr>
           <w:p>
             <w:pPr>
-              <w:spacing w:before="20" w:after="20"/>
+              <w:spacing w:before="40" w:after="40"/>
             </w:pPr>
             <w:r>
               <w:rPr>
@@ -3258,7 +2878,7 @@
           </w:tcPr>
           <w:p>
             <w:pPr>
-              <w:spacing w:before="20" w:after="20"/>
+              <w:spacing w:before="40" w:after="40"/>
             </w:pPr>
             <w:r>
               <w:rPr>
@@ -3277,7 +2897,7 @@
           </w:tcPr>
           <w:p>
             <w:pPr>
-              <w:spacing w:before="20" w:after="20"/>
+              <w:spacing w:before="40" w:after="40"/>
             </w:pPr>
             <w:r>
               <w:rPr>
@@ -3296,7 +2916,7 @@
           </w:tcPr>
           <w:p>
             <w:pPr>
-              <w:spacing w:before="20" w:after="20"/>
+              <w:spacing w:before="40" w:after="40"/>
             </w:pPr>
             <w:r>
               <w:rPr>
@@ -3315,7 +2935,7 @@
           </w:tcPr>
           <w:p>
             <w:pPr>
-              <w:spacing w:before="20" w:after="20"/>
+              <w:spacing w:before="40" w:after="40"/>
             </w:pPr>
             <w:r>
               <w:rPr>
@@ -3339,7 +2959,7 @@
           </w:tcPr>
           <w:p>
             <w:pPr>
-              <w:spacing w:before="20" w:after="20"/>
+              <w:spacing w:before="40" w:after="40"/>
             </w:pPr>
             <w:r>
               <w:rPr>
@@ -3358,7 +2978,7 @@
           </w:tcPr>
           <w:p>
             <w:pPr>
-              <w:spacing w:before="20" w:after="20"/>
+              <w:spacing w:before="40" w:after="40"/>
             </w:pPr>
             <w:r>
               <w:rPr>
@@ -3377,7 +2997,7 @@
           </w:tcPr>
           <w:p>
             <w:pPr>
-              <w:spacing w:before="20" w:after="20"/>
+              <w:spacing w:before="40" w:after="40"/>
             </w:pPr>
             <w:r>
               <w:rPr>
@@ -3396,7 +3016,7 @@
           </w:tcPr>
           <w:p>
             <w:pPr>
-              <w:spacing w:before="20" w:after="20"/>
+              <w:spacing w:before="40" w:after="40"/>
             </w:pPr>
             <w:r>
               <w:rPr>
@@ -3415,7 +3035,7 @@
           </w:tcPr>
           <w:p>
             <w:pPr>
-              <w:spacing w:before="20" w:after="20"/>
+              <w:spacing w:before="40" w:after="40"/>
             </w:pPr>
             <w:r>
               <w:rPr>
@@ -3434,7 +3054,7 @@
           </w:tcPr>
           <w:p>
             <w:pPr>
-              <w:spacing w:before="20" w:after="20"/>
+              <w:spacing w:before="40" w:after="40"/>
             </w:pPr>
             <w:r>
               <w:rPr>
@@ -3453,7 +3073,7 @@
           </w:tcPr>
           <w:p>
             <w:pPr>
-              <w:spacing w:before="20" w:after="20"/>
+              <w:spacing w:before="40" w:after="40"/>
             </w:pPr>
             <w:r>
               <w:rPr>
@@ -3477,7 +3097,7 @@
           </w:tcPr>
           <w:p>
             <w:pPr>
-              <w:spacing w:before="20" w:after="20"/>
+              <w:spacing w:before="40" w:after="40"/>
             </w:pPr>
             <w:r>
               <w:rPr>
@@ -3496,7 +3116,7 @@
           </w:tcPr>
           <w:p>
             <w:pPr>
-              <w:spacing w:before="20" w:after="20"/>
+              <w:spacing w:before="40" w:after="40"/>
             </w:pPr>
             <w:r>
               <w:rPr>
@@ -3515,7 +3135,7 @@
           </w:tcPr>
           <w:p>
             <w:pPr>
-              <w:spacing w:before="20" w:after="20"/>
+              <w:spacing w:before="40" w:after="40"/>
             </w:pPr>
             <w:r>
               <w:rPr>
@@ -3534,7 +3154,7 @@
           </w:tcPr>
           <w:p>
             <w:pPr>
-              <w:spacing w:before="20" w:after="20"/>
+              <w:spacing w:before="40" w:after="40"/>
             </w:pPr>
             <w:r>
               <w:rPr>
@@ -3553,7 +3173,7 @@
           </w:tcPr>
           <w:p>
             <w:pPr>
-              <w:spacing w:before="20" w:after="20"/>
+              <w:spacing w:before="40" w:after="40"/>
             </w:pPr>
             <w:r>
               <w:rPr>
@@ -3572,7 +3192,7 @@
           </w:tcPr>
           <w:p>
             <w:pPr>
-              <w:spacing w:before="20" w:after="20"/>
+              <w:spacing w:before="40" w:after="40"/>
             </w:pPr>
             <w:r>
               <w:rPr>
@@ -3591,7 +3211,7 @@
           </w:tcPr>
           <w:p>
             <w:pPr>
-              <w:spacing w:before="20" w:after="20"/>
+              <w:spacing w:before="40" w:after="40"/>
             </w:pPr>
             <w:r>
               <w:rPr>
@@ -3615,7 +3235,7 @@
           </w:tcPr>
           <w:p>
             <w:pPr>
-              <w:spacing w:before="20" w:after="20"/>
+              <w:spacing w:before="40" w:after="40"/>
             </w:pPr>
             <w:r>
               <w:rPr>
@@ -3634,7 +3254,7 @@
           </w:tcPr>
           <w:p>
             <w:pPr>
-              <w:spacing w:before="20" w:after="20"/>
+              <w:spacing w:before="40" w:after="40"/>
             </w:pPr>
             <w:r>
               <w:rPr>
@@ -3653,7 +3273,7 @@
           </w:tcPr>
           <w:p>
             <w:pPr>
-              <w:spacing w:before="20" w:after="20"/>
+              <w:spacing w:before="40" w:after="40"/>
             </w:pPr>
             <w:r>
               <w:rPr>
@@ -3672,7 +3292,7 @@
           </w:tcPr>
           <w:p>
             <w:pPr>
-              <w:spacing w:before="20" w:after="20"/>
+              <w:spacing w:before="40" w:after="40"/>
             </w:pPr>
             <w:r>
               <w:rPr>
@@ -3691,7 +3311,7 @@
           </w:tcPr>
           <w:p>
             <w:pPr>
-              <w:spacing w:before="20" w:after="20"/>
+              <w:spacing w:before="40" w:after="40"/>
             </w:pPr>
             <w:r>
               <w:rPr>
@@ -3710,7 +3330,7 @@
           </w:tcPr>
           <w:p>
             <w:pPr>
-              <w:spacing w:before="20" w:after="20"/>
+              <w:spacing w:before="40" w:after="40"/>
             </w:pPr>
             <w:r>
               <w:rPr>
@@ -3729,7 +3349,7 @@
           </w:tcPr>
           <w:p>
             <w:pPr>
-              <w:spacing w:before="20" w:after="20"/>
+              <w:spacing w:before="40" w:after="40"/>
             </w:pPr>
             <w:r>
               <w:rPr>
@@ -3753,7 +3373,7 @@
           </w:tcPr>
           <w:p>
             <w:pPr>
-              <w:spacing w:before="20" w:after="20"/>
+              <w:spacing w:before="40" w:after="40"/>
             </w:pPr>
             <w:r>
               <w:rPr>
@@ -3772,7 +3392,7 @@
           </w:tcPr>
           <w:p>
             <w:pPr>
-              <w:spacing w:before="20" w:after="20"/>
+              <w:spacing w:before="40" w:after="40"/>
             </w:pPr>
             <w:r>
               <w:rPr>
@@ -3791,7 +3411,7 @@
           </w:tcPr>
           <w:p>
             <w:pPr>
-              <w:spacing w:before="20" w:after="20"/>
+              <w:spacing w:before="40" w:after="40"/>
             </w:pPr>
             <w:r>
               <w:rPr>
@@ -3810,7 +3430,7 @@
           </w:tcPr>
           <w:p>
             <w:pPr>
-              <w:spacing w:before="20" w:after="20"/>
+              <w:spacing w:before="40" w:after="40"/>
             </w:pPr>
             <w:r>
               <w:rPr>
@@ -3829,7 +3449,7 @@
           </w:tcPr>
           <w:p>
             <w:pPr>
-              <w:spacing w:before="20" w:after="20"/>
+              <w:spacing w:before="40" w:after="40"/>
             </w:pPr>
             <w:r>
               <w:rPr>
@@ -3848,7 +3468,7 @@
           </w:tcPr>
           <w:p>
             <w:pPr>
-              <w:spacing w:before="20" w:after="20"/>
+              <w:spacing w:before="40" w:after="40"/>
             </w:pPr>
             <w:r>
               <w:rPr>
@@ -3867,7 +3487,7 @@
           </w:tcPr>
           <w:p>
             <w:pPr>
-              <w:spacing w:before="20" w:after="20"/>
+              <w:spacing w:before="40" w:after="40"/>
             </w:pPr>
             <w:r>
               <w:rPr>
@@ -3891,7 +3511,7 @@
           </w:tcPr>
           <w:p>
             <w:pPr>
-              <w:spacing w:before="20" w:after="20"/>
+              <w:spacing w:before="40" w:after="40"/>
             </w:pPr>
             <w:r>
               <w:rPr>
@@ -3910,7 +3530,7 @@
           </w:tcPr>
           <w:p>
             <w:pPr>
-              <w:spacing w:before="20" w:after="20"/>
+              <w:spacing w:before="40" w:after="40"/>
             </w:pPr>
             <w:r>
               <w:rPr>
@@ -3929,7 +3549,7 @@
           </w:tcPr>
           <w:p>
             <w:pPr>
-              <w:spacing w:before="20" w:after="20"/>
+              <w:spacing w:before="40" w:after="40"/>
             </w:pPr>
             <w:r>
               <w:rPr>
@@ -3948,7 +3568,7 @@
           </w:tcPr>
           <w:p>
             <w:pPr>
-              <w:spacing w:before="20" w:after="20"/>
+              <w:spacing w:before="40" w:after="40"/>
             </w:pPr>
             <w:r>
               <w:rPr>
@@ -3967,7 +3587,7 @@
           </w:tcPr>
           <w:p>
             <w:pPr>
-              <w:spacing w:before="20" w:after="20"/>
+              <w:spacing w:before="40" w:after="40"/>
             </w:pPr>
             <w:r>
               <w:rPr>
@@ -3986,7 +3606,7 @@
           </w:tcPr>
           <w:p>
             <w:pPr>
-              <w:spacing w:before="20" w:after="20"/>
+              <w:spacing w:before="40" w:after="40"/>
             </w:pPr>
             <w:r>
               <w:rPr>
@@ -4005,7 +3625,7 @@
           </w:tcPr>
           <w:p>
             <w:pPr>
-              <w:spacing w:before="20" w:after="20"/>
+              <w:spacing w:before="40" w:after="40"/>
             </w:pPr>
             <w:r>
               <w:rPr>
@@ -4029,7 +3649,7 @@
           </w:tcPr>
           <w:p>
             <w:pPr>
-              <w:spacing w:before="20" w:after="20"/>
+              <w:spacing w:before="40" w:after="40"/>
             </w:pPr>
             <w:r>
               <w:rPr>
@@ -4048,7 +3668,7 @@
           </w:tcPr>
           <w:p>
             <w:pPr>
-              <w:spacing w:before="20" w:after="20"/>
+              <w:spacing w:before="40" w:after="40"/>
             </w:pPr>
             <w:r>
               <w:rPr>
@@ -4067,7 +3687,7 @@
           </w:tcPr>
           <w:p>
             <w:pPr>
-              <w:spacing w:before="20" w:after="20"/>
+              <w:spacing w:before="40" w:after="40"/>
             </w:pPr>
             <w:r>
               <w:rPr>
@@ -4086,7 +3706,7 @@
           </w:tcPr>
           <w:p>
             <w:pPr>
-              <w:spacing w:before="20" w:after="20"/>
+              <w:spacing w:before="40" w:after="40"/>
             </w:pPr>
             <w:r>
               <w:rPr>
@@ -4105,7 +3725,7 @@
           </w:tcPr>
           <w:p>
             <w:pPr>
-              <w:spacing w:before="20" w:after="20"/>
+              <w:spacing w:before="40" w:after="40"/>
             </w:pPr>
             <w:r>
               <w:rPr>
@@ -4124,7 +3744,7 @@
           </w:tcPr>
           <w:p>
             <w:pPr>
-              <w:spacing w:before="20" w:after="20"/>
+              <w:spacing w:before="40" w:after="40"/>
             </w:pPr>
             <w:r>
               <w:rPr>
@@ -4143,7 +3763,7 @@
           </w:tcPr>
           <w:p>
             <w:pPr>
-              <w:spacing w:before="20" w:after="20"/>
+              <w:spacing w:before="40" w:after="40"/>
             </w:pPr>
             <w:r>
               <w:rPr>
@@ -4167,7 +3787,7 @@
           </w:tcPr>
           <w:p>
             <w:pPr>
-              <w:spacing w:before="20" w:after="20"/>
+              <w:spacing w:before="40" w:after="40"/>
             </w:pPr>
             <w:r>
               <w:rPr>
@@ -4186,7 +3806,7 @@
           </w:tcPr>
           <w:p>
             <w:pPr>
-              <w:spacing w:before="20" w:after="20"/>
+              <w:spacing w:before="40" w:after="40"/>
             </w:pPr>
             <w:r>
               <w:rPr>
@@ -4205,7 +3825,7 @@
           </w:tcPr>
           <w:p>
             <w:pPr>
-              <w:spacing w:before="20" w:after="20"/>
+              <w:spacing w:before="40" w:after="40"/>
             </w:pPr>
             <w:r>
               <w:rPr>
@@ -4224,7 +3844,7 @@
           </w:tcPr>
           <w:p>
             <w:pPr>
-              <w:spacing w:before="20" w:after="20"/>
+              <w:spacing w:before="40" w:after="40"/>
             </w:pPr>
             <w:r>
               <w:rPr>
@@ -4243,7 +3863,7 @@
           </w:tcPr>
           <w:p>
             <w:pPr>
-              <w:spacing w:before="20" w:after="20"/>
+              <w:spacing w:before="40" w:after="40"/>
             </w:pPr>
             <w:r>
               <w:rPr>
@@ -4262,7 +3882,7 @@
           </w:tcPr>
           <w:p>
             <w:pPr>
-              <w:spacing w:before="20" w:after="20"/>
+              <w:spacing w:before="40" w:after="40"/>
             </w:pPr>
             <w:r>
               <w:rPr>
@@ -4281,7 +3901,7 @@
           </w:tcPr>
           <w:p>
             <w:pPr>
-              <w:spacing w:before="20" w:after="20"/>
+              <w:spacing w:before="40" w:after="40"/>
             </w:pPr>
             <w:r>
               <w:rPr>
@@ -4305,7 +3925,7 @@
           </w:tcPr>
           <w:p>
             <w:pPr>
-              <w:spacing w:before="20" w:after="20"/>
+              <w:spacing w:before="40" w:after="40"/>
             </w:pPr>
             <w:r>
               <w:rPr>
@@ -4324,7 +3944,7 @@
           </w:tcPr>
           <w:p>
             <w:pPr>
-              <w:spacing w:before="20" w:after="20"/>
+              <w:spacing w:before="40" w:after="40"/>
             </w:pPr>
             <w:r>
               <w:rPr>
@@ -4343,7 +3963,7 @@
           </w:tcPr>
           <w:p>
             <w:pPr>
-              <w:spacing w:before="20" w:after="20"/>
+              <w:spacing w:before="40" w:after="40"/>
             </w:pPr>
             <w:r>
               <w:rPr>
@@ -4362,7 +3982,7 @@
           </w:tcPr>
           <w:p>
             <w:pPr>
-              <w:spacing w:before="20" w:after="20"/>
+              <w:spacing w:before="40" w:after="40"/>
             </w:pPr>
             <w:r>
               <w:rPr>
@@ -4381,7 +4001,7 @@
           </w:tcPr>
           <w:p>
             <w:pPr>
-              <w:spacing w:before="20" w:after="20"/>
+              <w:spacing w:before="40" w:after="40"/>
             </w:pPr>
             <w:r>
               <w:rPr>
@@ -4400,7 +4020,7 @@
           </w:tcPr>
           <w:p>
             <w:pPr>
-              <w:spacing w:before="20" w:after="20"/>
+              <w:spacing w:before="40" w:after="40"/>
             </w:pPr>
             <w:r>
               <w:rPr>
@@ -4419,7 +4039,7 @@
           </w:tcPr>
           <w:p>
             <w:pPr>
-              <w:spacing w:before="20" w:after="20"/>
+              <w:spacing w:before="40" w:after="40"/>
             </w:pPr>
             <w:r>
               <w:rPr>
@@ -4443,7 +4063,7 @@
           </w:tcPr>
           <w:p>
             <w:pPr>
-              <w:spacing w:before="20" w:after="20"/>
+              <w:spacing w:before="40" w:after="40"/>
             </w:pPr>
             <w:r>
               <w:rPr>
@@ -4462,7 +4082,7 @@
           </w:tcPr>
           <w:p>
             <w:pPr>
-              <w:spacing w:before="20" w:after="20"/>
+              <w:spacing w:before="40" w:after="40"/>
             </w:pPr>
             <w:r>
               <w:rPr>
@@ -4481,7 +4101,7 @@
           </w:tcPr>
           <w:p>
             <w:pPr>
-              <w:spacing w:before="20" w:after="20"/>
+              <w:spacing w:before="40" w:after="40"/>
             </w:pPr>
             <w:r>
               <w:rPr>
@@ -4500,7 +4120,7 @@
           </w:tcPr>
           <w:p>
             <w:pPr>
-              <w:spacing w:before="20" w:after="20"/>
+              <w:spacing w:before="40" w:after="40"/>
             </w:pPr>
             <w:r>
               <w:rPr>
@@ -4519,7 +4139,7 @@
           </w:tcPr>
           <w:p>
             <w:pPr>
-              <w:spacing w:before="20" w:after="20"/>
+              <w:spacing w:before="40" w:after="40"/>
             </w:pPr>
             <w:r>
               <w:rPr>
@@ -4538,7 +4158,7 @@
           </w:tcPr>
           <w:p>
             <w:pPr>
-              <w:spacing w:before="20" w:after="20"/>
+              <w:spacing w:before="40" w:after="40"/>
             </w:pPr>
             <w:r>
               <w:rPr>
@@ -4557,7 +4177,7 @@
           </w:tcPr>
           <w:p>
             <w:pPr>
-              <w:spacing w:before="20" w:after="20"/>
+              <w:spacing w:before="40" w:after="40"/>
             </w:pPr>
             <w:r>
               <w:rPr>
@@ -4581,7 +4201,7 @@
           </w:tcPr>
           <w:p>
             <w:pPr>
-              <w:spacing w:before="20" w:after="20"/>
+              <w:spacing w:before="40" w:after="40"/>
             </w:pPr>
             <w:r>
               <w:rPr>
@@ -4600,7 +4220,7 @@
           </w:tcPr>
           <w:p>
             <w:pPr>
-              <w:spacing w:before="20" w:after="20"/>
+              <w:spacing w:before="40" w:after="40"/>
             </w:pPr>
             <w:r>
               <w:rPr>
@@ -4619,7 +4239,7 @@
           </w:tcPr>
           <w:p>
             <w:pPr>
-              <w:spacing w:before="20" w:after="20"/>
+              <w:spacing w:before="40" w:after="40"/>
             </w:pPr>
             <w:r>
               <w:rPr>
@@ -4638,7 +4258,7 @@
           </w:tcPr>
           <w:p>
             <w:pPr>
-              <w:spacing w:before="20" w:after="20"/>
+              <w:spacing w:before="40" w:after="40"/>
             </w:pPr>
             <w:r>
               <w:rPr>
@@ -4657,7 +4277,7 @@
           </w:tcPr>
           <w:p>
             <w:pPr>
-              <w:spacing w:before="20" w:after="20"/>
+              <w:spacing w:before="40" w:after="40"/>
             </w:pPr>
             <w:r>
               <w:rPr>
@@ -4676,7 +4296,7 @@
           </w:tcPr>
           <w:p>
             <w:pPr>
-              <w:spacing w:before="20" w:after="20"/>
+              <w:spacing w:before="40" w:after="40"/>
             </w:pPr>
             <w:r>
               <w:rPr>
@@ -4695,7 +4315,7 @@
           </w:tcPr>
           <w:p>
             <w:pPr>
-              <w:spacing w:before="20" w:after="20"/>
+              <w:spacing w:before="40" w:after="40"/>
             </w:pPr>
             <w:r>
               <w:rPr>
@@ -4719,7 +4339,7 @@
           </w:tcPr>
           <w:p>
             <w:pPr>
-              <w:spacing w:before="20" w:after="20"/>
+              <w:spacing w:before="40" w:after="40"/>
             </w:pPr>
             <w:r>
               <w:rPr>
@@ -4738,7 +4358,7 @@
           </w:tcPr>
           <w:p>
             <w:pPr>
-              <w:spacing w:before="20" w:after="20"/>
+              <w:spacing w:before="40" w:after="40"/>
             </w:pPr>
             <w:r>
               <w:rPr>
@@ -4757,7 +4377,7 @@
           </w:tcPr>
           <w:p>
             <w:pPr>
-              <w:spacing w:before="20" w:after="20"/>
+              <w:spacing w:before="40" w:after="40"/>
             </w:pPr>
             <w:r>
               <w:rPr>
@@ -4776,7 +4396,7 @@
           </w:tcPr>
           <w:p>
             <w:pPr>
-              <w:spacing w:before="20" w:after="20"/>
+              <w:spacing w:before="40" w:after="40"/>
             </w:pPr>
             <w:r>
               <w:rPr>
@@ -4795,7 +4415,7 @@
           </w:tcPr>
           <w:p>
             <w:pPr>
-              <w:spacing w:before="20" w:after="20"/>
+              <w:spacing w:before="40" w:after="40"/>
             </w:pPr>
             <w:r>
               <w:rPr>
@@ -4814,7 +4434,7 @@
           </w:tcPr>
           <w:p>
             <w:pPr>
-              <w:spacing w:before="20" w:after="20"/>
+              <w:spacing w:before="40" w:after="40"/>
             </w:pPr>
             <w:r>
               <w:rPr>
@@ -4833,7 +4453,7 @@
           </w:tcPr>
           <w:p>
             <w:pPr>
-              <w:spacing w:before="20" w:after="20"/>
+              <w:spacing w:before="40" w:after="40"/>
             </w:pPr>
             <w:r>
               <w:rPr>
@@ -4857,7 +4477,7 @@
           </w:tcPr>
           <w:p>
             <w:pPr>
-              <w:spacing w:before="20" w:after="20"/>
+              <w:spacing w:before="40" w:after="40"/>
             </w:pPr>
             <w:r>
               <w:rPr>
@@ -4876,7 +4496,7 @@
           </w:tcPr>
           <w:p>
             <w:pPr>
-              <w:spacing w:before="20" w:after="20"/>
+              <w:spacing w:before="40" w:after="40"/>
             </w:pPr>
             <w:r>
               <w:rPr>
@@ -4895,7 +4515,7 @@
           </w:tcPr>
           <w:p>
             <w:pPr>
-              <w:spacing w:before="20" w:after="20"/>
+              <w:spacing w:before="40" w:after="40"/>
             </w:pPr>
             <w:r>
               <w:rPr>
@@ -4914,7 +4534,7 @@
           </w:tcPr>
           <w:p>
             <w:pPr>
-              <w:spacing w:before="20" w:after="20"/>
+              <w:spacing w:before="40" w:after="40"/>
             </w:pPr>
             <w:r>
               <w:rPr>
@@ -4933,7 +4553,7 @@
           </w:tcPr>
           <w:p>
             <w:pPr>
-              <w:spacing w:before="20" w:after="20"/>
+              <w:spacing w:before="40" w:after="40"/>
             </w:pPr>
             <w:r>
               <w:rPr>
@@ -4952,7 +4572,7 @@
           </w:tcPr>
           <w:p>
             <w:pPr>
-              <w:spacing w:before="20" w:after="20"/>
+              <w:spacing w:before="40" w:after="40"/>
             </w:pPr>
             <w:r>
               <w:rPr>
@@ -4971,7 +4591,7 @@
           </w:tcPr>
           <w:p>
             <w:pPr>
-              <w:spacing w:before="20" w:after="20"/>
+              <w:spacing w:before="40" w:after="40"/>
             </w:pPr>
             <w:r>
               <w:rPr>
@@ -4995,7 +4615,7 @@
           </w:tcPr>
           <w:p>
             <w:pPr>
-              <w:spacing w:before="20" w:after="20"/>
+              <w:spacing w:before="40" w:after="40"/>
             </w:pPr>
             <w:r>
               <w:rPr>
@@ -5014,7 +4634,7 @@
           </w:tcPr>
           <w:p>
             <w:pPr>
-              <w:spacing w:before="20" w:after="20"/>
+              <w:spacing w:before="40" w:after="40"/>
             </w:pPr>
             <w:r>
               <w:rPr>
@@ -5033,7 +4653,7 @@
           </w:tcPr>
           <w:p>
             <w:pPr>
-              <w:spacing w:before="20" w:after="20"/>
+              <w:spacing w:before="40" w:after="40"/>
             </w:pPr>
             <w:r>
               <w:rPr>
@@ -5052,7 +4672,7 @@
           </w:tcPr>
           <w:p>
             <w:pPr>
-              <w:spacing w:before="20" w:after="20"/>
+              <w:spacing w:before="40" w:after="40"/>
             </w:pPr>
             <w:r>
               <w:rPr>
@@ -5071,7 +4691,7 @@
           </w:tcPr>
           <w:p>
             <w:pPr>
-              <w:spacing w:before="20" w:after="20"/>
+              <w:spacing w:before="40" w:after="40"/>
             </w:pPr>
             <w:r>
               <w:rPr>
@@ -5090,7 +4710,7 @@
           </w:tcPr>
           <w:p>
             <w:pPr>
-              <w:spacing w:before="20" w:after="20"/>
+              <w:spacing w:before="40" w:after="40"/>
             </w:pPr>
             <w:r>
               <w:rPr>
@@ -5109,7 +4729,7 @@
           </w:tcPr>
           <w:p>
             <w:pPr>
-              <w:spacing w:before="20" w:after="20"/>
+              <w:spacing w:before="40" w:after="40"/>
             </w:pPr>
             <w:r>
               <w:rPr>
@@ -5133,7 +4753,7 @@
           </w:tcPr>
           <w:p>
             <w:pPr>
-              <w:spacing w:before="20" w:after="20"/>
+              <w:spacing w:before="40" w:after="40"/>
             </w:pPr>
             <w:r>
               <w:rPr>
@@ -5152,7 +4772,7 @@
           </w:tcPr>
           <w:p>
             <w:pPr>
-              <w:spacing w:before="20" w:after="20"/>
+              <w:spacing w:before="40" w:after="40"/>
             </w:pPr>
             <w:r>
               <w:rPr>
@@ -5171,7 +4791,7 @@
           </w:tcPr>
           <w:p>
             <w:pPr>
-              <w:spacing w:before="20" w:after="20"/>
+              <w:spacing w:before="40" w:after="40"/>
             </w:pPr>
             <w:r>
               <w:rPr>
@@ -5190,7 +4810,7 @@
           </w:tcPr>
           <w:p>
             <w:pPr>
-              <w:spacing w:before="20" w:after="20"/>
+              <w:spacing w:before="40" w:after="40"/>
             </w:pPr>
             <w:r>
               <w:rPr>
@@ -5209,7 +4829,7 @@
           </w:tcPr>
           <w:p>
             <w:pPr>
-              <w:spacing w:before="20" w:after="20"/>
+              <w:spacing w:before="40" w:after="40"/>
             </w:pPr>
             <w:r>
               <w:rPr>
@@ -5228,7 +4848,7 @@
           </w:tcPr>
           <w:p>
             <w:pPr>
-              <w:spacing w:before="20" w:after="20"/>
+              <w:spacing w:before="40" w:after="40"/>
             </w:pPr>
             <w:r>
               <w:rPr>
@@ -5247,7 +4867,7 @@
           </w:tcPr>
           <w:p>
             <w:pPr>
-              <w:spacing w:before="20" w:after="20"/>
+              <w:spacing w:before="40" w:after="40"/>
             </w:pPr>
             <w:r>
               <w:rPr>
@@ -5271,7 +4891,7 @@
           </w:tcPr>
           <w:p>
             <w:pPr>
-              <w:spacing w:before="20" w:after="20"/>
+              <w:spacing w:before="40" w:after="40"/>
             </w:pPr>
             <w:r>
               <w:rPr>
@@ -5290,7 +4910,7 @@
           </w:tcPr>
           <w:p>
             <w:pPr>
-              <w:spacing w:before="20" w:after="20"/>
+              <w:spacing w:before="40" w:after="40"/>
             </w:pPr>
             <w:r>
               <w:rPr>
@@ -5309,7 +4929,7 @@
           </w:tcPr>
           <w:p>
             <w:pPr>
-              <w:spacing w:before="20" w:after="20"/>
+              <w:spacing w:before="40" w:after="40"/>
             </w:pPr>
             <w:r>
               <w:rPr>
@@ -5328,7 +4948,7 @@
           </w:tcPr>
           <w:p>
             <w:pPr>
-              <w:spacing w:before="20" w:after="20"/>
+              <w:spacing w:before="40" w:after="40"/>
             </w:pPr>
             <w:r>
               <w:rPr>
@@ -5347,7 +4967,7 @@
           </w:tcPr>
           <w:p>
             <w:pPr>
-              <w:spacing w:before="20" w:after="20"/>
+              <w:spacing w:before="40" w:after="40"/>
             </w:pPr>
             <w:r>
               <w:rPr>
@@ -5366,7 +4986,7 @@
           </w:tcPr>
           <w:p>
             <w:pPr>
-              <w:spacing w:before="20" w:after="20"/>
+              <w:spacing w:before="40" w:after="40"/>
             </w:pPr>
             <w:r>
               <w:rPr>
@@ -5385,7 +5005,7 @@
           </w:tcPr>
           <w:p>
             <w:pPr>
-              <w:spacing w:before="20" w:after="20"/>
+              <w:spacing w:before="40" w:after="40"/>
             </w:pPr>
             <w:r>
               <w:rPr>
@@ -5406,7 +5026,7 @@
     </w:p>
     <w:p>
       <w:pPr>
-        <w:spacing w:before="120" w:after="60"/>
+        <w:spacing w:before="200" w:after="80"/>
       </w:pPr>
       <w:r>
         <w:rPr>
@@ -5456,7 +5076,25 @@
           <w:color w:val="000000"/>
           <w:sz w:val="22"/>
         </w:rPr>
-        <w:t>Bước 1-4. Hệ số làm lại 1/(1-0.20) = 1,25.</w:t>
+        <w:t>Bước 1-4. Hệ số làm lại 1</w:t>
+      </w:r>
+      <w:proofErr w:type="gramStart"/>
+      <w:r>
+        <w:rPr>
+          <w:rFonts w:ascii="Times New Roman" w:hAnsi="Times New Roman"/>
+          <w:color w:val="000000"/>
+          <w:sz w:val="22"/>
+        </w:rPr>
+        <w:t>/(</w:t>
+      </w:r>
+      <w:proofErr w:type="gramEnd"/>
+      <w:r>
+        <w:rPr>
+          <w:rFonts w:ascii="Times New Roman" w:hAnsi="Times New Roman"/>
+          <w:color w:val="000000"/>
+          <w:sz w:val="22"/>
+        </w:rPr>
+        <w:t>1-0.20) = 1,25.</w:t>
       </w:r>
     </w:p>
     <w:p>
@@ -5562,20 +5200,56 @@
           <w:color w:val="000000"/>
           <w:sz w:val="22"/>
         </w:rPr>
-        <w:t>T_proc(N1) = 2+30+20+10+(0.85*20+0.15*15)+5 = 86,25 phút.</w:t>
+        <w:t>T_proc(N1) = 2+30+20+10+(0.85*20+0.15*</w:t>
       </w:r>
-    </w:p>
-    <w:p>
-      <w:pPr>
-        <w:spacing w:before="40" w:after="80"/>
-      </w:pPr>
+      <w:proofErr w:type="gramStart"/>
       <w:r>
         <w:rPr>
           <w:rFonts w:ascii="Times New Roman" w:hAnsi="Times New Roman"/>
           <w:color w:val="000000"/>
           <w:sz w:val="22"/>
         </w:rPr>
-        <w:t>T_cycle(N1) = 12+45+50+55+(0.85*80+0.15*45)+15 = 251,75 phút.</w:t>
+        <w:t>15)+</w:t>
+      </w:r>
+      <w:proofErr w:type="gramEnd"/>
+      <w:r>
+        <w:rPr>
+          <w:rFonts w:ascii="Times New Roman" w:hAnsi="Times New Roman"/>
+          <w:color w:val="000000"/>
+          <w:sz w:val="22"/>
+        </w:rPr>
+        <w:t>5 = 86,25 phút.</w:t>
+      </w:r>
+    </w:p>
+    <w:p>
+      <w:pPr>
+        <w:spacing w:before="40" w:after="80"/>
+      </w:pPr>
+      <w:r>
+        <w:rPr>
+          <w:rFonts w:ascii="Times New Roman" w:hAnsi="Times New Roman"/>
+          <w:color w:val="000000"/>
+          <w:sz w:val="22"/>
+        </w:rPr>
+        <w:t>T_cycle(N1) = 12+45+50+55+(0.85*80+0.15*</w:t>
+      </w:r>
+      <w:proofErr w:type="gramStart"/>
+      <w:r>
+        <w:rPr>
+          <w:rFonts w:ascii="Times New Roman" w:hAnsi="Times New Roman"/>
+          <w:color w:val="000000"/>
+          <w:sz w:val="22"/>
+        </w:rPr>
+        <w:t>45)+</w:t>
+      </w:r>
+      <w:proofErr w:type="gramEnd"/>
+      <w:r>
+        <w:rPr>
+          <w:rFonts w:ascii="Times New Roman" w:hAnsi="Times New Roman"/>
+          <w:color w:val="000000"/>
+          <w:sz w:val="22"/>
+        </w:rPr>
+        <w:t>15 = 251,75 phút.</w:t>
       </w:r>
     </w:p>
     <w:p>
@@ -5672,7 +5346,7 @@
     </w:p>
     <w:p>
       <w:pPr>
-        <w:spacing w:before="120" w:after="60"/>
+        <w:spacing w:before="200" w:after="80"/>
       </w:pPr>
       <w:r>
         <w:rPr>
@@ -5707,6 +5381,7 @@
           </w:tcPr>
           <w:p>
             <w:pPr>
+              <w:spacing w:before="40" w:after="40"/>
               <w:jc w:val="center"/>
             </w:pPr>
             <w:r>
@@ -5727,6 +5402,7 @@
           </w:tcPr>
           <w:p>
             <w:pPr>
+              <w:spacing w:before="40" w:after="40"/>
               <w:jc w:val="center"/>
             </w:pPr>
             <w:r>
@@ -5747,6 +5423,7 @@
           </w:tcPr>
           <w:p>
             <w:pPr>
+              <w:spacing w:before="40" w:after="40"/>
               <w:jc w:val="center"/>
             </w:pPr>
             <w:r>
@@ -5767,6 +5444,7 @@
           </w:tcPr>
           <w:p>
             <w:pPr>
+              <w:spacing w:before="40" w:after="40"/>
               <w:jc w:val="center"/>
             </w:pPr>
             <w:r>
@@ -5792,7 +5470,7 @@
           </w:tcPr>
           <w:p>
             <w:pPr>
-              <w:spacing w:before="20" w:after="20"/>
+              <w:spacing w:before="40" w:after="40"/>
             </w:pPr>
             <w:r>
               <w:rPr>
@@ -5811,7 +5489,7 @@
           </w:tcPr>
           <w:p>
             <w:pPr>
-              <w:spacing w:before="20" w:after="20"/>
+              <w:spacing w:before="40" w:after="40"/>
             </w:pPr>
             <w:r>
               <w:rPr>
@@ -5830,7 +5508,7 @@
           </w:tcPr>
           <w:p>
             <w:pPr>
-              <w:spacing w:before="20" w:after="20"/>
+              <w:spacing w:before="40" w:after="40"/>
             </w:pPr>
             <w:r>
               <w:rPr>
@@ -5849,7 +5527,7 @@
           </w:tcPr>
           <w:p>
             <w:pPr>
-              <w:spacing w:before="20" w:after="20"/>
+              <w:spacing w:before="40" w:after="40"/>
             </w:pPr>
             <w:r>
               <w:rPr>
@@ -5873,7 +5551,7 @@
           </w:tcPr>
           <w:p>
             <w:pPr>
-              <w:spacing w:before="20" w:after="20"/>
+              <w:spacing w:before="40" w:after="40"/>
             </w:pPr>
             <w:r>
               <w:rPr>
@@ -5892,7 +5570,7 @@
           </w:tcPr>
           <w:p>
             <w:pPr>
-              <w:spacing w:before="20" w:after="20"/>
+              <w:spacing w:before="40" w:after="40"/>
             </w:pPr>
             <w:r>
               <w:rPr>
@@ -5911,7 +5589,7 @@
           </w:tcPr>
           <w:p>
             <w:pPr>
-              <w:spacing w:before="20" w:after="20"/>
+              <w:spacing w:before="40" w:after="40"/>
             </w:pPr>
             <w:r>
               <w:rPr>
@@ -5930,7 +5608,7 @@
           </w:tcPr>
           <w:p>
             <w:pPr>
-              <w:spacing w:before="20" w:after="20"/>
+              <w:spacing w:before="40" w:after="40"/>
             </w:pPr>
             <w:r>
               <w:rPr>
@@ -5954,7 +5632,7 @@
           </w:tcPr>
           <w:p>
             <w:pPr>
-              <w:spacing w:before="20" w:after="20"/>
+              <w:spacing w:before="40" w:after="40"/>
             </w:pPr>
             <w:r>
               <w:rPr>
@@ -5973,7 +5651,7 @@
           </w:tcPr>
           <w:p>
             <w:pPr>
-              <w:spacing w:before="20" w:after="20"/>
+              <w:spacing w:before="40" w:after="40"/>
             </w:pPr>
             <w:r>
               <w:rPr>
@@ -5992,7 +5670,7 @@
           </w:tcPr>
           <w:p>
             <w:pPr>
-              <w:spacing w:before="20" w:after="20"/>
+              <w:spacing w:before="40" w:after="40"/>
             </w:pPr>
             <w:r>
               <w:rPr>
@@ -6011,7 +5689,7 @@
           </w:tcPr>
           <w:p>
             <w:pPr>
-              <w:spacing w:before="20" w:after="20"/>
+              <w:spacing w:before="40" w:after="40"/>
             </w:pPr>
             <w:r>
               <w:rPr>
@@ -6035,7 +5713,7 @@
           </w:tcPr>
           <w:p>
             <w:pPr>
-              <w:spacing w:before="20" w:after="20"/>
+              <w:spacing w:before="40" w:after="40"/>
             </w:pPr>
             <w:r>
               <w:rPr>
@@ -6054,7 +5732,7 @@
           </w:tcPr>
           <w:p>
             <w:pPr>
-              <w:spacing w:before="20" w:after="20"/>
+              <w:spacing w:before="40" w:after="40"/>
             </w:pPr>
             <w:r>
               <w:rPr>
@@ -6073,7 +5751,7 @@
           </w:tcPr>
           <w:p>
             <w:pPr>
-              <w:spacing w:before="20" w:after="20"/>
+              <w:spacing w:before="40" w:after="40"/>
             </w:pPr>
             <w:r>
               <w:rPr>
@@ -6092,7 +5770,7 @@
           </w:tcPr>
           <w:p>
             <w:pPr>
-              <w:spacing w:before="20" w:after="20"/>
+              <w:spacing w:before="40" w:after="40"/>
             </w:pPr>
             <w:r>
               <w:rPr>
@@ -6116,7 +5794,7 @@
           </w:tcPr>
           <w:p>
             <w:pPr>
-              <w:spacing w:before="20" w:after="20"/>
+              <w:spacing w:before="40" w:after="40"/>
             </w:pPr>
             <w:r>
               <w:rPr>
@@ -6135,7 +5813,7 @@
           </w:tcPr>
           <w:p>
             <w:pPr>
-              <w:spacing w:before="20" w:after="20"/>
+              <w:spacing w:before="40" w:after="40"/>
             </w:pPr>
             <w:r>
               <w:rPr>
@@ -6154,7 +5832,7 @@
           </w:tcPr>
           <w:p>
             <w:pPr>
-              <w:spacing w:before="20" w:after="20"/>
+              <w:spacing w:before="40" w:after="40"/>
             </w:pPr>
             <w:r>
               <w:rPr>
@@ -6173,7 +5851,7 @@
           </w:tcPr>
           <w:p>
             <w:pPr>
-              <w:spacing w:before="20" w:after="20"/>
+              <w:spacing w:before="40" w:after="40"/>
             </w:pPr>
             <w:r>
               <w:rPr>

</xml_diff>

<commit_message>
Update process docs and BPMN models
</commit_message>
<xml_diff>
--- a/01.WORKING_SPACE/3.DangVanHau-25410203/quytrinhquanlitrahang.docx
+++ b/01.WORKING_SPACE/3.DangVanHau-25410203/quytrinhquanlitrahang.docx
@@ -238,15 +238,12 @@
         <w:spacing w:before="40" w:after="80"/>
       </w:pPr>
       <w:r>
-        <w:rPr>
-          <w:noProof/>
-        </w:rPr>
         <w:lastRenderedPageBreak/>
         <w:drawing>
-          <wp:inline distT="0" distB="0" distL="0" distR="0" wp14:anchorId="3F6DC474" wp14:editId="022441FD">
-            <wp:extent cx="5943600" cy="2609215"/>
-            <wp:effectExtent l="0" t="0" r="0" b="635"/>
-            <wp:docPr id="1530185237" name="Graphic 1"/>
+          <wp:inline distT="0" distB="0" distL="0" distR="0" wp14:anchorId="5CA540E2" wp14:editId="3705BE29">
+            <wp:extent cx="5943600" cy="2583180"/>
+            <wp:effectExtent l="0" t="0" r="0" b="7620"/>
+            <wp:docPr id="451425699" name="Picture 1"/>
             <wp:cNvGraphicFramePr>
               <a:graphicFrameLocks xmlns:a="http://schemas.openxmlformats.org/drawingml/2006/main" noChangeAspect="1"/>
             </wp:cNvGraphicFramePr>
@@ -254,17 +251,11 @@
               <a:graphicData uri="http://schemas.openxmlformats.org/drawingml/2006/picture">
                 <pic:pic xmlns:pic="http://schemas.openxmlformats.org/drawingml/2006/picture">
                   <pic:nvPicPr>
-                    <pic:cNvPr id="1530185237" name=""/>
+                    <pic:cNvPr id="451425699" name=""/>
                     <pic:cNvPicPr/>
                   </pic:nvPicPr>
                   <pic:blipFill>
-                    <a:blip r:embed="rId5">
-                      <a:extLst>
-                        <a:ext uri="{96DAC541-7B7A-43D3-8B79-37D633B846F1}">
-                          <asvg:svgBlip xmlns:asvg="http://schemas.microsoft.com/office/drawing/2016/SVG/main" r:embed="rId6"/>
-                        </a:ext>
-                      </a:extLst>
-                    </a:blip>
+                    <a:blip r:embed="rId5"/>
                     <a:stretch>
                       <a:fillRect/>
                     </a:stretch>
@@ -272,7 +263,7 @@
                   <pic:spPr>
                     <a:xfrm>
                       <a:off x="0" y="0"/>
-                      <a:ext cx="5943600" cy="2609215"/>
+                      <a:ext cx="5943600" cy="2583180"/>
                     </a:xfrm>
                     <a:prstGeom prst="rect">
                       <a:avLst/>
@@ -367,20 +358,23 @@
     </w:p>
     <w:tbl>
       <w:tblPr>
-        <w:tblW w:type="auto" w:w="0"/>
+        <w:tblW w:w="0" w:type="auto"/>
         <w:jc w:val="center"/>
-        <w:tblLook w:firstColumn="1" w:firstRow="1" w:lastColumn="0" w:lastRow="0" w:noHBand="0" w:noVBand="1" w:val="04A0"/>
+        <w:tblLook w:val="04A0" w:firstRow="1" w:lastRow="0" w:firstColumn="1" w:lastColumn="0" w:noHBand="0" w:noVBand="1"/>
       </w:tblPr>
       <w:tblGrid>
-        <w:gridCol w:w="3120"/>
-        <w:gridCol w:w="3120"/>
-        <w:gridCol w:w="3120"/>
+        <w:gridCol w:w="4608"/>
+        <w:gridCol w:w="2592"/>
+        <w:gridCol w:w="2160"/>
       </w:tblGrid>
       <w:tr>
-        <w:tc>
-          <w:tcPr>
-            <w:tcW w:type="dxa" w:w="4608"/>
-            <w:shd w:fill="333333"/>
+        <w:trPr>
+          <w:jc w:val="center"/>
+        </w:trPr>
+        <w:tc>
+          <w:tcPr>
+            <w:tcW w:w="4608" w:type="dxa"/>
+            <w:shd w:val="clear" w:color="auto" w:fill="333333"/>
           </w:tcPr>
           <w:p>
             <w:pPr>
@@ -400,8 +394,8 @@
         </w:tc>
         <w:tc>
           <w:tcPr>
-            <w:tcW w:type="dxa" w:w="2592"/>
-            <w:shd w:fill="333333"/>
+            <w:tcW w:w="2592" w:type="dxa"/>
+            <w:shd w:val="clear" w:color="auto" w:fill="333333"/>
           </w:tcPr>
           <w:p>
             <w:pPr>
@@ -421,8 +415,8 @@
         </w:tc>
         <w:tc>
           <w:tcPr>
-            <w:tcW w:type="dxa" w:w="2160"/>
-            <w:shd w:fill="333333"/>
+            <w:tcW w:w="2160" w:type="dxa"/>
+            <w:shd w:val="clear" w:color="auto" w:fill="333333"/>
           </w:tcPr>
           <w:p>
             <w:pPr>
@@ -442,10 +436,13 @@
         </w:tc>
       </w:tr>
       <w:tr>
-        <w:tc>
-          <w:tcPr>
-            <w:tcW w:type="dxa" w:w="4608"/>
-            <w:shd w:fill="FFFFFF"/>
+        <w:trPr>
+          <w:jc w:val="center"/>
+        </w:trPr>
+        <w:tc>
+          <w:tcPr>
+            <w:tcW w:w="4608" w:type="dxa"/>
+            <w:shd w:val="clear" w:color="auto" w:fill="FFFFFF"/>
           </w:tcPr>
           <w:p>
             <w:pPr>
@@ -463,8 +460,8 @@
         </w:tc>
         <w:tc>
           <w:tcPr>
-            <w:tcW w:type="dxa" w:w="2592"/>
-            <w:shd w:fill="FFFFFF"/>
+            <w:tcW w:w="2592" w:type="dxa"/>
+            <w:shd w:val="clear" w:color="auto" w:fill="FFFFFF"/>
           </w:tcPr>
           <w:p>
             <w:pPr>
@@ -482,8 +479,8 @@
         </w:tc>
         <w:tc>
           <w:tcPr>
-            <w:tcW w:type="dxa" w:w="2160"/>
-            <w:shd w:fill="FFFFFF"/>
+            <w:tcW w:w="2160" w:type="dxa"/>
+            <w:shd w:val="clear" w:color="auto" w:fill="FFFFFF"/>
           </w:tcPr>
           <w:p>
             <w:pPr>
@@ -503,10 +500,13 @@
         </w:tc>
       </w:tr>
       <w:tr>
-        <w:tc>
-          <w:tcPr>
-            <w:tcW w:type="dxa" w:w="4608"/>
-            <w:shd w:fill="F5F5F5"/>
+        <w:trPr>
+          <w:jc w:val="center"/>
+        </w:trPr>
+        <w:tc>
+          <w:tcPr>
+            <w:tcW w:w="4608" w:type="dxa"/>
+            <w:shd w:val="clear" w:color="auto" w:fill="F5F5F5"/>
           </w:tcPr>
           <w:p>
             <w:pPr>
@@ -524,8 +524,8 @@
         </w:tc>
         <w:tc>
           <w:tcPr>
-            <w:tcW w:type="dxa" w:w="2592"/>
-            <w:shd w:fill="F5F5F5"/>
+            <w:tcW w:w="2592" w:type="dxa"/>
+            <w:shd w:val="clear" w:color="auto" w:fill="F5F5F5"/>
           </w:tcPr>
           <w:p>
             <w:pPr>
@@ -543,8 +543,8 @@
         </w:tc>
         <w:tc>
           <w:tcPr>
-            <w:tcW w:type="dxa" w:w="2160"/>
-            <w:shd w:fill="F5F5F5"/>
+            <w:tcW w:w="2160" w:type="dxa"/>
+            <w:shd w:val="clear" w:color="auto" w:fill="F5F5F5"/>
           </w:tcPr>
           <w:p>
             <w:pPr>
@@ -564,10 +564,13 @@
         </w:tc>
       </w:tr>
       <w:tr>
-        <w:tc>
-          <w:tcPr>
-            <w:tcW w:type="dxa" w:w="4608"/>
-            <w:shd w:fill="FFFFFF"/>
+        <w:trPr>
+          <w:jc w:val="center"/>
+        </w:trPr>
+        <w:tc>
+          <w:tcPr>
+            <w:tcW w:w="4608" w:type="dxa"/>
+            <w:shd w:val="clear" w:color="auto" w:fill="FFFFFF"/>
           </w:tcPr>
           <w:p>
             <w:pPr>
@@ -585,8 +588,8 @@
         </w:tc>
         <w:tc>
           <w:tcPr>
-            <w:tcW w:type="dxa" w:w="2592"/>
-            <w:shd w:fill="FFFFFF"/>
+            <w:tcW w:w="2592" w:type="dxa"/>
+            <w:shd w:val="clear" w:color="auto" w:fill="FFFFFF"/>
           </w:tcPr>
           <w:p>
             <w:pPr>
@@ -604,8 +607,8 @@
         </w:tc>
         <w:tc>
           <w:tcPr>
-            <w:tcW w:type="dxa" w:w="2160"/>
-            <w:shd w:fill="FFFFFF"/>
+            <w:tcW w:w="2160" w:type="dxa"/>
+            <w:shd w:val="clear" w:color="auto" w:fill="FFFFFF"/>
           </w:tcPr>
           <w:p>
             <w:pPr>
@@ -625,10 +628,13 @@
         </w:tc>
       </w:tr>
       <w:tr>
-        <w:tc>
-          <w:tcPr>
-            <w:tcW w:type="dxa" w:w="4608"/>
-            <w:shd w:fill="F5F5F5"/>
+        <w:trPr>
+          <w:jc w:val="center"/>
+        </w:trPr>
+        <w:tc>
+          <w:tcPr>
+            <w:tcW w:w="4608" w:type="dxa"/>
+            <w:shd w:val="clear" w:color="auto" w:fill="F5F5F5"/>
           </w:tcPr>
           <w:p>
             <w:pPr>
@@ -646,8 +652,8 @@
         </w:tc>
         <w:tc>
           <w:tcPr>
-            <w:tcW w:type="dxa" w:w="2592"/>
-            <w:shd w:fill="F5F5F5"/>
+            <w:tcW w:w="2592" w:type="dxa"/>
+            <w:shd w:val="clear" w:color="auto" w:fill="F5F5F5"/>
           </w:tcPr>
           <w:p>
             <w:pPr>
@@ -665,8 +671,8 @@
         </w:tc>
         <w:tc>
           <w:tcPr>
-            <w:tcW w:type="dxa" w:w="2160"/>
-            <w:shd w:fill="F5F5F5"/>
+            <w:tcW w:w="2160" w:type="dxa"/>
+            <w:shd w:val="clear" w:color="auto" w:fill="F5F5F5"/>
           </w:tcPr>
           <w:p>
             <w:pPr>
@@ -686,10 +692,13 @@
         </w:tc>
       </w:tr>
       <w:tr>
-        <w:tc>
-          <w:tcPr>
-            <w:tcW w:type="dxa" w:w="4608"/>
-            <w:shd w:fill="FFFFFF"/>
+        <w:trPr>
+          <w:jc w:val="center"/>
+        </w:trPr>
+        <w:tc>
+          <w:tcPr>
+            <w:tcW w:w="4608" w:type="dxa"/>
+            <w:shd w:val="clear" w:color="auto" w:fill="FFFFFF"/>
           </w:tcPr>
           <w:p>
             <w:pPr>
@@ -707,8 +716,8 @@
         </w:tc>
         <w:tc>
           <w:tcPr>
-            <w:tcW w:type="dxa" w:w="2592"/>
-            <w:shd w:fill="FFFFFF"/>
+            <w:tcW w:w="2592" w:type="dxa"/>
+            <w:shd w:val="clear" w:color="auto" w:fill="FFFFFF"/>
           </w:tcPr>
           <w:p>
             <w:pPr>
@@ -726,8 +735,8 @@
         </w:tc>
         <w:tc>
           <w:tcPr>
-            <w:tcW w:type="dxa" w:w="2160"/>
-            <w:shd w:fill="FFFFFF"/>
+            <w:tcW w:w="2160" w:type="dxa"/>
+            <w:shd w:val="clear" w:color="auto" w:fill="FFFFFF"/>
           </w:tcPr>
           <w:p>
             <w:pPr>
@@ -747,10 +756,13 @@
         </w:tc>
       </w:tr>
       <w:tr>
-        <w:tc>
-          <w:tcPr>
-            <w:tcW w:type="dxa" w:w="4608"/>
-            <w:shd w:fill="F5F5F5"/>
+        <w:trPr>
+          <w:jc w:val="center"/>
+        </w:trPr>
+        <w:tc>
+          <w:tcPr>
+            <w:tcW w:w="4608" w:type="dxa"/>
+            <w:shd w:val="clear" w:color="auto" w:fill="F5F5F5"/>
           </w:tcPr>
           <w:p>
             <w:pPr>
@@ -768,8 +780,8 @@
         </w:tc>
         <w:tc>
           <w:tcPr>
-            <w:tcW w:type="dxa" w:w="2592"/>
-            <w:shd w:fill="F5F5F5"/>
+            <w:tcW w:w="2592" w:type="dxa"/>
+            <w:shd w:val="clear" w:color="auto" w:fill="F5F5F5"/>
           </w:tcPr>
           <w:p>
             <w:pPr>
@@ -787,8 +799,8 @@
         </w:tc>
         <w:tc>
           <w:tcPr>
-            <w:tcW w:type="dxa" w:w="2160"/>
-            <w:shd w:fill="F5F5F5"/>
+            <w:tcW w:w="2160" w:type="dxa"/>
+            <w:shd w:val="clear" w:color="auto" w:fill="F5F5F5"/>
           </w:tcPr>
           <w:p>
             <w:pPr>
@@ -808,10 +820,13 @@
         </w:tc>
       </w:tr>
       <w:tr>
-        <w:tc>
-          <w:tcPr>
-            <w:tcW w:type="dxa" w:w="4608"/>
-            <w:shd w:fill="FFFFFF"/>
+        <w:trPr>
+          <w:jc w:val="center"/>
+        </w:trPr>
+        <w:tc>
+          <w:tcPr>
+            <w:tcW w:w="4608" w:type="dxa"/>
+            <w:shd w:val="clear" w:color="auto" w:fill="FFFFFF"/>
           </w:tcPr>
           <w:p>
             <w:pPr>
@@ -829,8 +844,8 @@
         </w:tc>
         <w:tc>
           <w:tcPr>
-            <w:tcW w:type="dxa" w:w="2592"/>
-            <w:shd w:fill="FFFFFF"/>
+            <w:tcW w:w="2592" w:type="dxa"/>
+            <w:shd w:val="clear" w:color="auto" w:fill="FFFFFF"/>
           </w:tcPr>
           <w:p>
             <w:pPr>
@@ -848,8 +863,8 @@
         </w:tc>
         <w:tc>
           <w:tcPr>
-            <w:tcW w:type="dxa" w:w="2160"/>
-            <w:shd w:fill="FFFFFF"/>
+            <w:tcW w:w="2160" w:type="dxa"/>
+            <w:shd w:val="clear" w:color="auto" w:fill="FFFFFF"/>
           </w:tcPr>
           <w:p>
             <w:pPr>
@@ -869,10 +884,13 @@
         </w:tc>
       </w:tr>
       <w:tr>
-        <w:tc>
-          <w:tcPr>
-            <w:tcW w:type="dxa" w:w="4608"/>
-            <w:shd w:fill="F5F5F5"/>
+        <w:trPr>
+          <w:jc w:val="center"/>
+        </w:trPr>
+        <w:tc>
+          <w:tcPr>
+            <w:tcW w:w="4608" w:type="dxa"/>
+            <w:shd w:val="clear" w:color="auto" w:fill="F5F5F5"/>
           </w:tcPr>
           <w:p>
             <w:pPr>
@@ -890,8 +908,8 @@
         </w:tc>
         <w:tc>
           <w:tcPr>
-            <w:tcW w:type="dxa" w:w="2592"/>
-            <w:shd w:fill="F5F5F5"/>
+            <w:tcW w:w="2592" w:type="dxa"/>
+            <w:shd w:val="clear" w:color="auto" w:fill="F5F5F5"/>
           </w:tcPr>
           <w:p>
             <w:pPr>
@@ -909,8 +927,8 @@
         </w:tc>
         <w:tc>
           <w:tcPr>
-            <w:tcW w:type="dxa" w:w="2160"/>
-            <w:shd w:fill="F5F5F5"/>
+            <w:tcW w:w="2160" w:type="dxa"/>
+            <w:shd w:val="clear" w:color="auto" w:fill="F5F5F5"/>
           </w:tcPr>
           <w:p>
             <w:pPr>
@@ -930,10 +948,13 @@
         </w:tc>
       </w:tr>
       <w:tr>
-        <w:tc>
-          <w:tcPr>
-            <w:tcW w:type="dxa" w:w="4608"/>
-            <w:shd w:fill="FFFFFF"/>
+        <w:trPr>
+          <w:jc w:val="center"/>
+        </w:trPr>
+        <w:tc>
+          <w:tcPr>
+            <w:tcW w:w="4608" w:type="dxa"/>
+            <w:shd w:val="clear" w:color="auto" w:fill="FFFFFF"/>
           </w:tcPr>
           <w:p>
             <w:pPr>
@@ -951,8 +972,8 @@
         </w:tc>
         <w:tc>
           <w:tcPr>
-            <w:tcW w:type="dxa" w:w="2592"/>
-            <w:shd w:fill="FFFFFF"/>
+            <w:tcW w:w="2592" w:type="dxa"/>
+            <w:shd w:val="clear" w:color="auto" w:fill="FFFFFF"/>
           </w:tcPr>
           <w:p>
             <w:pPr>
@@ -970,8 +991,8 @@
         </w:tc>
         <w:tc>
           <w:tcPr>
-            <w:tcW w:type="dxa" w:w="2160"/>
-            <w:shd w:fill="FFFFFF"/>
+            <w:tcW w:w="2160" w:type="dxa"/>
+            <w:shd w:val="clear" w:color="auto" w:fill="FFFFFF"/>
           </w:tcPr>
           <w:p>
             <w:pPr>
@@ -991,10 +1012,13 @@
         </w:tc>
       </w:tr>
       <w:tr>
-        <w:tc>
-          <w:tcPr>
-            <w:tcW w:type="dxa" w:w="4608"/>
-            <w:shd w:fill="F5F5F5"/>
+        <w:trPr>
+          <w:jc w:val="center"/>
+        </w:trPr>
+        <w:tc>
+          <w:tcPr>
+            <w:tcW w:w="4608" w:type="dxa"/>
+            <w:shd w:val="clear" w:color="auto" w:fill="F5F5F5"/>
           </w:tcPr>
           <w:p>
             <w:pPr>
@@ -1012,8 +1036,8 @@
         </w:tc>
         <w:tc>
           <w:tcPr>
-            <w:tcW w:type="dxa" w:w="2592"/>
-            <w:shd w:fill="F5F5F5"/>
+            <w:tcW w:w="2592" w:type="dxa"/>
+            <w:shd w:val="clear" w:color="auto" w:fill="F5F5F5"/>
           </w:tcPr>
           <w:p>
             <w:pPr>
@@ -1031,8 +1055,8 @@
         </w:tc>
         <w:tc>
           <w:tcPr>
-            <w:tcW w:type="dxa" w:w="2160"/>
-            <w:shd w:fill="F5F5F5"/>
+            <w:tcW w:w="2160" w:type="dxa"/>
+            <w:shd w:val="clear" w:color="auto" w:fill="F5F5F5"/>
           </w:tcPr>
           <w:p>
             <w:pPr>
@@ -1052,10 +1076,13 @@
         </w:tc>
       </w:tr>
       <w:tr>
-        <w:tc>
-          <w:tcPr>
-            <w:tcW w:type="dxa" w:w="4608"/>
-            <w:shd w:fill="FFFFFF"/>
+        <w:trPr>
+          <w:jc w:val="center"/>
+        </w:trPr>
+        <w:tc>
+          <w:tcPr>
+            <w:tcW w:w="4608" w:type="dxa"/>
+            <w:shd w:val="clear" w:color="auto" w:fill="FFFFFF"/>
           </w:tcPr>
           <w:p>
             <w:pPr>
@@ -1073,8 +1100,8 @@
         </w:tc>
         <w:tc>
           <w:tcPr>
-            <w:tcW w:type="dxa" w:w="2592"/>
-            <w:shd w:fill="FFFFFF"/>
+            <w:tcW w:w="2592" w:type="dxa"/>
+            <w:shd w:val="clear" w:color="auto" w:fill="FFFFFF"/>
           </w:tcPr>
           <w:p>
             <w:pPr>
@@ -1092,8 +1119,8 @@
         </w:tc>
         <w:tc>
           <w:tcPr>
-            <w:tcW w:type="dxa" w:w="2160"/>
-            <w:shd w:fill="FFFFFF"/>
+            <w:tcW w:w="2160" w:type="dxa"/>
+            <w:shd w:val="clear" w:color="auto" w:fill="FFFFFF"/>
           </w:tcPr>
           <w:p>
             <w:pPr>
@@ -1113,10 +1140,13 @@
         </w:tc>
       </w:tr>
       <w:tr>
-        <w:tc>
-          <w:tcPr>
-            <w:tcW w:type="dxa" w:w="4608"/>
-            <w:shd w:fill="F5F5F5"/>
+        <w:trPr>
+          <w:jc w:val="center"/>
+        </w:trPr>
+        <w:tc>
+          <w:tcPr>
+            <w:tcW w:w="4608" w:type="dxa"/>
+            <w:shd w:val="clear" w:color="auto" w:fill="F5F5F5"/>
           </w:tcPr>
           <w:p>
             <w:pPr>
@@ -1134,8 +1164,8 @@
         </w:tc>
         <w:tc>
           <w:tcPr>
-            <w:tcW w:type="dxa" w:w="2592"/>
-            <w:shd w:fill="F5F5F5"/>
+            <w:tcW w:w="2592" w:type="dxa"/>
+            <w:shd w:val="clear" w:color="auto" w:fill="F5F5F5"/>
           </w:tcPr>
           <w:p>
             <w:pPr>
@@ -1153,8 +1183,8 @@
         </w:tc>
         <w:tc>
           <w:tcPr>
-            <w:tcW w:type="dxa" w:w="2160"/>
-            <w:shd w:fill="F5F5F5"/>
+            <w:tcW w:w="2160" w:type="dxa"/>
+            <w:shd w:val="clear" w:color="auto" w:fill="F5F5F5"/>
           </w:tcPr>
           <w:p>
             <w:pPr>
@@ -1174,10 +1204,13 @@
         </w:tc>
       </w:tr>
       <w:tr>
-        <w:tc>
-          <w:tcPr>
-            <w:tcW w:type="dxa" w:w="4608"/>
-            <w:shd w:fill="FFFFFF"/>
+        <w:trPr>
+          <w:jc w:val="center"/>
+        </w:trPr>
+        <w:tc>
+          <w:tcPr>
+            <w:tcW w:w="4608" w:type="dxa"/>
+            <w:shd w:val="clear" w:color="auto" w:fill="FFFFFF"/>
           </w:tcPr>
           <w:p>
             <w:pPr>
@@ -1195,8 +1228,8 @@
         </w:tc>
         <w:tc>
           <w:tcPr>
-            <w:tcW w:type="dxa" w:w="2592"/>
-            <w:shd w:fill="FFFFFF"/>
+            <w:tcW w:w="2592" w:type="dxa"/>
+            <w:shd w:val="clear" w:color="auto" w:fill="FFFFFF"/>
           </w:tcPr>
           <w:p>
             <w:pPr>
@@ -1214,8 +1247,8 @@
         </w:tc>
         <w:tc>
           <w:tcPr>
-            <w:tcW w:type="dxa" w:w="2160"/>
-            <w:shd w:fill="FFFFFF"/>
+            <w:tcW w:w="2160" w:type="dxa"/>
+            <w:shd w:val="clear" w:color="auto" w:fill="FFFFFF"/>
           </w:tcPr>
           <w:p>
             <w:pPr>
@@ -1235,10 +1268,13 @@
         </w:tc>
       </w:tr>
       <w:tr>
-        <w:tc>
-          <w:tcPr>
-            <w:tcW w:type="dxa" w:w="4608"/>
-            <w:shd w:fill="F5F5F5"/>
+        <w:trPr>
+          <w:jc w:val="center"/>
+        </w:trPr>
+        <w:tc>
+          <w:tcPr>
+            <w:tcW w:w="4608" w:type="dxa"/>
+            <w:shd w:val="clear" w:color="auto" w:fill="F5F5F5"/>
           </w:tcPr>
           <w:p>
             <w:pPr>
@@ -1256,8 +1292,8 @@
         </w:tc>
         <w:tc>
           <w:tcPr>
-            <w:tcW w:type="dxa" w:w="2592"/>
-            <w:shd w:fill="F5F5F5"/>
+            <w:tcW w:w="2592" w:type="dxa"/>
+            <w:shd w:val="clear" w:color="auto" w:fill="F5F5F5"/>
           </w:tcPr>
           <w:p>
             <w:pPr>
@@ -1275,8 +1311,8 @@
         </w:tc>
         <w:tc>
           <w:tcPr>
-            <w:tcW w:type="dxa" w:w="2160"/>
-            <w:shd w:fill="F5F5F5"/>
+            <w:tcW w:w="2160" w:type="dxa"/>
+            <w:shd w:val="clear" w:color="auto" w:fill="F5F5F5"/>
           </w:tcPr>
           <w:p>
             <w:pPr>
@@ -1296,10 +1332,13 @@
         </w:tc>
       </w:tr>
       <w:tr>
-        <w:tc>
-          <w:tcPr>
-            <w:tcW w:type="dxa" w:w="4608"/>
-            <w:shd w:fill="FFFFFF"/>
+        <w:trPr>
+          <w:jc w:val="center"/>
+        </w:trPr>
+        <w:tc>
+          <w:tcPr>
+            <w:tcW w:w="4608" w:type="dxa"/>
+            <w:shd w:val="clear" w:color="auto" w:fill="FFFFFF"/>
           </w:tcPr>
           <w:p>
             <w:pPr>
@@ -1317,8 +1356,8 @@
         </w:tc>
         <w:tc>
           <w:tcPr>
-            <w:tcW w:type="dxa" w:w="2592"/>
-            <w:shd w:fill="FFFFFF"/>
+            <w:tcW w:w="2592" w:type="dxa"/>
+            <w:shd w:val="clear" w:color="auto" w:fill="FFFFFF"/>
           </w:tcPr>
           <w:p>
             <w:pPr>
@@ -1336,8 +1375,8 @@
         </w:tc>
         <w:tc>
           <w:tcPr>
-            <w:tcW w:type="dxa" w:w="2160"/>
-            <w:shd w:fill="FFFFFF"/>
+            <w:tcW w:w="2160" w:type="dxa"/>
+            <w:shd w:val="clear" w:color="auto" w:fill="FFFFFF"/>
           </w:tcPr>
           <w:p>
             <w:pPr>
@@ -1357,29 +1396,33 @@
         </w:tc>
       </w:tr>
       <w:tr>
-        <w:tc>
-          <w:tcPr>
-            <w:tcW w:type="dxa" w:w="4608"/>
-            <w:shd w:fill="F5F5F5"/>
-          </w:tcPr>
-          <w:p>
-            <w:pPr>
-              <w:spacing w:before="40" w:after="40"/>
-            </w:pPr>
-            <w:r>
-              <w:rPr>
-                <w:rFonts w:ascii="Times New Roman" w:hAnsi="Times New Roman"/>
-                <w:color w:val="000000"/>
-                <w:sz w:val="22"/>
-              </w:rPr>
+        <w:trPr>
+          <w:jc w:val="center"/>
+        </w:trPr>
+        <w:tc>
+          <w:tcPr>
+            <w:tcW w:w="4608" w:type="dxa"/>
+            <w:shd w:val="clear" w:color="auto" w:fill="F5F5F5"/>
+          </w:tcPr>
+          <w:p>
+            <w:pPr>
+              <w:spacing w:before="40" w:after="40"/>
+            </w:pPr>
+            <w:r>
+              <w:rPr>
+                <w:rFonts w:ascii="Times New Roman" w:hAnsi="Times New Roman"/>
+                <w:color w:val="000000"/>
+                <w:sz w:val="22"/>
+              </w:rPr>
+              <w:lastRenderedPageBreak/>
               <w:t>15. Thông báo kết quả phản hồi</w:t>
             </w:r>
           </w:p>
         </w:tc>
         <w:tc>
           <w:tcPr>
-            <w:tcW w:type="dxa" w:w="2592"/>
-            <w:shd w:fill="F5F5F5"/>
+            <w:tcW w:w="2592" w:type="dxa"/>
+            <w:shd w:val="clear" w:color="auto" w:fill="F5F5F5"/>
           </w:tcPr>
           <w:p>
             <w:pPr>
@@ -1397,8 +1440,8 @@
         </w:tc>
         <w:tc>
           <w:tcPr>
-            <w:tcW w:type="dxa" w:w="2160"/>
-            <w:shd w:fill="F5F5F5"/>
+            <w:tcW w:w="2160" w:type="dxa"/>
+            <w:shd w:val="clear" w:color="auto" w:fill="F5F5F5"/>
           </w:tcPr>
           <w:p>
             <w:pPr>
@@ -1418,10 +1461,13 @@
         </w:tc>
       </w:tr>
       <w:tr>
-        <w:tc>
-          <w:tcPr>
-            <w:tcW w:type="dxa" w:w="4608"/>
-            <w:shd w:fill="FFFFFF"/>
+        <w:trPr>
+          <w:jc w:val="center"/>
+        </w:trPr>
+        <w:tc>
+          <w:tcPr>
+            <w:tcW w:w="4608" w:type="dxa"/>
+            <w:shd w:val="clear" w:color="auto" w:fill="FFFFFF"/>
           </w:tcPr>
           <w:p>
             <w:pPr>
@@ -1439,8 +1485,8 @@
         </w:tc>
         <w:tc>
           <w:tcPr>
-            <w:tcW w:type="dxa" w:w="2592"/>
-            <w:shd w:fill="FFFFFF"/>
+            <w:tcW w:w="2592" w:type="dxa"/>
+            <w:shd w:val="clear" w:color="auto" w:fill="FFFFFF"/>
           </w:tcPr>
           <w:p>
             <w:pPr>
@@ -1458,8 +1504,8 @@
         </w:tc>
         <w:tc>
           <w:tcPr>
-            <w:tcW w:type="dxa" w:w="2160"/>
-            <w:shd w:fill="FFFFFF"/>
+            <w:tcW w:w="2160" w:type="dxa"/>
+            <w:shd w:val="clear" w:color="auto" w:fill="FFFFFF"/>
           </w:tcPr>
           <w:p>
             <w:pPr>
@@ -1479,10 +1525,13 @@
         </w:tc>
       </w:tr>
       <w:tr>
-        <w:tc>
-          <w:tcPr>
-            <w:tcW w:type="dxa" w:w="4608"/>
-            <w:shd w:fill="F5F5F5"/>
+        <w:trPr>
+          <w:jc w:val="center"/>
+        </w:trPr>
+        <w:tc>
+          <w:tcPr>
+            <w:tcW w:w="4608" w:type="dxa"/>
+            <w:shd w:val="clear" w:color="auto" w:fill="F5F5F5"/>
           </w:tcPr>
           <w:p>
             <w:pPr>
@@ -1500,8 +1549,8 @@
         </w:tc>
         <w:tc>
           <w:tcPr>
-            <w:tcW w:type="dxa" w:w="2592"/>
-            <w:shd w:fill="F5F5F5"/>
+            <w:tcW w:w="2592" w:type="dxa"/>
+            <w:shd w:val="clear" w:color="auto" w:fill="F5F5F5"/>
           </w:tcPr>
           <w:p>
             <w:pPr>
@@ -1519,8 +1568,8 @@
         </w:tc>
         <w:tc>
           <w:tcPr>
-            <w:tcW w:type="dxa" w:w="2160"/>
-            <w:shd w:fill="F5F5F5"/>
+            <w:tcW w:w="2160" w:type="dxa"/>
+            <w:shd w:val="clear" w:color="auto" w:fill="F5F5F5"/>
           </w:tcPr>
           <w:p>
             <w:pPr>
@@ -2244,7 +2293,6 @@
           <w:color w:val="000000"/>
           <w:sz w:val="22"/>
         </w:rPr>
-        <w:lastRenderedPageBreak/>
         <w:t>Sơ đồ Xương cá (Fishbone / Ishikawa) — Vấn đề: "Thời gian xử lý hoàn trả kéo dài, tỷ lệ sai sót chứng từ cao"</w:t>
       </w:r>
     </w:p>
@@ -2364,6 +2412,7 @@
           <w:color w:val="000000"/>
           <w:sz w:val="22"/>
         </w:rPr>
+        <w:lastRenderedPageBreak/>
         <w:t>Đơn giá nhân sự (định mức 8h/ngày = 480 phút): CSKH 1.042 VNĐ/phút, Shipper 729 VNĐ/phút, Kho 833 VNĐ/phút, Hệ thống 100 VNĐ/phút.</w:t>
       </w:r>
     </w:p>
@@ -5048,7 +5097,6 @@
           <w:color w:val="000000"/>
           <w:sz w:val="22"/>
         </w:rPr>
-        <w:lastRenderedPageBreak/>
         <w:t>Quy trình chia thành 4 Block. Công thức áp dụng: Sequence (T = T1+T2), Rework Loop (T = T/(1-r)), XOR (T = p1*T1 + p2*T2 + p3*T3).</w:t>
       </w:r>
     </w:p>
@@ -5076,25 +5124,7 @@
           <w:color w:val="000000"/>
           <w:sz w:val="22"/>
         </w:rPr>
-        <w:t>Bước 1-4. Hệ số làm lại 1</w:t>
-      </w:r>
-      <w:proofErr w:type="gramStart"/>
-      <w:r>
-        <w:rPr>
-          <w:rFonts w:ascii="Times New Roman" w:hAnsi="Times New Roman"/>
-          <w:color w:val="000000"/>
-          <w:sz w:val="22"/>
-        </w:rPr>
-        <w:t>/(</w:t>
-      </w:r>
-      <w:proofErr w:type="gramEnd"/>
-      <w:r>
-        <w:rPr>
-          <w:rFonts w:ascii="Times New Roman" w:hAnsi="Times New Roman"/>
-          <w:color w:val="000000"/>
-          <w:sz w:val="22"/>
-        </w:rPr>
-        <w:t>1-0.20) = 1,25.</w:t>
+        <w:t>Bước 1-4. Hệ số làm lại 1/(1-0.20) = 1,25.</w:t>
       </w:r>
     </w:p>
     <w:p>
@@ -5174,6 +5204,7 @@
           <w:color w:val="000000"/>
           <w:sz w:val="22"/>
         </w:rPr>
+        <w:lastRenderedPageBreak/>
         <w:t>Block 3 — Phân nhánh xử lý (XOR: 70% Hoàn trả, 20% Khiếu nại, 10% Tư vấn)</w:t>
       </w:r>
     </w:p>
@@ -5200,56 +5231,20 @@
           <w:color w:val="000000"/>
           <w:sz w:val="22"/>
         </w:rPr>
-        <w:t>T_proc(N1) = 2+30+20+10+(0.85*20+0.15*</w:t>
+        <w:t>T_proc(N1) = 2+30+20+10+(0.85*20+0.15*15)+5 = 86,25 phút.</w:t>
       </w:r>
-      <w:proofErr w:type="gramStart"/>
+    </w:p>
+    <w:p>
+      <w:pPr>
+        <w:spacing w:before="40" w:after="80"/>
+      </w:pPr>
       <w:r>
         <w:rPr>
           <w:rFonts w:ascii="Times New Roman" w:hAnsi="Times New Roman"/>
           <w:color w:val="000000"/>
           <w:sz w:val="22"/>
         </w:rPr>
-        <w:t>15)+</w:t>
-      </w:r>
-      <w:proofErr w:type="gramEnd"/>
-      <w:r>
-        <w:rPr>
-          <w:rFonts w:ascii="Times New Roman" w:hAnsi="Times New Roman"/>
-          <w:color w:val="000000"/>
-          <w:sz w:val="22"/>
-        </w:rPr>
-        <w:t>5 = 86,25 phút.</w:t>
-      </w:r>
-    </w:p>
-    <w:p>
-      <w:pPr>
-        <w:spacing w:before="40" w:after="80"/>
-      </w:pPr>
-      <w:r>
-        <w:rPr>
-          <w:rFonts w:ascii="Times New Roman" w:hAnsi="Times New Roman"/>
-          <w:color w:val="000000"/>
-          <w:sz w:val="22"/>
-        </w:rPr>
-        <w:t>T_cycle(N1) = 12+45+50+55+(0.85*80+0.15*</w:t>
-      </w:r>
-      <w:proofErr w:type="gramStart"/>
-      <w:r>
-        <w:rPr>
-          <w:rFonts w:ascii="Times New Roman" w:hAnsi="Times New Roman"/>
-          <w:color w:val="000000"/>
-          <w:sz w:val="22"/>
-        </w:rPr>
-        <w:t>45)+</w:t>
-      </w:r>
-      <w:proofErr w:type="gramEnd"/>
-      <w:r>
-        <w:rPr>
-          <w:rFonts w:ascii="Times New Roman" w:hAnsi="Times New Roman"/>
-          <w:color w:val="000000"/>
-          <w:sz w:val="22"/>
-        </w:rPr>
-        <w:t>15 = 251,75 phút.</w:t>
+        <w:t>T_cycle(N1) = 12+45+50+55+(0.85*80+0.15*45)+15 = 251,75 phút.</w:t>
       </w:r>
     </w:p>
     <w:p>

</xml_diff>

<commit_message>
Insert BPMN diagram image into docx
</commit_message>
<xml_diff>
--- a/01.WORKING_SPACE/3.DangVanHau-25410203/quytrinhquanlitrahang.docx
+++ b/01.WORKING_SPACE/3.DangVanHau-25410203/quytrinhquanlitrahang.docx
@@ -85,6 +85,11 @@
     <w:p>
       <w:pPr>
         <w:spacing w:before="40" w:after="80"/>
+        <w:rPr>
+          <w:rFonts w:ascii="Times New Roman" w:hAnsi="Times New Roman"/>
+          <w:color w:val="000000"/>
+          <w:sz w:val="22"/>
+        </w:rPr>
       </w:pPr>
       <w:r>
         <w:rPr>
@@ -93,6 +98,48 @@
           <w:sz w:val="22"/>
         </w:rPr>
         <w:t>Kết thúc quy trình, toàn bộ thông tin được cập nhật lên hệ thống, hồ sơ lưu trữ phục vụ đối soát.</w:t>
+      </w:r>
+    </w:p>
+    <w:p>
+      <w:pPr>
+        <w:spacing w:before="40" w:after="80"/>
+      </w:pPr>
+      <w:r>
+        <w:drawing>
+          <wp:inline distT="0" distB="0" distL="0" distR="0" wp14:anchorId="25A66DDC" wp14:editId="592E2091">
+            <wp:extent cx="5943600" cy="2605405"/>
+            <wp:effectExtent l="0" t="0" r="0" b="4445"/>
+            <wp:docPr id="1338168456" name="Picture 1"/>
+            <wp:cNvGraphicFramePr>
+              <a:graphicFrameLocks xmlns:a="http://schemas.openxmlformats.org/drawingml/2006/main" noChangeAspect="1"/>
+            </wp:cNvGraphicFramePr>
+            <a:graphic xmlns:a="http://schemas.openxmlformats.org/drawingml/2006/main">
+              <a:graphicData uri="http://schemas.openxmlformats.org/drawingml/2006/picture">
+                <pic:pic xmlns:pic="http://schemas.openxmlformats.org/drawingml/2006/picture">
+                  <pic:nvPicPr>
+                    <pic:cNvPr id="1338168456" name=""/>
+                    <pic:cNvPicPr/>
+                  </pic:nvPicPr>
+                  <pic:blipFill>
+                    <a:blip r:embed="rId5"/>
+                    <a:stretch>
+                      <a:fillRect/>
+                    </a:stretch>
+                  </pic:blipFill>
+                  <pic:spPr>
+                    <a:xfrm>
+                      <a:off x="0" y="0"/>
+                      <a:ext cx="5943600" cy="2605405"/>
+                    </a:xfrm>
+                    <a:prstGeom prst="rect">
+                      <a:avLst/>
+                    </a:prstGeom>
+                  </pic:spPr>
+                </pic:pic>
+              </a:graphicData>
+            </a:graphic>
+          </wp:inline>
+        </w:drawing>
       </w:r>
     </w:p>
     <w:p>
@@ -199,6 +246,7 @@
           <w:color w:val="000000"/>
           <w:sz w:val="26"/>
         </w:rPr>
+        <w:lastRenderedPageBreak/>
         <w:t>3.8.2.2 Khách hàng của quy trình</w:t>
       </w:r>
     </w:p>
@@ -231,49 +279,6 @@
           <w:sz w:val="22"/>
         </w:rPr>
         <w:t>Khách hàng nội bộ: Bộ phận vận hành, bưu cục và các đơn vị quản lý sử dụng kết quả xử lý để vận hành và cải thiện dịch vụ.</w:t>
-      </w:r>
-    </w:p>
-    <w:p>
-      <w:pPr>
-        <w:spacing w:before="40" w:after="80"/>
-      </w:pPr>
-      <w:r>
-        <w:lastRenderedPageBreak/>
-        <w:drawing>
-          <wp:inline distT="0" distB="0" distL="0" distR="0" wp14:anchorId="5CA540E2" wp14:editId="3705BE29">
-            <wp:extent cx="5943600" cy="2583180"/>
-            <wp:effectExtent l="0" t="0" r="0" b="7620"/>
-            <wp:docPr id="451425699" name="Picture 1"/>
-            <wp:cNvGraphicFramePr>
-              <a:graphicFrameLocks xmlns:a="http://schemas.openxmlformats.org/drawingml/2006/main" noChangeAspect="1"/>
-            </wp:cNvGraphicFramePr>
-            <a:graphic xmlns:a="http://schemas.openxmlformats.org/drawingml/2006/main">
-              <a:graphicData uri="http://schemas.openxmlformats.org/drawingml/2006/picture">
-                <pic:pic xmlns:pic="http://schemas.openxmlformats.org/drawingml/2006/picture">
-                  <pic:nvPicPr>
-                    <pic:cNvPr id="451425699" name=""/>
-                    <pic:cNvPicPr/>
-                  </pic:nvPicPr>
-                  <pic:blipFill>
-                    <a:blip r:embed="rId5"/>
-                    <a:stretch>
-                      <a:fillRect/>
-                    </a:stretch>
-                  </pic:blipFill>
-                  <pic:spPr>
-                    <a:xfrm>
-                      <a:off x="0" y="0"/>
-                      <a:ext cx="5943600" cy="2583180"/>
-                    </a:xfrm>
-                    <a:prstGeom prst="rect">
-                      <a:avLst/>
-                    </a:prstGeom>
-                  </pic:spPr>
-                </pic:pic>
-              </a:graphicData>
-            </a:graphic>
-          </wp:inline>
-        </w:drawing>
       </w:r>
     </w:p>
     <w:p>
@@ -1414,7 +1419,6 @@
                 <w:color w:val="000000"/>
                 <w:sz w:val="22"/>
               </w:rPr>
-              <w:lastRenderedPageBreak/>
               <w:t>15. Thông báo kết quả phản hồi</w:t>
             </w:r>
           </w:p>
@@ -1728,6 +1732,7 @@
                 <w:color w:val="000000"/>
                 <w:sz w:val="22"/>
               </w:rPr>
+              <w:lastRenderedPageBreak/>
               <w:t>Chờ đợi (Waiting)</w:t>
             </w:r>
           </w:p>
@@ -2412,7 +2417,6 @@
           <w:color w:val="000000"/>
           <w:sz w:val="22"/>
         </w:rPr>
-        <w:lastRenderedPageBreak/>
         <w:t>Đơn giá nhân sự (định mức 8h/ngày = 480 phút): CSKH 1.042 VNĐ/phút, Shipper 729 VNĐ/phút, Kho 833 VNĐ/phút, Hệ thống 100 VNĐ/phút.</w:t>
       </w:r>
     </w:p>
@@ -3016,6 +3020,7 @@
                 <w:color w:val="000000"/>
                 <w:sz w:val="22"/>
               </w:rPr>
+              <w:lastRenderedPageBreak/>
               <w:t>4. Kiểm tra thông tin</w:t>
             </w:r>
           </w:p>
@@ -5090,6 +5095,11 @@
     <w:p>
       <w:pPr>
         <w:spacing w:before="40" w:after="80"/>
+        <w:rPr>
+          <w:rFonts w:ascii="Times New Roman" w:hAnsi="Times New Roman"/>
+          <w:color w:val="000000"/>
+          <w:sz w:val="22"/>
+        </w:rPr>
       </w:pPr>
       <w:r>
         <w:rPr>
@@ -5098,6 +5108,48 @@
           <w:sz w:val="22"/>
         </w:rPr>
         <w:t>Quy trình chia thành 4 Block. Công thức áp dụng: Sequence (T = T1+T2), Rework Loop (T = T/(1-r)), XOR (T = p1*T1 + p2*T2 + p3*T3).</w:t>
+      </w:r>
+    </w:p>
+    <w:p>
+      <w:pPr>
+        <w:spacing w:before="40" w:after="80"/>
+      </w:pPr>
+      <w:r>
+        <w:drawing>
+          <wp:inline distT="0" distB="0" distL="0" distR="0" wp14:anchorId="611C16A2" wp14:editId="7E4CC94A">
+            <wp:extent cx="5943600" cy="2605405"/>
+            <wp:effectExtent l="0" t="0" r="0" b="4445"/>
+            <wp:docPr id="2084846258" name="Picture 1"/>
+            <wp:cNvGraphicFramePr>
+              <a:graphicFrameLocks xmlns:a="http://schemas.openxmlformats.org/drawingml/2006/main" noChangeAspect="1"/>
+            </wp:cNvGraphicFramePr>
+            <a:graphic xmlns:a="http://schemas.openxmlformats.org/drawingml/2006/main">
+              <a:graphicData uri="http://schemas.openxmlformats.org/drawingml/2006/picture">
+                <pic:pic xmlns:pic="http://schemas.openxmlformats.org/drawingml/2006/picture">
+                  <pic:nvPicPr>
+                    <pic:cNvPr id="2084846258" name=""/>
+                    <pic:cNvPicPr/>
+                  </pic:nvPicPr>
+                  <pic:blipFill>
+                    <a:blip r:embed="rId5"/>
+                    <a:stretch>
+                      <a:fillRect/>
+                    </a:stretch>
+                  </pic:blipFill>
+                  <pic:spPr>
+                    <a:xfrm>
+                      <a:off x="0" y="0"/>
+                      <a:ext cx="5943600" cy="2605405"/>
+                    </a:xfrm>
+                    <a:prstGeom prst="rect">
+                      <a:avLst/>
+                    </a:prstGeom>
+                  </pic:spPr>
+                </pic:pic>
+              </a:graphicData>
+            </a:graphic>
+          </wp:inline>
+        </w:drawing>
       </w:r>
     </w:p>
     <w:p>
@@ -5150,6 +5202,7 @@
           <w:color w:val="000000"/>
           <w:sz w:val="22"/>
         </w:rPr>
+        <w:lastRenderedPageBreak/>
         <w:t>T_cycle = (5+18+15 + 0.20*130) / 0.80 = 64/0.80 = 80,00 phút.</w:t>
       </w:r>
     </w:p>
@@ -5204,7 +5257,6 @@
           <w:color w:val="000000"/>
           <w:sz w:val="22"/>
         </w:rPr>
-        <w:lastRenderedPageBreak/>
         <w:t>Block 3 — Phân nhánh xử lý (XOR: 70% Hoàn trả, 20% Khiếu nại, 10% Tư vấn)</w:t>
       </w:r>
     </w:p>

</xml_diff>